<commit_message>
swot analysis and inventory reordering
I added SWOT, compared power BI and python and implemented an auto reorder formula based on the supplier lead time
</commit_message>
<xml_diff>
--- a/Project Report.docx
+++ b/Project Report.docx
@@ -634,6 +634,34 @@
     </w:p>
     <w:p>
       <w:r>
+        <w:t>4.</w:t>
+      </w:r>
+      <w:r>
+        <w:tab/>
+        <w:t>Data Collection &amp; Analysis</w:t>
+      </w:r>
+    </w:p>
+    <w:p>
+      <w:r>
+        <w:t>5.</w:t>
+      </w:r>
+      <w:r>
+        <w:tab/>
+        <w:t>Technology Selection &amp; Comparison</w:t>
+      </w:r>
+    </w:p>
+    <w:p>
+      <w:r>
+        <w:t>6.</w:t>
+      </w:r>
+      <w:r>
+        <w:tab/>
+        <w:t>Setting Automatic Reordering for Fast-Moving Wines</w:t>
+      </w:r>
+    </w:p>
+    <w:p/>
+    <w:p>
+      <w:r>
         <w:br w:type="page"/>
       </w:r>
     </w:p>
@@ -682,13 +710,7 @@
     </w:p>
     <w:p>
       <w:r>
-        <w:t xml:space="preserve">The study investigates the sales scenario of wine and forecasts the demand trends to ensure higher efficiency in stock replenishment besides pinpointing highly selling products and </w:t>
-      </w:r>
-      <w:r>
-        <w:t>slow-moving</w:t>
-      </w:r>
-      <w:r>
-        <w:t xml:space="preserve"> ones.</w:t>
+        <w:t>The study investigates the sales scenario of wine and forecasts the demand trends to ensure higher efficiency in stock replenishment besides pinpointing highly selling products and slow-moving ones.</w:t>
       </w:r>
     </w:p>
     <w:p>
@@ -721,14 +743,12 @@
       <w:r>
         <w:t>stock-outs cause potential sales losses of about 4</w:t>
       </w:r>
-      <w:proofErr w:type="gramStart"/>
       <w:r>
         <w:t>%</w:t>
       </w:r>
       <w:r>
         <w:t xml:space="preserve"> .</w:t>
       </w:r>
-      <w:proofErr w:type="gramEnd"/>
       <w:sdt>
         <w:sdtPr>
           <w:id w:val="-1984074643"/>
@@ -761,6 +781,9 @@
         <w:keepNext/>
       </w:pPr>
       <w:r>
+        <w:rPr>
+          <w:noProof/>
+        </w:rPr>
         <w:drawing>
           <wp:inline distT="0" distB="0" distL="0" distR="0" wp14:anchorId="6DBC6DB7" wp14:editId="08C7DACB">
             <wp:extent cx="3028980" cy="1562379"/>
@@ -805,24 +828,14 @@
       <w:r>
         <w:t xml:space="preserve">Figure </w:t>
       </w:r>
-      <w:r>
-        <w:fldChar w:fldCharType="begin"/>
-      </w:r>
-      <w:r>
-        <w:instrText xml:space="preserve"> SEQ Figure \* ARABIC </w:instrText>
-      </w:r>
-      <w:r>
-        <w:fldChar w:fldCharType="separate"/>
-      </w:r>
-      <w:r>
-        <w:rPr>
-          <w:noProof/>
-        </w:rPr>
-        <w:t>1</w:t>
-      </w:r>
-      <w:r>
-        <w:fldChar w:fldCharType="end"/>
-      </w:r>
+      <w:fldSimple w:instr=" SEQ Figure \* ARABIC ">
+        <w:r>
+          <w:rPr>
+            <w:noProof/>
+          </w:rPr>
+          <w:t>1</w:t>
+        </w:r>
+      </w:fldSimple>
       <w:r>
         <w:t xml:space="preserve">: </w:t>
       </w:r>
@@ -832,13 +845,7 @@
     </w:p>
     <w:p>
       <w:r>
-        <w:rPr>
-          <w:rFonts w:ascii="Segoe UI Emoji" w:hAnsi="Segoe UI Emoji" w:cs="Segoe UI Emoji"/>
-        </w:rPr>
-        <w:t>✅</w:t>
-      </w:r>
-      <w:r>
-        <w:t xml:space="preserve"> Reducing excess inventory - Excess stock equates to unnecessary storage incurable costs. Data-based inventory control can minimize holding costs by almost 30% </w:t>
+        <w:t xml:space="preserve">Reducing excess inventory - Excess stock equates to unnecessary storage incurable costs. Data-based inventory control can minimize holding costs by almost 30% </w:t>
       </w:r>
       <w:sdt>
         <w:sdtPr>
@@ -871,12 +878,6 @@
       </w:r>
     </w:p>
     <w:p>
-      <w:r>
-        <w:rPr>
-          <w:rFonts w:ascii="Segoe UI Emoji" w:hAnsi="Segoe UI Emoji" w:cs="Segoe UI Emoji"/>
-        </w:rPr>
-        <w:t>✅</w:t>
-      </w:r>
       <w:r>
         <w:t xml:space="preserve"> Demand trend forecasting - Anticipating seasonal demand peaks (like Christmas, </w:t>
       </w:r>
@@ -982,26 +983,16 @@
     </w:p>
     <w:p>
       <w:r>
-        <w:rPr>
-          <w:rFonts w:ascii="Segoe UI Emoji" w:hAnsi="Segoe UI Emoji" w:cs="Segoe UI Emoji"/>
-        </w:rPr>
-        <w:t>✅</w:t>
-      </w:r>
-      <w:r>
-        <w:t xml:space="preserve"> Optimize supplier coordination - Align stock orders in real-time with sales to avoid delays and improve order accuracy. Supplier analytics can empower companies to deliver </w:t>
+        <w:t xml:space="preserve">Optimize supplier coordination - Align stock orders in real-time with sales to avoid delays and improve order accuracy. Supplier analytics can empower companies to deliver </w:t>
       </w:r>
       <w:r>
         <w:t>20% more</w:t>
       </w:r>
       <w:r>
-        <w:t xml:space="preserve"> </w:t>
-      </w:r>
-      <w:r>
-        <w:lastRenderedPageBreak/>
-        <w:t>efficiently</w:t>
-      </w:r>
-      <w:r>
-        <w:t xml:space="preserve"> and a 15% reduction in operational costs, making companies be more proactive with informed decisions. </w:t>
+        <w:t xml:space="preserve"> efficiently</w:t>
+      </w:r>
+      <w:r>
+        <w:t xml:space="preserve"> and a 15% reduction in operational costs, making companies more proactive with informed decisions. </w:t>
       </w:r>
       <w:sdt>
         <w:sdtPr>
@@ -1029,15 +1020,814 @@
           </w:r>
         </w:sdtContent>
       </w:sdt>
-    </w:p>
-    <w:p>
-      <w:r>
-        <w:t xml:space="preserve">3. </w:t>
-      </w:r>
-      <w:r>
-        <w:t>Business Analysis Method: SWOT Analysis</w:t>
-      </w:r>
-    </w:p>
+      <w:r>
+        <w:t>.</w:t>
+      </w:r>
+    </w:p>
+    <w:p>
+      <w:r>
+        <w:lastRenderedPageBreak/>
+        <w:t>Commercial Relevance:</w:t>
+      </w:r>
+    </w:p>
+    <w:p>
+      <w:r>
+        <w:t>•</w:t>
+      </w:r>
+      <w:r>
+        <w:tab/>
+        <w:t>Who will use the system? Store managers, buyers, and suppliers.</w:t>
+      </w:r>
+    </w:p>
+    <w:p>
+      <w:r>
+        <w:t>•</w:t>
+      </w:r>
+      <w:r>
+        <w:tab/>
+        <w:t>Competitive Advantage: Prevents lost sales, improves customer satisfaction, and reduces storage costs.</w:t>
+      </w:r>
+    </w:p>
+    <w:p/>
+    <w:p>
+      <w:r>
+        <w:t>3. Business Analysis Method: SWOT Analysis</w:t>
+      </w:r>
+    </w:p>
+    <w:p>
+      <w:r>
+        <w:t>Strengths</w:t>
+      </w:r>
+    </w:p>
+    <w:p>
+      <w:r>
+        <w:t>•</w:t>
+      </w:r>
+      <w:r>
+        <w:tab/>
+        <w:t>An extremely strong demand for premium wines.</w:t>
+      </w:r>
+    </w:p>
+    <w:p>
+      <w:r>
+        <w:t>•</w:t>
+      </w:r>
+      <w:r>
+        <w:tab/>
+        <w:t>Good relationships with suppliers.</w:t>
+      </w:r>
+    </w:p>
+    <w:p>
+      <w:r>
+        <w:t>•</w:t>
+      </w:r>
+      <w:r>
+        <w:tab/>
+        <w:t>Brand well-established in Dublin.</w:t>
+      </w:r>
+    </w:p>
+    <w:p>
+      <w:r>
+        <w:t>Weaknesses</w:t>
+      </w:r>
+    </w:p>
+    <w:p>
+      <w:r>
+        <w:t>•</w:t>
+      </w:r>
+      <w:r>
+        <w:tab/>
+        <w:t xml:space="preserve">Frequent unavailability for high-demand wines. </w:t>
+      </w:r>
+    </w:p>
+    <w:p>
+      <w:r>
+        <w:t>•</w:t>
+      </w:r>
+      <w:r>
+        <w:tab/>
+        <w:t xml:space="preserve">Too much inventory of slow-moving wines wastes space and capital. </w:t>
+      </w:r>
+    </w:p>
+    <w:p>
+      <w:r>
+        <w:t>Opportunities</w:t>
+      </w:r>
+    </w:p>
+    <w:p>
+      <w:r>
+        <w:t>•</w:t>
+      </w:r>
+      <w:r>
+        <w:tab/>
+        <w:t>Data analytics can be used to manage stock levels.</w:t>
+      </w:r>
+    </w:p>
+    <w:p>
+      <w:r>
+        <w:t>•</w:t>
+      </w:r>
+      <w:r>
+        <w:tab/>
+        <w:t xml:space="preserve">The reordering system may get automated. </w:t>
+      </w:r>
+    </w:p>
+    <w:p>
+      <w:r>
+        <w:t>•</w:t>
+      </w:r>
+      <w:r>
+        <w:tab/>
+        <w:t xml:space="preserve">Supplier coordination can improve through real-time data. </w:t>
+      </w:r>
+    </w:p>
+    <w:p>
+      <w:r>
+        <w:t>Threats</w:t>
+      </w:r>
+    </w:p>
+    <w:p>
+      <w:r>
+        <w:t>•</w:t>
+      </w:r>
+      <w:r>
+        <w:tab/>
+        <w:t xml:space="preserve">Inventory </w:t>
+      </w:r>
+      <w:r>
+        <w:t>systems of competitors being more efficient</w:t>
+      </w:r>
+      <w:r>
+        <w:t xml:space="preserve">. </w:t>
+      </w:r>
+    </w:p>
+    <w:p>
+      <w:r>
+        <w:t>•</w:t>
+      </w:r>
+      <w:r>
+        <w:tab/>
+        <w:t xml:space="preserve">Delays from suppliers keep stock unavailability. </w:t>
+      </w:r>
+    </w:p>
+    <w:p>
+      <w:r>
+        <w:t>•</w:t>
+      </w:r>
+      <w:r>
+        <w:tab/>
+        <w:t>Regular fluctuations lead to unpredictable demand.</w:t>
+      </w:r>
+    </w:p>
+    <w:p>
+      <w:r>
+        <w:t>4. Data Collection &amp; Analysis</w:t>
+      </w:r>
+    </w:p>
+    <w:p>
+      <w:r>
+        <w:t>What Data Was Collected?</w:t>
+      </w:r>
+    </w:p>
+    <w:p>
+      <w:r>
+        <w:t>•</w:t>
+      </w:r>
+      <w:r>
+        <w:tab/>
+        <w:t>Fastest Moving Sales Report: Identifies top-selling wines.</w:t>
+      </w:r>
+    </w:p>
+    <w:p>
+      <w:r>
+        <w:t>•</w:t>
+      </w:r>
+      <w:r>
+        <w:tab/>
+        <w:t>Slowest Moving Sales Report: Highlights wines that take too long to sell.</w:t>
+      </w:r>
+    </w:p>
+    <w:p>
+      <w:r>
+        <w:t>•</w:t>
+      </w:r>
+      <w:r>
+        <w:tab/>
+      </w:r>
+      <w:r>
+        <w:t xml:space="preserve">Product Sales </w:t>
+      </w:r>
+      <w:r>
+        <w:t>by</w:t>
+      </w:r>
+      <w:r>
+        <w:t xml:space="preserve"> Week</w:t>
+      </w:r>
+      <w:r>
+        <w:t xml:space="preserve">: Shows </w:t>
+      </w:r>
+      <w:r>
+        <w:t>sales by week</w:t>
+      </w:r>
+      <w:r>
+        <w:t>.</w:t>
+      </w:r>
+    </w:p>
+    <w:p>
+      <w:r>
+        <w:t>•</w:t>
+      </w:r>
+      <w:r>
+        <w:tab/>
+      </w:r>
+      <w:r>
+        <w:t>Stock Movement</w:t>
+      </w:r>
+      <w:r>
+        <w:t xml:space="preserve">: Indicates </w:t>
+      </w:r>
+      <w:r>
+        <w:t xml:space="preserve">the </w:t>
+      </w:r>
+      <w:r>
+        <w:t>number of wines sold during a specific period</w:t>
+      </w:r>
+      <w:r>
+        <w:t>.</w:t>
+      </w:r>
+    </w:p>
+    <w:p/>
+    <w:p/>
+    <w:p/>
+    <w:p>
+      <w:r>
+        <w:t>Key Insights from the Reports:</w:t>
+      </w:r>
+    </w:p>
+    <w:p>
+      <w:r>
+        <w:lastRenderedPageBreak/>
+        <w:t xml:space="preserve"> </w:t>
+      </w:r>
+      <w:r>
+        <w:t>Best-Selling Wines:</w:t>
+      </w:r>
+    </w:p>
+    <w:p>
+      <w:pPr>
+        <w:pStyle w:val="ListParagraph"/>
+        <w:numPr>
+          <w:ilvl w:val="0"/>
+          <w:numId w:val="15"/>
+        </w:numPr>
+      </w:pPr>
+      <w:r>
+        <w:t>Portillo Malbec Organic (36 units sold), So Prosecco DOC Treviso (22 units sold), and Saint Emilion A.C. (12 units sold).</w:t>
+      </w:r>
+    </w:p>
+    <w:p>
+      <w:r>
+        <w:t>Slow-Moving Wines:</w:t>
+      </w:r>
+    </w:p>
+    <w:p>
+      <w:pPr>
+        <w:pStyle w:val="ListParagraph"/>
+        <w:numPr>
+          <w:ilvl w:val="0"/>
+          <w:numId w:val="15"/>
+        </w:numPr>
+      </w:pPr>
+      <w:r>
+        <w:t>Assyrtiko, and Bollini Rose (1 unit sold each).</w:t>
+      </w:r>
+    </w:p>
+    <w:p>
+      <w:r>
+        <w:rPr>
+          <w:rFonts w:ascii="Segoe UI Emoji" w:hAnsi="Segoe UI Emoji" w:cs="Segoe UI Emoji"/>
+        </w:rPr>
+        <w:t>S</w:t>
+      </w:r>
+      <w:r>
+        <w:t>ales Trends:</w:t>
+      </w:r>
+    </w:p>
+    <w:p>
+      <w:pPr>
+        <w:pStyle w:val="ListParagraph"/>
+        <w:numPr>
+          <w:ilvl w:val="0"/>
+          <w:numId w:val="15"/>
+        </w:numPr>
+      </w:pPr>
+      <w:r>
+        <w:t>Sales spike before weekends (suggesting high weekend demand).</w:t>
+      </w:r>
+    </w:p>
+    <w:p>
+      <w:pPr>
+        <w:pStyle w:val="ListParagraph"/>
+        <w:numPr>
+          <w:ilvl w:val="0"/>
+          <w:numId w:val="15"/>
+        </w:numPr>
+      </w:pPr>
+      <w:r>
+        <w:t>Some wines</w:t>
+      </w:r>
+      <w:r>
+        <w:t xml:space="preserve"> </w:t>
+      </w:r>
+      <w:r>
+        <w:t>sell out, requiring better forecasting.</w:t>
+      </w:r>
+    </w:p>
+    <w:p>
+      <w:pPr>
+        <w:pStyle w:val="ListParagraph"/>
+        <w:numPr>
+          <w:ilvl w:val="0"/>
+          <w:numId w:val="15"/>
+        </w:numPr>
+      </w:pPr>
+      <w:r>
+        <w:t>Overstock of slow-moving wines leads to wasted space and capital.</w:t>
+      </w:r>
+    </w:p>
+    <w:p>
+      <w:r>
+        <w:t>5. Technology Selection &amp; Comparison</w:t>
+      </w:r>
+    </w:p>
+    <w:p>
+      <w:r>
+        <w:t>Chosen Technology: Power BI vs. Python (Pandas &amp; Matplotlib)</w:t>
+      </w:r>
+    </w:p>
+    <w:tbl>
+      <w:tblPr>
+        <w:tblStyle w:val="TableGrid"/>
+        <w:tblW w:w="0" w:type="auto"/>
+        <w:tblLook w:val="04A0" w:firstRow="1" w:lastRow="0" w:firstColumn="1" w:lastColumn="0" w:noHBand="0" w:noVBand="1"/>
+      </w:tblPr>
+      <w:tblGrid>
+        <w:gridCol w:w="3005"/>
+        <w:gridCol w:w="3005"/>
+        <w:gridCol w:w="3006"/>
+      </w:tblGrid>
+      <w:tr>
+        <w:tc>
+          <w:tcPr>
+            <w:tcW w:w="3005" w:type="dxa"/>
+          </w:tcPr>
+          <w:p>
+            <w:r>
+              <w:t>Technology</w:t>
+            </w:r>
+          </w:p>
+        </w:tc>
+        <w:tc>
+          <w:tcPr>
+            <w:tcW w:w="3005" w:type="dxa"/>
+          </w:tcPr>
+          <w:p>
+            <w:r>
+              <w:t xml:space="preserve"> Why Choose It?</w:t>
+            </w:r>
+          </w:p>
+        </w:tc>
+        <w:tc>
+          <w:tcPr>
+            <w:tcW w:w="3006" w:type="dxa"/>
+          </w:tcPr>
+          <w:p>
+            <w:r>
+              <w:t>Alternative &amp; Justification</w:t>
+            </w:r>
+          </w:p>
+          <w:p/>
+        </w:tc>
+      </w:tr>
+      <w:tr>
+        <w:tc>
+          <w:tcPr>
+            <w:tcW w:w="3005" w:type="dxa"/>
+          </w:tcPr>
+          <w:p>
+            <w:r>
+              <w:t>Power BI</w:t>
+            </w:r>
+          </w:p>
+        </w:tc>
+        <w:tc>
+          <w:tcPr>
+            <w:tcW w:w="3005" w:type="dxa"/>
+          </w:tcPr>
+          <w:p>
+            <w:r>
+              <w:t>Best for visualizing sales &amp; stock trends in a user-friendly way.</w:t>
+            </w:r>
+          </w:p>
+        </w:tc>
+        <w:tc>
+          <w:tcPr>
+            <w:tcW w:w="3006" w:type="dxa"/>
+          </w:tcPr>
+          <w:p>
+            <w:r>
+              <w:t>Tableau (more expensive)</w:t>
+            </w:r>
+          </w:p>
+        </w:tc>
+      </w:tr>
+      <w:tr>
+        <w:tc>
+          <w:tcPr>
+            <w:tcW w:w="3005" w:type="dxa"/>
+          </w:tcPr>
+          <w:p>
+            <w:r>
+              <w:t>Python (Pandas, Matplotlib)</w:t>
+            </w:r>
+          </w:p>
+        </w:tc>
+        <w:tc>
+          <w:tcPr>
+            <w:tcW w:w="3005" w:type="dxa"/>
+          </w:tcPr>
+          <w:p>
+            <w:r>
+              <w:t>Better for automating demand forecasting.</w:t>
+            </w:r>
+          </w:p>
+        </w:tc>
+        <w:tc>
+          <w:tcPr>
+            <w:tcW w:w="3006" w:type="dxa"/>
+          </w:tcPr>
+          <w:p>
+            <w:pPr>
+              <w:pBdr>
+                <w:top w:val="single" w:sz="4" w:space="1" w:color="auto"/>
+                <w:left w:val="single" w:sz="4" w:space="4" w:color="auto"/>
+                <w:bottom w:val="single" w:sz="4" w:space="1" w:color="auto"/>
+                <w:right w:val="single" w:sz="4" w:space="4" w:color="auto"/>
+                <w:between w:val="single" w:sz="4" w:space="1" w:color="auto"/>
+                <w:bar w:val="single" w:sz="4" w:color="auto"/>
+              </w:pBdr>
+            </w:pPr>
+            <w:r>
+              <w:t>Excel (easier but limited for predictive analytics)</w:t>
+            </w:r>
+          </w:p>
+        </w:tc>
+      </w:tr>
+    </w:tbl>
+    <w:p>
+      <w:pPr>
+        <w:rPr>
+          <w:rFonts w:ascii="Segoe UI Emoji" w:hAnsi="Segoe UI Emoji" w:cs="Segoe UI Emoji"/>
+        </w:rPr>
+      </w:pPr>
+    </w:p>
+    <w:p>
+      <w:r>
+        <w:t xml:space="preserve"> Decision:</w:t>
+      </w:r>
+    </w:p>
+    <w:p>
+      <w:pPr>
+        <w:pStyle w:val="ListParagraph"/>
+        <w:numPr>
+          <w:ilvl w:val="0"/>
+          <w:numId w:val="16"/>
+        </w:numPr>
+      </w:pPr>
+      <w:r>
+        <w:t xml:space="preserve">Power BI for data visualization </w:t>
+      </w:r>
+      <w:r>
+        <w:t xml:space="preserve">and </w:t>
+      </w:r>
+      <w:r>
+        <w:t>reporting.</w:t>
+      </w:r>
+    </w:p>
+    <w:p>
+      <w:pPr>
+        <w:pStyle w:val="ListParagraph"/>
+        <w:numPr>
+          <w:ilvl w:val="0"/>
+          <w:numId w:val="16"/>
+        </w:numPr>
+      </w:pPr>
+      <w:r>
+        <w:t>Python for advanced trend forecasting.</w:t>
+      </w:r>
+    </w:p>
+    <w:p>
+      <w:r>
+        <w:t>6. Setting Automatic Reordering for Fast-Moving Wines</w:t>
+      </w:r>
+    </w:p>
+    <w:p>
+      <w:r>
+        <w:t>Point Formula:</w:t>
+      </w:r>
+    </w:p>
+    <w:p>
+      <w:r>
+        <w:t xml:space="preserve">Anticipating fast-moving wines, an automatic reorder point (ROP) system </w:t>
+      </w:r>
+      <w:r>
+        <w:t xml:space="preserve"> </w:t>
+      </w:r>
+      <w:sdt>
+        <w:sdtPr>
+          <w:id w:val="148413301"/>
+          <w:citation/>
+        </w:sdtPr>
+        <w:sdtContent>
+          <w:r>
+            <w:fldChar w:fldCharType="begin"/>
+          </w:r>
+          <w:r>
+            <w:instrText xml:space="preserve"> CITATION Tur23 \l 6153 </w:instrText>
+          </w:r>
+          <w:r>
+            <w:fldChar w:fldCharType="separate"/>
+          </w:r>
+          <w:r>
+            <w:rPr>
+              <w:noProof/>
+            </w:rPr>
+            <w:t>(Turovski, 2023)</w:t>
+          </w:r>
+          <w:r>
+            <w:fldChar w:fldCharType="end"/>
+          </w:r>
+        </w:sdtContent>
+      </w:sdt>
+      <w:r>
+        <w:t xml:space="preserve"> </w:t>
+      </w:r>
+      <w:r>
+        <w:t xml:space="preserve">for effective stock management </w:t>
+      </w:r>
+      <w:r>
+        <w:t>can be</w:t>
+      </w:r>
+      <w:r>
+        <w:t xml:space="preserve"> </w:t>
+      </w:r>
+      <w:r>
+        <w:t>established considering the</w:t>
+      </w:r>
+      <w:r>
+        <w:t xml:space="preserve"> supplier delivery schedules and off </w:t>
+      </w:r>
+      <w:r>
+        <w:t>times</w:t>
+      </w:r>
+      <w:r>
+        <w:t xml:space="preserve">. </w:t>
+      </w:r>
+      <w:r>
+        <w:t>The</w:t>
+      </w:r>
+      <w:r>
+        <w:t xml:space="preserve"> </w:t>
+      </w:r>
+      <w:r>
+        <w:rPr>
+          <w:b/>
+          <w:bCs/>
+        </w:rPr>
+        <w:t>Reorder Point (ROP) Formula</w:t>
+      </w:r>
+      <w:r>
+        <w:t xml:space="preserve"> applied </w:t>
+      </w:r>
+      <w:r>
+        <w:t>is:</w:t>
+      </w:r>
+    </w:p>
+    <w:p>
+      <w:r>
+        <w:t>Example Calculation for Portillo Malbec Organic:</w:t>
+      </w:r>
+    </w:p>
+    <w:p>
+      <w:pPr>
+        <w:pStyle w:val="ListParagraph"/>
+        <w:numPr>
+          <w:ilvl w:val="0"/>
+          <w:numId w:val="18"/>
+        </w:numPr>
+      </w:pPr>
+      <w:r>
+        <w:t>Sales Rate: 36 bottles sold in 21 days → 1.7 bottles/day.</w:t>
+      </w:r>
+    </w:p>
+    <w:p>
+      <w:pPr>
+        <w:pStyle w:val="ListParagraph"/>
+        <w:numPr>
+          <w:ilvl w:val="0"/>
+          <w:numId w:val="18"/>
+        </w:numPr>
+      </w:pPr>
+      <w:r>
+        <w:t xml:space="preserve">Lead Time: </w:t>
+      </w:r>
+      <w:r>
+        <w:t>1</w:t>
+      </w:r>
+      <w:r>
+        <w:t xml:space="preserve"> day </w:t>
+      </w:r>
+      <w:r>
+        <w:t>if </w:t>
+      </w:r>
+      <w:r>
+        <w:t xml:space="preserve">the </w:t>
+      </w:r>
+      <w:r>
+        <w:t>order </w:t>
+      </w:r>
+      <w:r>
+        <w:t xml:space="preserve">is </w:t>
+      </w:r>
+      <w:r>
+        <w:t>placed before Thursday 1:15 PM (Friday delivery)</w:t>
+      </w:r>
+      <w:r>
+        <w:t>, 4 d</w:t>
+      </w:r>
+      <w:r>
+        <w:t>ays if an order is placed after Thursday 1:15 PM (Tuesday delivery)</w:t>
+      </w:r>
+    </w:p>
+    <w:p>
+      <w:r>
+        <w:t>Scenario 1: Ordering Before Thursday 1:15 PM (for Friday Delivery)</w:t>
+      </w:r>
+    </w:p>
+    <w:p>
+      <w:pPr>
+        <w:jc w:val="center"/>
+      </w:pPr>
+      <w:r>
+        <w:rPr>
+          <w:rFonts w:ascii="Cambria Math" w:hAnsi="Cambria Math" w:cs="Cambria Math"/>
+        </w:rPr>
+        <w:t xml:space="preserve">𝑅𝑂𝑃 </w:t>
+      </w:r>
+      <w:r>
+        <w:t>= (1.7 × 1)</w:t>
+      </w:r>
+      <w:r>
+        <w:t xml:space="preserve"> </w:t>
+      </w:r>
+      <w:r>
+        <w:t>+</w:t>
+      </w:r>
+      <w:r>
+        <w:t xml:space="preserve"> </w:t>
+      </w:r>
+      <w:r>
+        <w:t>5</w:t>
+      </w:r>
+      <w:r>
+        <w:t xml:space="preserve"> </w:t>
+      </w:r>
+      <w:r>
+        <w:t>=</w:t>
+      </w:r>
+      <w:r>
+        <w:t xml:space="preserve"> </w:t>
+      </w:r>
+      <w:r>
+        <w:t>6.7</w:t>
+      </w:r>
+      <w:r>
+        <w:t xml:space="preserve"> </w:t>
+      </w:r>
+      <w:r>
+        <w:t>≈</w:t>
+      </w:r>
+      <w:r>
+        <w:t xml:space="preserve"> </w:t>
+      </w:r>
+      <w:r>
+        <w:t>7</w:t>
+      </w:r>
+      <w:r>
+        <w:t xml:space="preserve"> </w:t>
+      </w:r>
+      <w:r>
+        <w:t>bottle</w:t>
+      </w:r>
+    </w:p>
+    <w:p>
+      <w:pPr>
+        <w:pStyle w:val="ListParagraph"/>
+        <w:numPr>
+          <w:ilvl w:val="0"/>
+          <w:numId w:val="17"/>
+        </w:numPr>
+      </w:pPr>
+      <w:r>
+        <w:t xml:space="preserve">Safety Stock:  </w:t>
+      </w:r>
+      <w:r>
+        <w:t xml:space="preserve">Reorder when </w:t>
+      </w:r>
+      <w:r>
+        <w:t xml:space="preserve">the </w:t>
+      </w:r>
+      <w:r>
+        <w:t>stock reaches 7 bottles to receive delivery on Friday.</w:t>
+      </w:r>
+    </w:p>
+    <w:p>
+      <w:pPr>
+        <w:ind w:left="360"/>
+      </w:pPr>
+      <w:r>
+        <w:t>Scenario 2: Ordering After Thursday 1:15 PM (for Tuesday Delivery)</w:t>
+      </w:r>
+    </w:p>
+    <w:p>
+      <w:pPr>
+        <w:jc w:val="center"/>
+      </w:pPr>
+      <w:r>
+        <w:rPr>
+          <w:rFonts w:ascii="Cambria Math" w:hAnsi="Cambria Math" w:cs="Cambria Math"/>
+        </w:rPr>
+        <w:t xml:space="preserve">𝑅𝑂𝑃 </w:t>
+      </w:r>
+      <w:r>
+        <w:t>= (1.7 × 4) + 5 = 11.8 ≈ 12 bottles</w:t>
+      </w:r>
+    </w:p>
+    <w:p>
+      <w:pPr>
+        <w:pStyle w:val="ListParagraph"/>
+        <w:numPr>
+          <w:ilvl w:val="0"/>
+          <w:numId w:val="17"/>
+        </w:numPr>
+      </w:pPr>
+      <w:r>
+        <w:lastRenderedPageBreak/>
+        <w:t xml:space="preserve">Safety Stock:  </w:t>
+      </w:r>
+      <w:r>
+        <w:t xml:space="preserve">Reorder when </w:t>
+      </w:r>
+      <w:r>
+        <w:t xml:space="preserve">the </w:t>
+      </w:r>
+      <w:r>
+        <w:t>stock reaches 12 bottles to receive delivery on Tuesday.</w:t>
+      </w:r>
+    </w:p>
+    <w:p>
+      <w:pPr>
+        <w:ind w:firstLine="360"/>
+      </w:pPr>
+      <w:r>
+        <w:t xml:space="preserve">Overall, this procedure appears to ensure that </w:t>
+      </w:r>
+      <w:r>
+        <w:t xml:space="preserve">the stock </w:t>
+      </w:r>
+      <w:r>
+        <w:t xml:space="preserve">is replenished </w:t>
+      </w:r>
+      <w:r>
+        <w:t>in time</w:t>
+      </w:r>
+      <w:r>
+        <w:t xml:space="preserve"> </w:t>
+      </w:r>
+      <w:r>
+        <w:t>preventing shortage</w:t>
+      </w:r>
+      <w:r>
+        <w:t xml:space="preserve"> shortage, while also minimizing </w:t>
+      </w:r>
+      <w:r>
+        <w:t>excess</w:t>
+      </w:r>
+      <w:r>
+        <w:t xml:space="preserve"> inventory.</w:t>
+      </w:r>
+    </w:p>
+    <w:p/>
     <w:p>
       <w:r>
         <w:br w:type="page"/>
@@ -1045,20 +1835,18 @@
     </w:p>
     <w:sdt>
       <w:sdtPr>
+        <w:rPr>
+          <w:rFonts w:asciiTheme="minorHAnsi" w:eastAsiaTheme="minorHAnsi" w:hAnsiTheme="minorHAnsi" w:cstheme="minorBidi"/>
+          <w:color w:val="auto"/>
+          <w:sz w:val="22"/>
+          <w:szCs w:val="22"/>
+        </w:rPr>
         <w:id w:val="-1632932086"/>
         <w:docPartObj>
           <w:docPartGallery w:val="Bibliographies"/>
           <w:docPartUnique/>
         </w:docPartObj>
       </w:sdtPr>
-      <w:sdtEndPr>
-        <w:rPr>
-          <w:rFonts w:asciiTheme="minorHAnsi" w:eastAsiaTheme="minorHAnsi" w:hAnsiTheme="minorHAnsi" w:cstheme="minorBidi"/>
-          <w:color w:val="auto"/>
-          <w:sz w:val="22"/>
-          <w:szCs w:val="22"/>
-        </w:rPr>
-      </w:sdtEndPr>
       <w:sdtContent>
         <w:p>
           <w:pPr>
@@ -1204,6 +1992,35 @@
               </w:r>
             </w:p>
             <w:p>
+              <w:pPr>
+                <w:pStyle w:val="Bibliography"/>
+                <w:ind w:left="720" w:hanging="720"/>
+                <w:rPr>
+                  <w:noProof/>
+                </w:rPr>
+              </w:pPr>
+              <w:r>
+                <w:rPr>
+                  <w:noProof/>
+                </w:rPr>
+                <w:t xml:space="preserve">Turovski, M. (2023, 01 24). </w:t>
+              </w:r>
+              <w:r>
+                <w:rPr>
+                  <w:i/>
+                  <w:iCs/>
+                  <w:noProof/>
+                </w:rPr>
+                <w:t>MRPeasy</w:t>
+              </w:r>
+              <w:r>
+                <w:rPr>
+                  <w:noProof/>
+                </w:rPr>
+                <w:t>. Retrieved 02 26, 2025, from What is Reorder Point and Reorder Point Formula?: https://www.mrpeasy.com/blog/what-is-reorder-point-and-reorder-point-formula/#:~:text=The%20reorder%20point%20formula%20is,rate)%20%2B%20safety%20stock%20level.</w:t>
+              </w:r>
+            </w:p>
+            <w:p>
               <w:r>
                 <w:rPr>
                   <w:b/>
@@ -1828,6 +2645,119 @@
     </w:lvl>
   </w:abstractNum>
   <w:abstractNum w:abstractNumId="4" w15:restartNumberingAfterBreak="0">
+    <w:nsid w:val="116E5399"/>
+    <w:multiLevelType w:val="hybridMultilevel"/>
+    <w:tmpl w:val="9670E836"/>
+    <w:lvl w:ilvl="0" w:tplc="18090001">
+      <w:start w:val="1"/>
+      <w:numFmt w:val="bullet"/>
+      <w:lvlText w:val=""/>
+      <w:lvlJc w:val="left"/>
+      <w:pPr>
+        <w:ind w:left="720" w:hanging="360"/>
+      </w:pPr>
+      <w:rPr>
+        <w:rFonts w:ascii="Symbol" w:hAnsi="Symbol" w:hint="default"/>
+      </w:rPr>
+    </w:lvl>
+    <w:lvl w:ilvl="1" w:tplc="18090003" w:tentative="1">
+      <w:start w:val="1"/>
+      <w:numFmt w:val="bullet"/>
+      <w:lvlText w:val="o"/>
+      <w:lvlJc w:val="left"/>
+      <w:pPr>
+        <w:ind w:left="1440" w:hanging="360"/>
+      </w:pPr>
+      <w:rPr>
+        <w:rFonts w:ascii="Courier New" w:hAnsi="Courier New" w:cs="Courier New" w:hint="default"/>
+      </w:rPr>
+    </w:lvl>
+    <w:lvl w:ilvl="2" w:tplc="18090005" w:tentative="1">
+      <w:start w:val="1"/>
+      <w:numFmt w:val="bullet"/>
+      <w:lvlText w:val=""/>
+      <w:lvlJc w:val="left"/>
+      <w:pPr>
+        <w:ind w:left="2160" w:hanging="360"/>
+      </w:pPr>
+      <w:rPr>
+        <w:rFonts w:ascii="Wingdings" w:hAnsi="Wingdings" w:hint="default"/>
+      </w:rPr>
+    </w:lvl>
+    <w:lvl w:ilvl="3" w:tplc="18090001" w:tentative="1">
+      <w:start w:val="1"/>
+      <w:numFmt w:val="bullet"/>
+      <w:lvlText w:val=""/>
+      <w:lvlJc w:val="left"/>
+      <w:pPr>
+        <w:ind w:left="2880" w:hanging="360"/>
+      </w:pPr>
+      <w:rPr>
+        <w:rFonts w:ascii="Symbol" w:hAnsi="Symbol" w:hint="default"/>
+      </w:rPr>
+    </w:lvl>
+    <w:lvl w:ilvl="4" w:tplc="18090003" w:tentative="1">
+      <w:start w:val="1"/>
+      <w:numFmt w:val="bullet"/>
+      <w:lvlText w:val="o"/>
+      <w:lvlJc w:val="left"/>
+      <w:pPr>
+        <w:ind w:left="3600" w:hanging="360"/>
+      </w:pPr>
+      <w:rPr>
+        <w:rFonts w:ascii="Courier New" w:hAnsi="Courier New" w:cs="Courier New" w:hint="default"/>
+      </w:rPr>
+    </w:lvl>
+    <w:lvl w:ilvl="5" w:tplc="18090005" w:tentative="1">
+      <w:start w:val="1"/>
+      <w:numFmt w:val="bullet"/>
+      <w:lvlText w:val=""/>
+      <w:lvlJc w:val="left"/>
+      <w:pPr>
+        <w:ind w:left="4320" w:hanging="360"/>
+      </w:pPr>
+      <w:rPr>
+        <w:rFonts w:ascii="Wingdings" w:hAnsi="Wingdings" w:hint="default"/>
+      </w:rPr>
+    </w:lvl>
+    <w:lvl w:ilvl="6" w:tplc="18090001" w:tentative="1">
+      <w:start w:val="1"/>
+      <w:numFmt w:val="bullet"/>
+      <w:lvlText w:val=""/>
+      <w:lvlJc w:val="left"/>
+      <w:pPr>
+        <w:ind w:left="5040" w:hanging="360"/>
+      </w:pPr>
+      <w:rPr>
+        <w:rFonts w:ascii="Symbol" w:hAnsi="Symbol" w:hint="default"/>
+      </w:rPr>
+    </w:lvl>
+    <w:lvl w:ilvl="7" w:tplc="18090003" w:tentative="1">
+      <w:start w:val="1"/>
+      <w:numFmt w:val="bullet"/>
+      <w:lvlText w:val="o"/>
+      <w:lvlJc w:val="left"/>
+      <w:pPr>
+        <w:ind w:left="5760" w:hanging="360"/>
+      </w:pPr>
+      <w:rPr>
+        <w:rFonts w:ascii="Courier New" w:hAnsi="Courier New" w:cs="Courier New" w:hint="default"/>
+      </w:rPr>
+    </w:lvl>
+    <w:lvl w:ilvl="8" w:tplc="18090005" w:tentative="1">
+      <w:start w:val="1"/>
+      <w:numFmt w:val="bullet"/>
+      <w:lvlText w:val=""/>
+      <w:lvlJc w:val="left"/>
+      <w:pPr>
+        <w:ind w:left="6480" w:hanging="360"/>
+      </w:pPr>
+      <w:rPr>
+        <w:rFonts w:ascii="Wingdings" w:hAnsi="Wingdings" w:hint="default"/>
+      </w:rPr>
+    </w:lvl>
+  </w:abstractNum>
+  <w:abstractNum w:abstractNumId="5" w15:restartNumberingAfterBreak="0">
     <w:nsid w:val="15121533"/>
     <w:multiLevelType w:val="multilevel"/>
     <w:tmpl w:val="EF620BF4"/>
@@ -1940,7 +2870,7 @@
       </w:pPr>
     </w:lvl>
   </w:abstractNum>
-  <w:abstractNum w:abstractNumId="5" w15:restartNumberingAfterBreak="0">
+  <w:abstractNum w:abstractNumId="6" w15:restartNumberingAfterBreak="0">
     <w:nsid w:val="196D30AC"/>
     <w:multiLevelType w:val="multilevel"/>
     <w:tmpl w:val="06288AA2"/>
@@ -2089,7 +3019,7 @@
       </w:rPr>
     </w:lvl>
   </w:abstractNum>
-  <w:abstractNum w:abstractNumId="6" w15:restartNumberingAfterBreak="0">
+  <w:abstractNum w:abstractNumId="7" w15:restartNumberingAfterBreak="0">
     <w:nsid w:val="1EC51609"/>
     <w:multiLevelType w:val="multilevel"/>
     <w:tmpl w:val="1A2C8F1C"/>
@@ -2238,7 +3168,233 @@
       </w:rPr>
     </w:lvl>
   </w:abstractNum>
-  <w:abstractNum w:abstractNumId="7" w15:restartNumberingAfterBreak="0">
+  <w:abstractNum w:abstractNumId="8" w15:restartNumberingAfterBreak="0">
+    <w:nsid w:val="2A7A43CB"/>
+    <w:multiLevelType w:val="hybridMultilevel"/>
+    <w:tmpl w:val="CA3E534A"/>
+    <w:lvl w:ilvl="0" w:tplc="18090001">
+      <w:start w:val="1"/>
+      <w:numFmt w:val="bullet"/>
+      <w:lvlText w:val=""/>
+      <w:lvlJc w:val="left"/>
+      <w:pPr>
+        <w:ind w:left="720" w:hanging="360"/>
+      </w:pPr>
+      <w:rPr>
+        <w:rFonts w:ascii="Symbol" w:hAnsi="Symbol" w:hint="default"/>
+      </w:rPr>
+    </w:lvl>
+    <w:lvl w:ilvl="1" w:tplc="18090003" w:tentative="1">
+      <w:start w:val="1"/>
+      <w:numFmt w:val="bullet"/>
+      <w:lvlText w:val="o"/>
+      <w:lvlJc w:val="left"/>
+      <w:pPr>
+        <w:ind w:left="1440" w:hanging="360"/>
+      </w:pPr>
+      <w:rPr>
+        <w:rFonts w:ascii="Courier New" w:hAnsi="Courier New" w:cs="Courier New" w:hint="default"/>
+      </w:rPr>
+    </w:lvl>
+    <w:lvl w:ilvl="2" w:tplc="18090005" w:tentative="1">
+      <w:start w:val="1"/>
+      <w:numFmt w:val="bullet"/>
+      <w:lvlText w:val=""/>
+      <w:lvlJc w:val="left"/>
+      <w:pPr>
+        <w:ind w:left="2160" w:hanging="360"/>
+      </w:pPr>
+      <w:rPr>
+        <w:rFonts w:ascii="Wingdings" w:hAnsi="Wingdings" w:hint="default"/>
+      </w:rPr>
+    </w:lvl>
+    <w:lvl w:ilvl="3" w:tplc="18090001" w:tentative="1">
+      <w:start w:val="1"/>
+      <w:numFmt w:val="bullet"/>
+      <w:lvlText w:val=""/>
+      <w:lvlJc w:val="left"/>
+      <w:pPr>
+        <w:ind w:left="2880" w:hanging="360"/>
+      </w:pPr>
+      <w:rPr>
+        <w:rFonts w:ascii="Symbol" w:hAnsi="Symbol" w:hint="default"/>
+      </w:rPr>
+    </w:lvl>
+    <w:lvl w:ilvl="4" w:tplc="18090003" w:tentative="1">
+      <w:start w:val="1"/>
+      <w:numFmt w:val="bullet"/>
+      <w:lvlText w:val="o"/>
+      <w:lvlJc w:val="left"/>
+      <w:pPr>
+        <w:ind w:left="3600" w:hanging="360"/>
+      </w:pPr>
+      <w:rPr>
+        <w:rFonts w:ascii="Courier New" w:hAnsi="Courier New" w:cs="Courier New" w:hint="default"/>
+      </w:rPr>
+    </w:lvl>
+    <w:lvl w:ilvl="5" w:tplc="18090005" w:tentative="1">
+      <w:start w:val="1"/>
+      <w:numFmt w:val="bullet"/>
+      <w:lvlText w:val=""/>
+      <w:lvlJc w:val="left"/>
+      <w:pPr>
+        <w:ind w:left="4320" w:hanging="360"/>
+      </w:pPr>
+      <w:rPr>
+        <w:rFonts w:ascii="Wingdings" w:hAnsi="Wingdings" w:hint="default"/>
+      </w:rPr>
+    </w:lvl>
+    <w:lvl w:ilvl="6" w:tplc="18090001" w:tentative="1">
+      <w:start w:val="1"/>
+      <w:numFmt w:val="bullet"/>
+      <w:lvlText w:val=""/>
+      <w:lvlJc w:val="left"/>
+      <w:pPr>
+        <w:ind w:left="5040" w:hanging="360"/>
+      </w:pPr>
+      <w:rPr>
+        <w:rFonts w:ascii="Symbol" w:hAnsi="Symbol" w:hint="default"/>
+      </w:rPr>
+    </w:lvl>
+    <w:lvl w:ilvl="7" w:tplc="18090003" w:tentative="1">
+      <w:start w:val="1"/>
+      <w:numFmt w:val="bullet"/>
+      <w:lvlText w:val="o"/>
+      <w:lvlJc w:val="left"/>
+      <w:pPr>
+        <w:ind w:left="5760" w:hanging="360"/>
+      </w:pPr>
+      <w:rPr>
+        <w:rFonts w:ascii="Courier New" w:hAnsi="Courier New" w:cs="Courier New" w:hint="default"/>
+      </w:rPr>
+    </w:lvl>
+    <w:lvl w:ilvl="8" w:tplc="18090005" w:tentative="1">
+      <w:start w:val="1"/>
+      <w:numFmt w:val="bullet"/>
+      <w:lvlText w:val=""/>
+      <w:lvlJc w:val="left"/>
+      <w:pPr>
+        <w:ind w:left="6480" w:hanging="360"/>
+      </w:pPr>
+      <w:rPr>
+        <w:rFonts w:ascii="Wingdings" w:hAnsi="Wingdings" w:hint="default"/>
+      </w:rPr>
+    </w:lvl>
+  </w:abstractNum>
+  <w:abstractNum w:abstractNumId="9" w15:restartNumberingAfterBreak="0">
+    <w:nsid w:val="3B893057"/>
+    <w:multiLevelType w:val="hybridMultilevel"/>
+    <w:tmpl w:val="7884CFF2"/>
+    <w:lvl w:ilvl="0" w:tplc="18090001">
+      <w:start w:val="1"/>
+      <w:numFmt w:val="bullet"/>
+      <w:lvlText w:val=""/>
+      <w:lvlJc w:val="left"/>
+      <w:pPr>
+        <w:ind w:left="720" w:hanging="360"/>
+      </w:pPr>
+      <w:rPr>
+        <w:rFonts w:ascii="Symbol" w:hAnsi="Symbol" w:hint="default"/>
+      </w:rPr>
+    </w:lvl>
+    <w:lvl w:ilvl="1" w:tplc="18090003" w:tentative="1">
+      <w:start w:val="1"/>
+      <w:numFmt w:val="bullet"/>
+      <w:lvlText w:val="o"/>
+      <w:lvlJc w:val="left"/>
+      <w:pPr>
+        <w:ind w:left="1440" w:hanging="360"/>
+      </w:pPr>
+      <w:rPr>
+        <w:rFonts w:ascii="Courier New" w:hAnsi="Courier New" w:cs="Courier New" w:hint="default"/>
+      </w:rPr>
+    </w:lvl>
+    <w:lvl w:ilvl="2" w:tplc="18090005" w:tentative="1">
+      <w:start w:val="1"/>
+      <w:numFmt w:val="bullet"/>
+      <w:lvlText w:val=""/>
+      <w:lvlJc w:val="left"/>
+      <w:pPr>
+        <w:ind w:left="2160" w:hanging="360"/>
+      </w:pPr>
+      <w:rPr>
+        <w:rFonts w:ascii="Wingdings" w:hAnsi="Wingdings" w:hint="default"/>
+      </w:rPr>
+    </w:lvl>
+    <w:lvl w:ilvl="3" w:tplc="18090001" w:tentative="1">
+      <w:start w:val="1"/>
+      <w:numFmt w:val="bullet"/>
+      <w:lvlText w:val=""/>
+      <w:lvlJc w:val="left"/>
+      <w:pPr>
+        <w:ind w:left="2880" w:hanging="360"/>
+      </w:pPr>
+      <w:rPr>
+        <w:rFonts w:ascii="Symbol" w:hAnsi="Symbol" w:hint="default"/>
+      </w:rPr>
+    </w:lvl>
+    <w:lvl w:ilvl="4" w:tplc="18090003" w:tentative="1">
+      <w:start w:val="1"/>
+      <w:numFmt w:val="bullet"/>
+      <w:lvlText w:val="o"/>
+      <w:lvlJc w:val="left"/>
+      <w:pPr>
+        <w:ind w:left="3600" w:hanging="360"/>
+      </w:pPr>
+      <w:rPr>
+        <w:rFonts w:ascii="Courier New" w:hAnsi="Courier New" w:cs="Courier New" w:hint="default"/>
+      </w:rPr>
+    </w:lvl>
+    <w:lvl w:ilvl="5" w:tplc="18090005" w:tentative="1">
+      <w:start w:val="1"/>
+      <w:numFmt w:val="bullet"/>
+      <w:lvlText w:val=""/>
+      <w:lvlJc w:val="left"/>
+      <w:pPr>
+        <w:ind w:left="4320" w:hanging="360"/>
+      </w:pPr>
+      <w:rPr>
+        <w:rFonts w:ascii="Wingdings" w:hAnsi="Wingdings" w:hint="default"/>
+      </w:rPr>
+    </w:lvl>
+    <w:lvl w:ilvl="6" w:tplc="18090001" w:tentative="1">
+      <w:start w:val="1"/>
+      <w:numFmt w:val="bullet"/>
+      <w:lvlText w:val=""/>
+      <w:lvlJc w:val="left"/>
+      <w:pPr>
+        <w:ind w:left="5040" w:hanging="360"/>
+      </w:pPr>
+      <w:rPr>
+        <w:rFonts w:ascii="Symbol" w:hAnsi="Symbol" w:hint="default"/>
+      </w:rPr>
+    </w:lvl>
+    <w:lvl w:ilvl="7" w:tplc="18090003" w:tentative="1">
+      <w:start w:val="1"/>
+      <w:numFmt w:val="bullet"/>
+      <w:lvlText w:val="o"/>
+      <w:lvlJc w:val="left"/>
+      <w:pPr>
+        <w:ind w:left="5760" w:hanging="360"/>
+      </w:pPr>
+      <w:rPr>
+        <w:rFonts w:ascii="Courier New" w:hAnsi="Courier New" w:cs="Courier New" w:hint="default"/>
+      </w:rPr>
+    </w:lvl>
+    <w:lvl w:ilvl="8" w:tplc="18090005" w:tentative="1">
+      <w:start w:val="1"/>
+      <w:numFmt w:val="bullet"/>
+      <w:lvlText w:val=""/>
+      <w:lvlJc w:val="left"/>
+      <w:pPr>
+        <w:ind w:left="6480" w:hanging="360"/>
+      </w:pPr>
+      <w:rPr>
+        <w:rFonts w:ascii="Wingdings" w:hAnsi="Wingdings" w:hint="default"/>
+      </w:rPr>
+    </w:lvl>
+  </w:abstractNum>
+  <w:abstractNum w:abstractNumId="10" w15:restartNumberingAfterBreak="0">
     <w:nsid w:val="539A7CFC"/>
     <w:multiLevelType w:val="multilevel"/>
     <w:tmpl w:val="3C7CBDE4"/>
@@ -2387,7 +3543,7 @@
       </w:rPr>
     </w:lvl>
   </w:abstractNum>
-  <w:abstractNum w:abstractNumId="8" w15:restartNumberingAfterBreak="0">
+  <w:abstractNum w:abstractNumId="11" w15:restartNumberingAfterBreak="0">
     <w:nsid w:val="558922C6"/>
     <w:multiLevelType w:val="multilevel"/>
     <w:tmpl w:val="5B58A564"/>
@@ -2536,7 +3692,7 @@
       </w:rPr>
     </w:lvl>
   </w:abstractNum>
-  <w:abstractNum w:abstractNumId="9" w15:restartNumberingAfterBreak="0">
+  <w:abstractNum w:abstractNumId="12" w15:restartNumberingAfterBreak="0">
     <w:nsid w:val="62BE65BB"/>
     <w:multiLevelType w:val="multilevel"/>
     <w:tmpl w:val="048811FA"/>
@@ -2685,7 +3841,120 @@
       </w:rPr>
     </w:lvl>
   </w:abstractNum>
-  <w:abstractNum w:abstractNumId="10" w15:restartNumberingAfterBreak="0">
+  <w:abstractNum w:abstractNumId="13" w15:restartNumberingAfterBreak="0">
+    <w:nsid w:val="6A1D256B"/>
+    <w:multiLevelType w:val="hybridMultilevel"/>
+    <w:tmpl w:val="7C9A8ADC"/>
+    <w:lvl w:ilvl="0" w:tplc="18090001">
+      <w:start w:val="1"/>
+      <w:numFmt w:val="bullet"/>
+      <w:lvlText w:val=""/>
+      <w:lvlJc w:val="left"/>
+      <w:pPr>
+        <w:ind w:left="720" w:hanging="360"/>
+      </w:pPr>
+      <w:rPr>
+        <w:rFonts w:ascii="Symbol" w:hAnsi="Symbol" w:hint="default"/>
+      </w:rPr>
+    </w:lvl>
+    <w:lvl w:ilvl="1" w:tplc="18090003" w:tentative="1">
+      <w:start w:val="1"/>
+      <w:numFmt w:val="bullet"/>
+      <w:lvlText w:val="o"/>
+      <w:lvlJc w:val="left"/>
+      <w:pPr>
+        <w:ind w:left="1440" w:hanging="360"/>
+      </w:pPr>
+      <w:rPr>
+        <w:rFonts w:ascii="Courier New" w:hAnsi="Courier New" w:cs="Courier New" w:hint="default"/>
+      </w:rPr>
+    </w:lvl>
+    <w:lvl w:ilvl="2" w:tplc="18090005" w:tentative="1">
+      <w:start w:val="1"/>
+      <w:numFmt w:val="bullet"/>
+      <w:lvlText w:val=""/>
+      <w:lvlJc w:val="left"/>
+      <w:pPr>
+        <w:ind w:left="2160" w:hanging="360"/>
+      </w:pPr>
+      <w:rPr>
+        <w:rFonts w:ascii="Wingdings" w:hAnsi="Wingdings" w:hint="default"/>
+      </w:rPr>
+    </w:lvl>
+    <w:lvl w:ilvl="3" w:tplc="18090001" w:tentative="1">
+      <w:start w:val="1"/>
+      <w:numFmt w:val="bullet"/>
+      <w:lvlText w:val=""/>
+      <w:lvlJc w:val="left"/>
+      <w:pPr>
+        <w:ind w:left="2880" w:hanging="360"/>
+      </w:pPr>
+      <w:rPr>
+        <w:rFonts w:ascii="Symbol" w:hAnsi="Symbol" w:hint="default"/>
+      </w:rPr>
+    </w:lvl>
+    <w:lvl w:ilvl="4" w:tplc="18090003" w:tentative="1">
+      <w:start w:val="1"/>
+      <w:numFmt w:val="bullet"/>
+      <w:lvlText w:val="o"/>
+      <w:lvlJc w:val="left"/>
+      <w:pPr>
+        <w:ind w:left="3600" w:hanging="360"/>
+      </w:pPr>
+      <w:rPr>
+        <w:rFonts w:ascii="Courier New" w:hAnsi="Courier New" w:cs="Courier New" w:hint="default"/>
+      </w:rPr>
+    </w:lvl>
+    <w:lvl w:ilvl="5" w:tplc="18090005" w:tentative="1">
+      <w:start w:val="1"/>
+      <w:numFmt w:val="bullet"/>
+      <w:lvlText w:val=""/>
+      <w:lvlJc w:val="left"/>
+      <w:pPr>
+        <w:ind w:left="4320" w:hanging="360"/>
+      </w:pPr>
+      <w:rPr>
+        <w:rFonts w:ascii="Wingdings" w:hAnsi="Wingdings" w:hint="default"/>
+      </w:rPr>
+    </w:lvl>
+    <w:lvl w:ilvl="6" w:tplc="18090001" w:tentative="1">
+      <w:start w:val="1"/>
+      <w:numFmt w:val="bullet"/>
+      <w:lvlText w:val=""/>
+      <w:lvlJc w:val="left"/>
+      <w:pPr>
+        <w:ind w:left="5040" w:hanging="360"/>
+      </w:pPr>
+      <w:rPr>
+        <w:rFonts w:ascii="Symbol" w:hAnsi="Symbol" w:hint="default"/>
+      </w:rPr>
+    </w:lvl>
+    <w:lvl w:ilvl="7" w:tplc="18090003" w:tentative="1">
+      <w:start w:val="1"/>
+      <w:numFmt w:val="bullet"/>
+      <w:lvlText w:val="o"/>
+      <w:lvlJc w:val="left"/>
+      <w:pPr>
+        <w:ind w:left="5760" w:hanging="360"/>
+      </w:pPr>
+      <w:rPr>
+        <w:rFonts w:ascii="Courier New" w:hAnsi="Courier New" w:cs="Courier New" w:hint="default"/>
+      </w:rPr>
+    </w:lvl>
+    <w:lvl w:ilvl="8" w:tplc="18090005" w:tentative="1">
+      <w:start w:val="1"/>
+      <w:numFmt w:val="bullet"/>
+      <w:lvlText w:val=""/>
+      <w:lvlJc w:val="left"/>
+      <w:pPr>
+        <w:ind w:left="6480" w:hanging="360"/>
+      </w:pPr>
+      <w:rPr>
+        <w:rFonts w:ascii="Wingdings" w:hAnsi="Wingdings" w:hint="default"/>
+      </w:rPr>
+    </w:lvl>
+  </w:abstractNum>
+  <w:abstractNum w:abstractNumId="14" w15:restartNumberingAfterBreak="0">
     <w:nsid w:val="6D7F77FE"/>
     <w:multiLevelType w:val="multilevel"/>
     <w:tmpl w:val="2710FDDA"/>
@@ -2834,7 +4103,7 @@
       </w:rPr>
     </w:lvl>
   </w:abstractNum>
-  <w:abstractNum w:abstractNumId="11" w15:restartNumberingAfterBreak="0">
+  <w:abstractNum w:abstractNumId="15" w15:restartNumberingAfterBreak="0">
     <w:nsid w:val="6E33664C"/>
     <w:multiLevelType w:val="multilevel"/>
     <w:tmpl w:val="59520974"/>
@@ -2983,7 +4252,7 @@
       </w:rPr>
     </w:lvl>
   </w:abstractNum>
-  <w:abstractNum w:abstractNumId="12" w15:restartNumberingAfterBreak="0">
+  <w:abstractNum w:abstractNumId="16" w15:restartNumberingAfterBreak="0">
     <w:nsid w:val="74C45F33"/>
     <w:multiLevelType w:val="multilevel"/>
     <w:tmpl w:val="F864B5D8"/>
@@ -3132,7 +4401,7 @@
       </w:rPr>
     </w:lvl>
   </w:abstractNum>
-  <w:abstractNum w:abstractNumId="13" w15:restartNumberingAfterBreak="0">
+  <w:abstractNum w:abstractNumId="17" w15:restartNumberingAfterBreak="0">
     <w:nsid w:val="7BF7048E"/>
     <w:multiLevelType w:val="multilevel"/>
     <w:tmpl w:val="D2EAFCE6"/>
@@ -3282,31 +4551,31 @@
     </w:lvl>
   </w:abstractNum>
   <w:num w:numId="1" w16cid:durableId="1905293843">
-    <w:abstractNumId w:val="11"/>
+    <w:abstractNumId w:val="15"/>
   </w:num>
   <w:num w:numId="2" w16cid:durableId="849175946">
     <w:abstractNumId w:val="2"/>
   </w:num>
   <w:num w:numId="3" w16cid:durableId="1841384563">
-    <w:abstractNumId w:val="5"/>
+    <w:abstractNumId w:val="6"/>
   </w:num>
   <w:num w:numId="4" w16cid:durableId="1129397891">
-    <w:abstractNumId w:val="6"/>
+    <w:abstractNumId w:val="7"/>
   </w:num>
   <w:num w:numId="5" w16cid:durableId="1112556247">
-    <w:abstractNumId w:val="8"/>
+    <w:abstractNumId w:val="11"/>
   </w:num>
   <w:num w:numId="6" w16cid:durableId="269550114">
-    <w:abstractNumId w:val="9"/>
+    <w:abstractNumId w:val="12"/>
   </w:num>
   <w:num w:numId="7" w16cid:durableId="1532256504">
-    <w:abstractNumId w:val="12"/>
+    <w:abstractNumId w:val="16"/>
   </w:num>
   <w:num w:numId="8" w16cid:durableId="635109628">
-    <w:abstractNumId w:val="7"/>
+    <w:abstractNumId w:val="10"/>
   </w:num>
   <w:num w:numId="9" w16cid:durableId="1186754716">
-    <w:abstractNumId w:val="13"/>
+    <w:abstractNumId w:val="17"/>
   </w:num>
   <w:num w:numId="10" w16cid:durableId="1105275105">
     <w:abstractNumId w:val="1"/>
@@ -3315,13 +4584,25 @@
     <w:abstractNumId w:val="0"/>
   </w:num>
   <w:num w:numId="12" w16cid:durableId="472019014">
-    <w:abstractNumId w:val="10"/>
+    <w:abstractNumId w:val="14"/>
   </w:num>
   <w:num w:numId="13" w16cid:durableId="1720014099">
     <w:abstractNumId w:val="3"/>
   </w:num>
   <w:num w:numId="14" w16cid:durableId="90979324">
+    <w:abstractNumId w:val="5"/>
+  </w:num>
+  <w:num w:numId="15" w16cid:durableId="913852121">
+    <w:abstractNumId w:val="9"/>
+  </w:num>
+  <w:num w:numId="16" w16cid:durableId="998924147">
     <w:abstractNumId w:val="4"/>
+  </w:num>
+  <w:num w:numId="17" w16cid:durableId="931474809">
+    <w:abstractNumId w:val="8"/>
+  </w:num>
+  <w:num w:numId="18" w16cid:durableId="951668676">
+    <w:abstractNumId w:val="13"/>
   </w:num>
 </w:numbering>
 </file>
@@ -3929,6 +5210,7 @@
   <w:style w:type="character" w:default="1" w:styleId="DefaultParagraphFont">
     <w:name w:val="Default Paragraph Font"/>
     <w:uiPriority w:val="1"/>
+    <w:semiHidden/>
     <w:unhideWhenUsed/>
   </w:style>
   <w:style w:type="table" w:default="1" w:styleId="TableNormal">
@@ -4690,11 +5972,36 @@
     <b:DayAccessed>25</b:DayAccessed>
     <b:RefOrder>4</b:RefOrder>
   </b:Source>
+  <b:Source>
+    <b:Tag>Tur23</b:Tag>
+    <b:SourceType>InternetSite</b:SourceType>
+    <b:Guid>{8B2651E9-A5C2-4C15-8EA8-BB09AD43DC6B}</b:Guid>
+    <b:Author>
+      <b:Author>
+        <b:NameList>
+          <b:Person>
+            <b:Last>Turovski</b:Last>
+            <b:First>Mattias</b:First>
+          </b:Person>
+        </b:NameList>
+      </b:Author>
+    </b:Author>
+    <b:Title>MRPeasy</b:Title>
+    <b:InternetSiteTitle>What is Reorder Point and Reorder Point Formula?</b:InternetSiteTitle>
+    <b:Year>2023</b:Year>
+    <b:Month>01</b:Month>
+    <b:Day>24</b:Day>
+    <b:URL>https://www.mrpeasy.com/blog/what-is-reorder-point-and-reorder-point-formula/#:~:text=The%20reorder%20point%20formula%20is,rate)%20%2B%20safety%20stock%20level.</b:URL>
+    <b:YearAccessed>2025</b:YearAccessed>
+    <b:MonthAccessed>02</b:MonthAccessed>
+    <b:DayAccessed>26</b:DayAccessed>
+    <b:RefOrder>5</b:RefOrder>
+  </b:Source>
 </b:Sources>
 </file>
 
 <file path=customXml/itemProps1.xml><?xml version="1.0" encoding="utf-8"?>
-<ds:datastoreItem xmlns:ds="http://schemas.openxmlformats.org/officeDocument/2006/customXml" ds:itemID="{AD87C7D1-5A9C-446F-B7D6-7CA43F5C6E0E}">
+<ds:datastoreItem xmlns:ds="http://schemas.openxmlformats.org/officeDocument/2006/customXml" ds:itemID="{08E0D310-2295-4BF4-A54E-23BCB0DAC53D}">
   <ds:schemaRefs>
     <ds:schemaRef ds:uri="http://schemas.openxmlformats.org/officeDocument/2006/bibliography"/>
   </ds:schemaRefs>

</xml_diff>

<commit_message>
Updating the new title topis
After talking with my manager we agreed that the ready-meal stock analyses would be more helpful for the company
I updated the introduction, business case and SWOT from the past file I had started
</commit_message>
<xml_diff>
--- a/Project Report.docx
+++ b/Project Report.docx
@@ -591,7 +591,13 @@
     <w:p/>
     <w:p>
       <w:r>
-        <w:t>Optimizing Wine Stock Management at Lotts &amp; Co. Using Data Analytics</w:t>
+        <w:t xml:space="preserve">Optimizing </w:t>
+      </w:r>
+      <w:r>
+        <w:t>Ready Meal Stock</w:t>
+      </w:r>
+      <w:r>
+        <w:t xml:space="preserve"> Management at Lotts &amp; Co. Using Data Analytics</w:t>
       </w:r>
     </w:p>
     <w:p>
@@ -678,19 +684,13 @@
     </w:p>
     <w:p>
       <w:r>
-        <w:t xml:space="preserve">The whole purpose of this project entails using data analytics to optimize the wine stock management at Lotts &amp; Co. </w:t>
-      </w:r>
-      <w:r>
-        <w:t>so</w:t>
-      </w:r>
-      <w:r>
-        <w:t xml:space="preserve"> that </w:t>
-      </w:r>
-      <w:r>
-        <w:t>best-sellers</w:t>
-      </w:r>
-      <w:r>
-        <w:t xml:space="preserve"> are always available while minimizing overstock on slow-moving wines.</w:t>
+        <w:t xml:space="preserve">The whole purpose of this project entails using data analytics to optimize </w:t>
+      </w:r>
+      <w:r>
+        <w:t>ready meal management at Lotts &amp; Co., to optimize stock levels, minimise waste, and forecast demand for ready meals</w:t>
+      </w:r>
+      <w:r>
+        <w:t>.</w:t>
       </w:r>
     </w:p>
     <w:p>
@@ -700,7 +700,49 @@
     </w:p>
     <w:p>
       <w:r>
-        <w:t>Stock shortages lead to lost sales, while excess stock ties up cash flow and takes up valuable storage space. The idea behind this project is data-driven decision-making, which will help improve inventory management and supplier coordination.</w:t>
+        <w:t>Stock shortages lead to lost sales</w:t>
+      </w:r>
+      <w:r>
+        <w:t xml:space="preserve"> </w:t>
+      </w:r>
+      <w:r>
+        <w:t>opportunities and dissatisfied customers</w:t>
+      </w:r>
+      <w:r>
+        <w:t xml:space="preserve">, while </w:t>
+      </w:r>
+      <w:r>
+        <w:t>overstock leads to waste</w:t>
+      </w:r>
+      <w:r>
+        <w:t>, increased storage</w:t>
+      </w:r>
+      <w:r>
+        <w:t xml:space="preserve"> and </w:t>
+      </w:r>
+      <w:r>
+        <w:t xml:space="preserve">financial </w:t>
+      </w:r>
+      <w:r>
+        <w:t>loss</w:t>
+      </w:r>
+      <w:r>
+        <w:t xml:space="preserve">. Ready meals have </w:t>
+      </w:r>
+      <w:r>
+        <w:t xml:space="preserve">a </w:t>
+      </w:r>
+      <w:r>
+        <w:t xml:space="preserve">limited shelf </w:t>
+      </w:r>
+      <w:r>
+        <w:t>life,</w:t>
+      </w:r>
+      <w:r>
+        <w:t xml:space="preserve"> </w:t>
+      </w:r>
+      <w:r>
+        <w:t xml:space="preserve">so good inventory management is crucial to minimize food waste and maximise sales efficiency.  </w:t>
       </w:r>
     </w:p>
     <w:p>
@@ -710,7 +752,85 @@
     </w:p>
     <w:p>
       <w:r>
-        <w:t>The study investigates the sales scenario of wine and forecasts the demand trends to ensure higher efficiency in stock replenishment besides pinpointing highly selling products and slow-moving ones.</w:t>
+        <w:t xml:space="preserve">The study investigates the sales </w:t>
+      </w:r>
+      <w:r>
+        <w:t xml:space="preserve">performance and stock movement </w:t>
+      </w:r>
+      <w:r>
+        <w:t xml:space="preserve">of </w:t>
+      </w:r>
+      <w:r>
+        <w:t>ready meals</w:t>
+      </w:r>
+      <w:r>
+        <w:t xml:space="preserve">. The first focus will be </w:t>
+      </w:r>
+      <w:r>
+        <w:t>analysing</w:t>
+      </w:r>
+      <w:r>
+        <w:t xml:space="preserve"> the sales trend, identifying </w:t>
+      </w:r>
+      <w:r>
+        <w:t>best-selling</w:t>
+      </w:r>
+      <w:r>
+        <w:t>,</w:t>
+      </w:r>
+      <w:r>
+        <w:t xml:space="preserve"> </w:t>
+      </w:r>
+      <w:r>
+        <w:t>slow-moving</w:t>
+      </w:r>
+      <w:r>
+        <w:t xml:space="preserve"> products</w:t>
+      </w:r>
+      <w:r>
+        <w:t xml:space="preserve">, </w:t>
+      </w:r>
+      <w:r>
+        <w:t>and</w:t>
+      </w:r>
+      <w:r>
+        <w:t xml:space="preserve"> forecasting demand </w:t>
+      </w:r>
+      <w:r>
+        <w:t>patterns</w:t>
+      </w:r>
+      <w:r>
+        <w:t xml:space="preserve">. This </w:t>
+      </w:r>
+      <w:r>
+        <w:t>analysis</w:t>
+      </w:r>
+      <w:r>
+        <w:t xml:space="preserve"> will optimise stock </w:t>
+      </w:r>
+      <w:r>
+        <w:t>replenishment</w:t>
+      </w:r>
+      <w:r>
+        <w:t xml:space="preserve">, reduce waste </w:t>
+      </w:r>
+      <w:r>
+        <w:t xml:space="preserve">and ensure </w:t>
+      </w:r>
+      <w:r>
+        <w:t>that</w:t>
+      </w:r>
+      <w:r>
+        <w:t xml:space="preserve"> good sellers are </w:t>
+      </w:r>
+      <w:r>
+        <w:t>always</w:t>
+      </w:r>
+      <w:r>
+        <w:t xml:space="preserve"> available. </w:t>
+      </w:r>
+      <w:r>
+        <w:t>The study will explore the impact of meal waste management and suggest improvements for efficient inventory control</w:t>
       </w:r>
     </w:p>
     <w:p>
@@ -723,35 +843,38 @@
         <w:t xml:space="preserve">2. </w:t>
       </w:r>
       <w:r>
-        <w:t xml:space="preserve"> Ensuring that high-demand wines are </w:t>
-      </w:r>
-      <w:r>
-        <w:t>always</w:t>
-      </w:r>
-      <w:r>
-        <w:t xml:space="preserve"> in stock - Prevents lost sales and </w:t>
+        <w:t xml:space="preserve"> Ensuring that </w:t>
+      </w:r>
+      <w:r>
+        <w:t>popular meals</w:t>
+      </w:r>
+      <w:r>
+        <w:t xml:space="preserve"> </w:t>
+      </w:r>
+      <w:r>
+        <w:t xml:space="preserve">are available - </w:t>
+      </w:r>
+      <w:r>
+        <w:t xml:space="preserve">Prevents lost sales and </w:t>
       </w:r>
       <w:r>
         <w:t>guarantees</w:t>
       </w:r>
       <w:r>
-        <w:t xml:space="preserve"> customer satisfaction and revenue increase. Research states </w:t>
-      </w:r>
-      <w:r>
-        <w:t xml:space="preserve">that </w:t>
-      </w:r>
-      <w:r>
-        <w:t>stock-outs cause potential sales losses of about 4</w:t>
-      </w:r>
-      <w:r>
-        <w:t>%</w:t>
-      </w:r>
-      <w:r>
-        <w:t xml:space="preserve"> .</w:t>
+        <w:t xml:space="preserve"> customer satisfaction and revenue increase.  </w:t>
+      </w:r>
+      <w:r>
+        <w:t xml:space="preserve">The </w:t>
+      </w:r>
+      <w:r>
+        <w:t>ready-meal</w:t>
+      </w:r>
+      <w:r>
+        <w:t xml:space="preserve"> market is expected to grow 5.1% annually from 2022 to 2030</w:t>
       </w:r>
       <w:sdt>
         <w:sdtPr>
-          <w:id w:val="-1984074643"/>
+          <w:id w:val="1334954975"/>
           <w:citation/>
         </w:sdtPr>
         <w:sdtContent>
@@ -759,7 +882,7 @@
             <w:fldChar w:fldCharType="begin"/>
           </w:r>
           <w:r>
-            <w:instrText xml:space="preserve">CITATION Cor08 \l 6153 </w:instrText>
+            <w:instrText xml:space="preserve"> CITATION Con20 \l 6153 </w:instrText>
           </w:r>
           <w:r>
             <w:fldChar w:fldCharType="separate"/>
@@ -768,27 +891,60 @@
             <w:rPr>
               <w:noProof/>
             </w:rPr>
-            <w:t xml:space="preserve"> (Corsten &amp; Gruen, 2004)</w:t>
+            <w:t xml:space="preserve"> </w:t>
+          </w:r>
+          <w:r>
+            <w:rPr>
+              <w:noProof/>
+            </w:rPr>
+            <w:t>(Consumer Goods, 2020)</w:t>
           </w:r>
           <w:r>
             <w:fldChar w:fldCharType="end"/>
           </w:r>
         </w:sdtContent>
       </w:sdt>
+      <w:r>
+        <w:t>. Ready meals</w:t>
+      </w:r>
+      <w:r>
+        <w:t xml:space="preserve"> are</w:t>
+      </w:r>
+      <w:r>
+        <w:t xml:space="preserve"> cost-effective and take less time to </w:t>
+      </w:r>
+      <w:r>
+        <w:t>prepare</w:t>
+      </w:r>
+      <w:r>
+        <w:t xml:space="preserve"> being </w:t>
+      </w:r>
+      <w:r>
+        <w:t xml:space="preserve">precooked for those who </w:t>
+      </w:r>
+      <w:r>
+        <w:t>have</w:t>
+      </w:r>
+      <w:r>
+        <w:t xml:space="preserve"> a busy lifestyle</w:t>
+      </w:r>
+      <w:r>
+        <w:t xml:space="preserve"> or own schedules.  </w:t>
+      </w:r>
+      <w:r>
+        <w:t xml:space="preserve"> </w:t>
+      </w:r>
     </w:p>
     <w:p>
       <w:pPr>
         <w:keepNext/>
       </w:pPr>
       <w:r>
-        <w:rPr>
-          <w:noProof/>
-        </w:rPr>
         <w:drawing>
-          <wp:inline distT="0" distB="0" distL="0" distR="0" wp14:anchorId="6DBC6DB7" wp14:editId="08C7DACB">
-            <wp:extent cx="3028980" cy="1562379"/>
+          <wp:inline distT="0" distB="0" distL="0" distR="0" wp14:anchorId="3D2392AA" wp14:editId="5547A9B8">
+            <wp:extent cx="2595721" cy="1927274"/>
             <wp:effectExtent l="0" t="0" r="0" b="0"/>
-            <wp:docPr id="1723657328" name="Picture 1" descr="A pie chart with text on it&#10;&#10;AI-generated content may be incorrect."/>
+            <wp:docPr id="1624292280" name="Picture 1" descr="A graph of a graph showing the price of a market&#10;&#10;AI-generated content may be incorrect."/>
             <wp:cNvGraphicFramePr>
               <a:graphicFrameLocks xmlns:a="http://schemas.openxmlformats.org/drawingml/2006/main" noChangeAspect="1"/>
             </wp:cNvGraphicFramePr>
@@ -796,7 +952,7 @@
               <a:graphicData uri="http://schemas.openxmlformats.org/drawingml/2006/picture">
                 <pic:pic xmlns:pic="http://schemas.openxmlformats.org/drawingml/2006/picture">
                   <pic:nvPicPr>
-                    <pic:cNvPr id="1723657328" name="Picture 1" descr="A pie chart with text on it&#10;&#10;AI-generated content may be incorrect."/>
+                    <pic:cNvPr id="1624292280" name="Picture 1" descr="A graph of a graph showing the price of a market&#10;&#10;AI-generated content may be incorrect."/>
                     <pic:cNvPicPr/>
                   </pic:nvPicPr>
                   <pic:blipFill>
@@ -808,7 +964,7 @@
                   <pic:spPr>
                     <a:xfrm>
                       <a:off x="0" y="0"/>
-                      <a:ext cx="3051682" cy="1574089"/>
+                      <a:ext cx="2607787" cy="1936233"/>
                     </a:xfrm>
                     <a:prstGeom prst="rect">
                       <a:avLst/>
@@ -823,33 +979,153 @@
     </w:p>
     <w:p>
       <w:pPr>
-        <w:pStyle w:val="Caption"/>
-      </w:pPr>
-      <w:r>
+        <w:rPr>
+          <w:sz w:val="16"/>
+          <w:szCs w:val="16"/>
+        </w:rPr>
+      </w:pPr>
+      <w:r>
+        <w:rPr>
+          <w:sz w:val="16"/>
+          <w:szCs w:val="16"/>
+        </w:rPr>
         <w:t xml:space="preserve">Figure </w:t>
       </w:r>
-      <w:fldSimple w:instr=" SEQ Figure \* ARABIC ">
-        <w:r>
-          <w:rPr>
-            <w:noProof/>
-          </w:rPr>
-          <w:t>1</w:t>
-        </w:r>
-      </w:fldSimple>
-      <w:r>
-        <w:t xml:space="preserve">: </w:t>
-      </w:r>
-      <w:r>
-        <w:t>Harvard Business School Publishing, 2004</w:t>
-      </w:r>
-    </w:p>
-    <w:p>
-      <w:r>
-        <w:t xml:space="preserve">Reducing excess inventory - Excess stock equates to unnecessary storage incurable costs. Data-based inventory control can minimize holding costs by almost 30% </w:t>
+      <w:r>
+        <w:rPr>
+          <w:sz w:val="16"/>
+          <w:szCs w:val="16"/>
+        </w:rPr>
+        <w:fldChar w:fldCharType="begin"/>
+      </w:r>
+      <w:r>
+        <w:rPr>
+          <w:sz w:val="16"/>
+          <w:szCs w:val="16"/>
+        </w:rPr>
+        <w:instrText xml:space="preserve"> SEQ Figure \* ARABIC </w:instrText>
+      </w:r>
+      <w:r>
+        <w:rPr>
+          <w:sz w:val="16"/>
+          <w:szCs w:val="16"/>
+        </w:rPr>
+        <w:fldChar w:fldCharType="separate"/>
+      </w:r>
+      <w:r>
+        <w:rPr>
+          <w:noProof/>
+          <w:sz w:val="16"/>
+          <w:szCs w:val="16"/>
+        </w:rPr>
+        <w:t>1</w:t>
+      </w:r>
+      <w:r>
+        <w:rPr>
+          <w:sz w:val="16"/>
+          <w:szCs w:val="16"/>
+        </w:rPr>
+        <w:fldChar w:fldCharType="end"/>
+      </w:r>
+      <w:r>
+        <w:rPr>
+          <w:sz w:val="16"/>
+          <w:szCs w:val="16"/>
+        </w:rPr>
+        <w:t>: Ready Meals Global Market Report 2025</w:t>
       </w:r>
       <w:sdt>
         <w:sdtPr>
-          <w:id w:val="1510332374"/>
+          <w:rPr>
+            <w:sz w:val="16"/>
+            <w:szCs w:val="16"/>
+          </w:rPr>
+          <w:id w:val="-2013756000"/>
+          <w:citation/>
+        </w:sdtPr>
+        <w:sdtContent>
+          <w:r>
+            <w:rPr>
+              <w:sz w:val="16"/>
+              <w:szCs w:val="16"/>
+            </w:rPr>
+            <w:fldChar w:fldCharType="begin"/>
+          </w:r>
+          <w:r>
+            <w:rPr>
+              <w:sz w:val="16"/>
+              <w:szCs w:val="16"/>
+            </w:rPr>
+            <w:instrText xml:space="preserve"> CITATION The25 \l 6153 </w:instrText>
+          </w:r>
+          <w:r>
+            <w:rPr>
+              <w:sz w:val="16"/>
+              <w:szCs w:val="16"/>
+            </w:rPr>
+            <w:fldChar w:fldCharType="separate"/>
+          </w:r>
+          <w:r>
+            <w:rPr>
+              <w:noProof/>
+              <w:sz w:val="16"/>
+              <w:szCs w:val="16"/>
+            </w:rPr>
+            <w:t xml:space="preserve"> (The Business Research Company, 2025)</w:t>
+          </w:r>
+          <w:r>
+            <w:rPr>
+              <w:sz w:val="16"/>
+              <w:szCs w:val="16"/>
+            </w:rPr>
+            <w:fldChar w:fldCharType="end"/>
+          </w:r>
+        </w:sdtContent>
+      </w:sdt>
+    </w:p>
+    <w:p>
+      <w:pPr>
+        <w:rPr>
+          <w:sz w:val="20"/>
+          <w:szCs w:val="20"/>
+        </w:rPr>
+      </w:pPr>
+      <w:r>
+        <w:t xml:space="preserve"> Demand trend forecasting </w:t>
+      </w:r>
+      <w:r>
+        <w:t>–</w:t>
+      </w:r>
+      <w:r>
+        <w:t xml:space="preserve"> </w:t>
+      </w:r>
+      <w:r>
+        <w:t>Seasonal demand will give timely stock replenishment</w:t>
+      </w:r>
+      <w:r>
+        <w:t xml:space="preserve">. </w:t>
+      </w:r>
+      <w:r>
+        <w:t xml:space="preserve">The </w:t>
+      </w:r>
+      <w:r>
+        <w:t>survey</w:t>
+      </w:r>
+      <w:r>
+        <w:t xml:space="preserve"> called </w:t>
+      </w:r>
+      <w:r>
+        <w:t>the A</w:t>
+      </w:r>
+      <w:r>
+        <w:t>tomic Survey</w:t>
+      </w:r>
+      <w:r>
+        <w:t xml:space="preserve"> </w:t>
+      </w:r>
+      <w:sdt>
+        <w:sdtPr>
+          <w:id w:val="-489405274"/>
           <w:citation/>
         </w:sdtPr>
         <w:sdtContent>
@@ -857,7 +1133,7 @@
             <w:fldChar w:fldCharType="begin"/>
           </w:r>
           <w:r>
-            <w:instrText xml:space="preserve">CITATION Joh24 \l 6153 </w:instrText>
+            <w:instrText xml:space="preserve"> CITATION For25 \l 6153 </w:instrText>
           </w:r>
           <w:r>
             <w:fldChar w:fldCharType="separate"/>
@@ -866,7 +1142,7 @@
             <w:rPr>
               <w:noProof/>
             </w:rPr>
-            <w:t>(Johnson &amp; Outcalt, 2024)</w:t>
+            <w:t>(Fortune Business Insights , 2025)</w:t>
           </w:r>
           <w:r>
             <w:fldChar w:fldCharType="end"/>
@@ -874,24 +1150,43 @@
         </w:sdtContent>
       </w:sdt>
       <w:r>
-        <w:t>.</w:t>
-      </w:r>
-    </w:p>
-    <w:p>
-      <w:r>
-        <w:t xml:space="preserve"> Demand trend forecasting - Anticipating seasonal demand peaks (like Christmas, </w:t>
-      </w:r>
-      <w:r>
-        <w:t xml:space="preserve">and </w:t>
-      </w:r>
-      <w:r>
-        <w:t xml:space="preserve">weekends) allows for timely stock replenishment. </w:t>
-      </w:r>
-      <w:r>
-        <w:t xml:space="preserve">The celebration surges with alcohol consumption. </w:t>
-      </w:r>
-      <w:r>
         <w:t xml:space="preserve"> </w:t>
+      </w:r>
+      <w:r>
+        <w:t xml:space="preserve">realised a study where </w:t>
+      </w:r>
+      <w:r>
+        <w:t>83</w:t>
+      </w:r>
+      <w:r>
+        <w:t xml:space="preserve">% of individuals consume </w:t>
+      </w:r>
+      <w:r>
+        <w:t>easily</w:t>
+      </w:r>
+      <w:r>
+        <w:t xml:space="preserve"> </w:t>
+      </w:r>
+      <w:r>
+        <w:t>prepared</w:t>
+      </w:r>
+      <w:r>
+        <w:t xml:space="preserve"> meals </w:t>
+      </w:r>
+      <w:r>
+        <w:t xml:space="preserve">as convenience along with easy </w:t>
+      </w:r>
+      <w:r>
+        <w:t>storage</w:t>
+      </w:r>
+      <w:r>
+        <w:t xml:space="preserve"> and </w:t>
+      </w:r>
+      <w:r>
+        <w:t>cost-effective</w:t>
+      </w:r>
+      <w:r>
+        <w:t xml:space="preserve">. </w:t>
       </w:r>
     </w:p>
     <w:p>
@@ -902,84 +1197,6 @@
           <w:szCs w:val="20"/>
         </w:rPr>
       </w:pPr>
-      <w:r>
-        <w:rPr>
-          <w:sz w:val="20"/>
-          <w:szCs w:val="20"/>
-        </w:rPr>
-        <w:t>“</w:t>
-      </w:r>
-      <w:r>
-        <w:rPr>
-          <w:sz w:val="20"/>
-          <w:szCs w:val="20"/>
-        </w:rPr>
-        <w:t>Mitchells said that sales growth was strong during the key festive days, with record sales on Christmas.</w:t>
-      </w:r>
-      <w:r>
-        <w:rPr>
-          <w:sz w:val="20"/>
-          <w:szCs w:val="20"/>
-        </w:rPr>
-        <w:t>”</w:t>
-      </w:r>
-    </w:p>
-    <w:p>
-      <w:pPr>
-        <w:jc w:val="right"/>
-        <w:rPr>
-          <w:sz w:val="20"/>
-          <w:szCs w:val="20"/>
-        </w:rPr>
-      </w:pPr>
-      <w:sdt>
-        <w:sdtPr>
-          <w:rPr>
-            <w:sz w:val="20"/>
-            <w:szCs w:val="20"/>
-          </w:rPr>
-          <w:id w:val="-488182411"/>
-          <w:citation/>
-        </w:sdtPr>
-        <w:sdtContent>
-          <w:r>
-            <w:rPr>
-              <w:sz w:val="20"/>
-              <w:szCs w:val="20"/>
-            </w:rPr>
-            <w:fldChar w:fldCharType="begin"/>
-          </w:r>
-          <w:r>
-            <w:rPr>
-              <w:sz w:val="20"/>
-              <w:szCs w:val="20"/>
-            </w:rPr>
-            <w:instrText xml:space="preserve"> CITATION Reu25 \l 6153 </w:instrText>
-          </w:r>
-          <w:r>
-            <w:rPr>
-              <w:sz w:val="20"/>
-              <w:szCs w:val="20"/>
-            </w:rPr>
-            <w:fldChar w:fldCharType="separate"/>
-          </w:r>
-          <w:r>
-            <w:rPr>
-              <w:noProof/>
-              <w:sz w:val="20"/>
-              <w:szCs w:val="20"/>
-            </w:rPr>
-            <w:t>(Reuters, 2025)</w:t>
-          </w:r>
-          <w:r>
-            <w:rPr>
-              <w:sz w:val="20"/>
-              <w:szCs w:val="20"/>
-            </w:rPr>
-            <w:fldChar w:fldCharType="end"/>
-          </w:r>
-        </w:sdtContent>
-      </w:sdt>
     </w:p>
     <w:p>
       <w:r>
@@ -989,7 +1206,11 @@
         <w:t>20% more</w:t>
       </w:r>
       <w:r>
-        <w:t xml:space="preserve"> efficiently</w:t>
+        <w:t xml:space="preserve"> </w:t>
+      </w:r>
+      <w:r>
+        <w:lastRenderedPageBreak/>
+        <w:t>efficiently</w:t>
       </w:r>
       <w:r>
         <w:t xml:space="preserve"> and a 15% reduction in operational costs, making companies more proactive with informed decisions. </w:t>
@@ -1026,7 +1247,6 @@
     </w:p>
     <w:p>
       <w:r>
-        <w:lastRenderedPageBreak/>
         <w:t>Commercial Relevance:</w:t>
       </w:r>
     </w:p>
@@ -1036,7 +1256,13 @@
       </w:r>
       <w:r>
         <w:tab/>
-        <w:t>Who will use the system? Store managers, buyers, and suppliers.</w:t>
+        <w:t>Who will use the system? Store managers</w:t>
+      </w:r>
+      <w:r>
+        <w:t xml:space="preserve"> for informed decisions about stock levels and orders</w:t>
+      </w:r>
+      <w:r>
+        <w:t>.</w:t>
       </w:r>
     </w:p>
     <w:p>
@@ -1065,7 +1291,19 @@
       </w:r>
       <w:r>
         <w:tab/>
-        <w:t>An extremely strong demand for premium wines.</w:t>
+        <w:t xml:space="preserve">An extremely strong demand for </w:t>
+      </w:r>
+      <w:r>
+        <w:t xml:space="preserve">the </w:t>
+      </w:r>
+      <w:r>
+        <w:t>best ready meals</w:t>
+      </w:r>
+      <w:r>
+        <w:t xml:space="preserve"> as a preference for convenience and quality of products</w:t>
+      </w:r>
+      <w:r>
+        <w:t>.</w:t>
       </w:r>
     </w:p>
     <w:p>
@@ -1074,7 +1312,12 @@
       </w:r>
       <w:r>
         <w:tab/>
-        <w:t>Good relationships with suppliers.</w:t>
+      </w:r>
+      <w:r>
+        <w:t>Ensuring consistent availability from suppliers</w:t>
+      </w:r>
+      <w:r>
+        <w:t>.</w:t>
       </w:r>
     </w:p>
     <w:p>
@@ -1083,7 +1326,12 @@
       </w:r>
       <w:r>
         <w:tab/>
-        <w:t>Brand well-established in Dublin.</w:t>
+      </w:r>
+      <w:r>
+        <w:t>Attracting loyal customers who will trust the quality of Lotts and Co. products</w:t>
+      </w:r>
+      <w:r>
+        <w:t>.</w:t>
       </w:r>
     </w:p>
     <w:p>
@@ -1097,7 +1345,19 @@
       </w:r>
       <w:r>
         <w:tab/>
-        <w:t xml:space="preserve">Frequent unavailability for high-demand wines. </w:t>
+        <w:t xml:space="preserve">Frequent unavailability </w:t>
+      </w:r>
+      <w:r>
+        <w:t xml:space="preserve">of popular ready meals </w:t>
+      </w:r>
+      <w:r>
+        <w:t>which</w:t>
+      </w:r>
+      <w:r>
+        <w:t xml:space="preserve"> causes lost sales</w:t>
+      </w:r>
+      <w:r>
+        <w:t xml:space="preserve">. </w:t>
       </w:r>
     </w:p>
     <w:p>
@@ -1106,7 +1366,12 @@
       </w:r>
       <w:r>
         <w:tab/>
-        <w:t xml:space="preserve">Too much inventory of slow-moving wines wastes space and capital. </w:t>
+      </w:r>
+      <w:r>
+        <w:t>Slow-moving meals cause overstock which results in waste and storage costs</w:t>
+      </w:r>
+      <w:r>
+        <w:t xml:space="preserve">. </w:t>
       </w:r>
     </w:p>
     <w:p>
@@ -1120,7 +1385,19 @@
       </w:r>
       <w:r>
         <w:tab/>
-        <w:t>Data analytics can be used to manage stock levels.</w:t>
+        <w:t xml:space="preserve">Data analytics can be used to </w:t>
+      </w:r>
+      <w:r>
+        <w:t xml:space="preserve">ensure the right </w:t>
+      </w:r>
+      <w:r>
+        <w:t>m</w:t>
+      </w:r>
+      <w:r>
+        <w:t>eals are in stock</w:t>
+      </w:r>
+      <w:r>
+        <w:t>.</w:t>
       </w:r>
     </w:p>
     <w:p>
@@ -1129,7 +1406,12 @@
       </w:r>
       <w:r>
         <w:tab/>
-        <w:t xml:space="preserve">The reordering system may get automated. </w:t>
+      </w:r>
+      <w:r>
+        <w:t xml:space="preserve">Real-time sales to align stock </w:t>
+      </w:r>
+      <w:r>
+        <w:t xml:space="preserve"> </w:t>
       </w:r>
     </w:p>
     <w:p>
@@ -1138,7 +1420,24 @@
       </w:r>
       <w:r>
         <w:tab/>
-        <w:t xml:space="preserve">Supplier coordination can improve through real-time data. </w:t>
+      </w:r>
+      <w:r>
+        <w:t xml:space="preserve">Expand variety – introducing new </w:t>
+      </w:r>
+      <w:r>
+        <w:t>meal</w:t>
+      </w:r>
+      <w:r>
+        <w:t xml:space="preserve"> options based on </w:t>
+      </w:r>
+      <w:r>
+        <w:t>customers</w:t>
+      </w:r>
+      <w:r>
+        <w:t xml:space="preserve"> preferences </w:t>
+      </w:r>
+      <w:r>
+        <w:t xml:space="preserve"> </w:t>
       </w:r>
     </w:p>
     <w:p>
@@ -1176,7 +1475,19 @@
       </w:r>
       <w:r>
         <w:tab/>
-        <w:t>Regular fluctuations lead to unpredictable demand.</w:t>
+        <w:t xml:space="preserve">Regular fluctuations </w:t>
+      </w:r>
+      <w:r>
+        <w:t>a</w:t>
+      </w:r>
+      <w:r>
+        <w:t>s</w:t>
+      </w:r>
+      <w:r>
+        <w:t xml:space="preserve"> </w:t>
+      </w:r>
+      <w:r>
+        <w:t xml:space="preserve">seasonal trends, dietary and economic conditions. </w:t>
       </w:r>
     </w:p>
     <w:p>
@@ -1266,7 +1577,6 @@
     </w:p>
     <w:p>
       <w:r>
-        <w:lastRenderedPageBreak/>
         <w:t xml:space="preserve"> </w:t>
       </w:r>
       <w:r>
@@ -1739,6 +2049,7 @@
         </w:numPr>
       </w:pPr>
       <w:r>
+        <w:lastRenderedPageBreak/>
         <w:t xml:space="preserve">Safety Stock:  </w:t>
       </w:r>
       <w:r>
@@ -1782,55 +2093,403 @@
         </w:numPr>
       </w:pPr>
       <w:r>
+        <w:t xml:space="preserve">Safety Stock:  </w:t>
+      </w:r>
+      <w:r>
+        <w:t xml:space="preserve">Reorder when </w:t>
+      </w:r>
+      <w:r>
+        <w:t xml:space="preserve">the </w:t>
+      </w:r>
+      <w:r>
+        <w:t>stock reaches 12 bottles to receive delivery on Tuesday.</w:t>
+      </w:r>
+    </w:p>
+    <w:p>
+      <w:pPr>
+        <w:ind w:firstLine="360"/>
+      </w:pPr>
+      <w:r>
+        <w:t xml:space="preserve">Overall, this procedure appears to ensure that </w:t>
+      </w:r>
+      <w:r>
+        <w:t xml:space="preserve">the stock </w:t>
+      </w:r>
+      <w:r>
+        <w:t xml:space="preserve">is replenished </w:t>
+      </w:r>
+      <w:r>
+        <w:t>in time</w:t>
+      </w:r>
+      <w:r>
+        <w:t xml:space="preserve"> </w:t>
+      </w:r>
+      <w:r>
+        <w:t>preventing shortage</w:t>
+      </w:r>
+      <w:r>
+        <w:t xml:space="preserve">, while also minimizing </w:t>
+      </w:r>
+      <w:r>
+        <w:t>excess</w:t>
+      </w:r>
+      <w:r>
+        <w:t xml:space="preserve"> inventory.</w:t>
+      </w:r>
+    </w:p>
+    <w:p>
+      <w:pPr>
+        <w:ind w:firstLine="360"/>
+      </w:pPr>
+    </w:p>
+    <w:p>
+      <w:pPr>
+        <w:ind w:firstLine="360"/>
+      </w:pPr>
+      <w:r>
+        <w:t>7. Legal &amp; Ethical Considerations</w:t>
+      </w:r>
+    </w:p>
+    <w:p>
+      <w:pPr>
+        <w:ind w:firstLine="360"/>
+      </w:pPr>
+      <w:r>
+        <w:rPr>
+          <w:rFonts w:ascii="Segoe UI Emoji" w:hAnsi="Segoe UI Emoji" w:cs="Segoe UI Emoji"/>
+        </w:rPr>
+        <w:t>✅</w:t>
+      </w:r>
+      <w:r>
+        <w:t xml:space="preserve"> No Personal Data Used: Only product sales data </w:t>
+      </w:r>
+      <w:proofErr w:type="spellStart"/>
+      <w:r>
+        <w:t>analyzed</w:t>
+      </w:r>
+      <w:proofErr w:type="spellEnd"/>
+      <w:r>
+        <w:t>, ensuring GDPR compliance.</w:t>
+      </w:r>
+    </w:p>
+    <w:p>
+      <w:pPr>
+        <w:ind w:firstLine="360"/>
+      </w:pPr>
+      <w:r>
+        <w:rPr>
+          <w:rFonts w:ascii="Segoe UI Emoji" w:hAnsi="Segoe UI Emoji" w:cs="Segoe UI Emoji"/>
+        </w:rPr>
+        <w:t>✅</w:t>
+      </w:r>
+      <w:r>
+        <w:t xml:space="preserve"> Ethical Data Use: Insights focus on stock trends, not individual customer </w:t>
+      </w:r>
+      <w:proofErr w:type="spellStart"/>
+      <w:r>
+        <w:t>behaviors</w:t>
+      </w:r>
+      <w:proofErr w:type="spellEnd"/>
+      <w:r>
+        <w:t>.</w:t>
+      </w:r>
+    </w:p>
+    <w:p>
+      <w:pPr>
+        <w:ind w:firstLine="360"/>
+      </w:pPr>
+      <w:r>
+        <w:rPr>
+          <w:rFonts w:ascii="Segoe UI Emoji" w:hAnsi="Segoe UI Emoji" w:cs="Segoe UI Emoji"/>
+        </w:rPr>
+        <w:t>✅</w:t>
+      </w:r>
+      <w:r>
+        <w:t xml:space="preserve"> Accuracy &amp; Transparency: Data should be verified for accuracy before making business decisions.</w:t>
+      </w:r>
+    </w:p>
+    <w:p>
+      <w:pPr>
+        <w:ind w:firstLine="360"/>
+      </w:pPr>
+      <w:r>
+        <w:t>8. Competitive Advantage for Lotts &amp; Co.</w:t>
+      </w:r>
+    </w:p>
+    <w:p>
+      <w:pPr>
+        <w:ind w:firstLine="360"/>
+      </w:pPr>
+      <w:r>
+        <w:rPr>
+          <w:rFonts w:ascii="Segoe UI Emoji" w:hAnsi="Segoe UI Emoji" w:cs="Segoe UI Emoji"/>
+        </w:rPr>
+        <w:t>📌</w:t>
+      </w:r>
+      <w:r>
+        <w:t xml:space="preserve"> How This Project Helps Lotts &amp; Co. Compete Better: </w:t>
+      </w:r>
+      <w:r>
+        <w:rPr>
+          <w:rFonts w:ascii="Segoe UI Emoji" w:hAnsi="Segoe UI Emoji" w:cs="Segoe UI Emoji"/>
+        </w:rPr>
+        <w:t>✅</w:t>
+      </w:r>
+      <w:r>
+        <w:t xml:space="preserve"> Reduces Stockouts </w:t>
+      </w:r>
+      <w:r>
+        <w:rPr>
+          <w:rFonts w:ascii="Aptos" w:hAnsi="Aptos" w:cs="Aptos"/>
+        </w:rPr>
+        <w:t>→</w:t>
+      </w:r>
+      <w:r>
+        <w:t xml:space="preserve"> Ensures best-selling wines are always available. </w:t>
+      </w:r>
+      <w:r>
+        <w:rPr>
+          <w:rFonts w:ascii="Segoe UI Emoji" w:hAnsi="Segoe UI Emoji" w:cs="Segoe UI Emoji"/>
+        </w:rPr>
+        <w:t>✅</w:t>
+      </w:r>
+      <w:r>
+        <w:t xml:space="preserve"> Data-Driven Ordering </w:t>
+      </w:r>
+      <w:r>
+        <w:rPr>
+          <w:rFonts w:ascii="Aptos" w:hAnsi="Aptos" w:cs="Aptos"/>
+        </w:rPr>
+        <w:t>→</w:t>
+      </w:r>
+      <w:r>
+        <w:t xml:space="preserve"> Avoids overstocking &amp; ties up less capital. </w:t>
+      </w:r>
+      <w:r>
+        <w:rPr>
+          <w:rFonts w:ascii="Segoe UI Emoji" w:hAnsi="Segoe UI Emoji" w:cs="Segoe UI Emoji"/>
+        </w:rPr>
+        <w:t>✅</w:t>
+      </w:r>
+      <w:r>
+        <w:t xml:space="preserve"> Improved Supplier Coordination </w:t>
+      </w:r>
+      <w:r>
+        <w:rPr>
+          <w:rFonts w:ascii="Aptos" w:hAnsi="Aptos" w:cs="Aptos"/>
+        </w:rPr>
+        <w:t>→</w:t>
+      </w:r>
+      <w:r>
+        <w:t xml:space="preserve"> Orders based on real sales data, not guesswork. </w:t>
+      </w:r>
+      <w:r>
+        <w:rPr>
+          <w:rFonts w:ascii="Segoe UI Emoji" w:hAnsi="Segoe UI Emoji" w:cs="Segoe UI Emoji"/>
+        </w:rPr>
+        <w:t>✅</w:t>
+      </w:r>
+      <w:r>
+        <w:t xml:space="preserve"> Supports Future Growth </w:t>
+      </w:r>
+      <w:r>
+        <w:rPr>
+          <w:rFonts w:ascii="Aptos" w:hAnsi="Aptos" w:cs="Aptos"/>
+        </w:rPr>
+        <w:t>→</w:t>
+      </w:r>
+      <w:r>
+        <w:t xml:space="preserve"> Can scale with other product categories (cheese, bread, deli).</w:t>
+      </w:r>
+    </w:p>
+    <w:p>
+      <w:pPr>
+        <w:ind w:firstLine="360"/>
+      </w:pPr>
+      <w:r>
+        <w:t>9. Conclusion &amp; Recommendations</w:t>
+      </w:r>
+    </w:p>
+    <w:p>
+      <w:pPr>
+        <w:ind w:firstLine="360"/>
+      </w:pPr>
+      <w:r>
+        <w:rPr>
+          <w:rFonts w:ascii="Segoe UI Emoji" w:hAnsi="Segoe UI Emoji" w:cs="Segoe UI Emoji"/>
+        </w:rPr>
+        <w:t>📌</w:t>
+      </w:r>
+      <w:r>
+        <w:t xml:space="preserve"> Key Takeaways:</w:t>
+      </w:r>
+    </w:p>
+    <w:p>
+      <w:pPr>
+        <w:ind w:firstLine="360"/>
+      </w:pPr>
+      <w:r>
+        <w:t>•</w:t>
+      </w:r>
+      <w:r>
+        <w:tab/>
+        <w:t>Wine stockouts are a recurring issue.</w:t>
+      </w:r>
+    </w:p>
+    <w:p>
+      <w:pPr>
+        <w:ind w:firstLine="360"/>
+      </w:pPr>
+      <w:r>
+        <w:t>•</w:t>
+      </w:r>
+      <w:r>
+        <w:tab/>
+        <w:t>Data analytics helps predict demand &amp; optimize orders.</w:t>
+      </w:r>
+    </w:p>
+    <w:p>
+      <w:pPr>
+        <w:ind w:firstLine="360"/>
+      </w:pPr>
+      <w:r>
+        <w:t>•</w:t>
+      </w:r>
+      <w:r>
+        <w:tab/>
+        <w:t>Automating inventory insights will improve efficiency.</w:t>
+      </w:r>
+    </w:p>
+    <w:p>
+      <w:pPr>
+        <w:ind w:firstLine="360"/>
+      </w:pPr>
+      <w:r>
+        <w:rPr>
+          <w:rFonts w:ascii="Segoe UI Emoji" w:hAnsi="Segoe UI Emoji" w:cs="Segoe UI Emoji"/>
+        </w:rPr>
+        <w:t>📌</w:t>
+      </w:r>
+      <w:r>
+        <w:t xml:space="preserve"> Next Steps for Lotts &amp; Co.:</w:t>
+      </w:r>
+    </w:p>
+    <w:p>
+      <w:pPr>
+        <w:ind w:firstLine="360"/>
+      </w:pPr>
+      <w:r>
+        <w:t>•</w:t>
+      </w:r>
+      <w:r>
+        <w:tab/>
+        <w:t>Implement Power BI dashboards for real-time stock tracking.</w:t>
+      </w:r>
+    </w:p>
+    <w:p>
+      <w:pPr>
+        <w:ind w:firstLine="360"/>
+      </w:pPr>
+      <w:r>
+        <w:t>•</w:t>
+      </w:r>
+      <w:r>
+        <w:tab/>
+        <w:t>Introduce automated reorder points based on sales trends.</w:t>
+      </w:r>
+    </w:p>
+    <w:p>
+      <w:pPr>
+        <w:ind w:firstLine="360"/>
+      </w:pPr>
+      <w:r>
+        <w:t>•</w:t>
+      </w:r>
+      <w:r>
+        <w:tab/>
+        <w:t>Expand the model to other categories (cheese, bread, deli).</w:t>
+      </w:r>
+    </w:p>
+    <w:p>
+      <w:pPr>
+        <w:ind w:firstLine="360"/>
+      </w:pPr>
+      <w:r>
+        <w:rPr>
+          <w:rFonts w:ascii="Segoe UI Emoji" w:hAnsi="Segoe UI Emoji" w:cs="Segoe UI Emoji"/>
+        </w:rPr>
+        <w:t>🚀</w:t>
+      </w:r>
+      <w:r>
+        <w:t xml:space="preserve"> Final Thought: Data-driven inventory management will reduce losses and increase efficiency at Lotts &amp; Co.</w:t>
+      </w:r>
+    </w:p>
+    <w:p>
+      <w:pPr>
+        <w:ind w:firstLine="360"/>
+      </w:pPr>
+      <w:r>
+        <w:t>7.</w:t>
+      </w:r>
+      <w:r>
+        <w:tab/>
+        <w:t>Legal &amp; Ethical Considerations</w:t>
+      </w:r>
+    </w:p>
+    <w:p>
+      <w:pPr>
+        <w:ind w:firstLine="360"/>
+      </w:pPr>
+      <w:r>
+        <w:t>8.</w:t>
+      </w:r>
+      <w:r>
+        <w:tab/>
+        <w:t>Competitive Advantage for Lotts &amp; Co.</w:t>
+      </w:r>
+    </w:p>
+    <w:p>
+      <w:pPr>
+        <w:ind w:firstLine="360"/>
+      </w:pPr>
+      <w:r>
+        <w:t>9.</w:t>
+      </w:r>
+      <w:r>
+        <w:tab/>
+        <w:t>Conclusion &amp; Recommendations</w:t>
+      </w:r>
+    </w:p>
+    <w:p/>
+    <w:p>
+      <w:r>
+        <w:br w:type="page"/>
+      </w:r>
+      <w:r>
         <w:lastRenderedPageBreak/>
-        <w:t xml:space="preserve">Safety Stock:  </w:t>
-      </w:r>
-      <w:r>
-        <w:t xml:space="preserve">Reorder when </w:t>
-      </w:r>
-      <w:r>
-        <w:t xml:space="preserve">the </w:t>
-      </w:r>
-      <w:r>
-        <w:t>stock reaches 12 bottles to receive delivery on Tuesday.</w:t>
-      </w:r>
-    </w:p>
-    <w:p>
-      <w:pPr>
-        <w:ind w:firstLine="360"/>
-      </w:pPr>
-      <w:r>
-        <w:t xml:space="preserve">Overall, this procedure appears to ensure that </w:t>
-      </w:r>
-      <w:r>
-        <w:t xml:space="preserve">the stock </w:t>
-      </w:r>
-      <w:r>
-        <w:t xml:space="preserve">is replenished </w:t>
-      </w:r>
-      <w:r>
-        <w:t>in time</w:t>
+        <w:t xml:space="preserve">Read meal </w:t>
+      </w:r>
+      <w:r>
+        <w:t>sandwich</w:t>
       </w:r>
       <w:r>
         <w:t xml:space="preserve"> </w:t>
       </w:r>
-      <w:r>
-        <w:t>preventing shortage</w:t>
-      </w:r>
-      <w:r>
-        <w:t xml:space="preserve"> shortage, while also minimizing </w:t>
-      </w:r>
-      <w:r>
-        <w:t>excess</w:t>
-      </w:r>
-      <w:r>
-        <w:t xml:space="preserve"> inventory.</w:t>
+    </w:p>
+    <w:p>
+      <w:r>
+        <w:t>kevin@lottsandco.ie</w:t>
       </w:r>
     </w:p>
     <w:p/>
     <w:p>
       <w:r>
-        <w:br w:type="page"/>
+        <w:t>Point of sale</w:t>
+      </w:r>
+    </w:p>
+    <w:p>
+      <w:r>
+        <w:t xml:space="preserve">Reduced price </w:t>
       </w:r>
     </w:p>
     <w:sdt>
@@ -1865,7 +2524,6 @@
             <w:p>
               <w:pPr>
                 <w:pStyle w:val="Bibliography"/>
-                <w:ind w:left="720" w:hanging="720"/>
                 <w:rPr>
                   <w:noProof/>
                   <w:kern w:val="0"/>
@@ -1887,27 +2545,12 @@
                 <w:rPr>
                   <w:noProof/>
                 </w:rPr>
-                <w:t xml:space="preserve">Corsten, D., &amp; Gruen, T. (2004, 05 01). </w:t>
-              </w:r>
-              <w:r>
-                <w:rPr>
-                  <w:i/>
-                  <w:iCs/>
-                  <w:noProof/>
-                </w:rPr>
-                <w:t>Harvard Business Review</w:t>
-              </w:r>
-              <w:r>
-                <w:rPr>
-                  <w:noProof/>
-                </w:rPr>
-                <w:t>. Retrieved 02 25, 2025, from Stock-Outs Cause Walkouts: https://hbr.org/2004/05/stock-outs-cause-walkouts</w:t>
+                <w:t>Anon., n.d. [Online].</w:t>
               </w:r>
             </w:p>
             <w:p>
               <w:pPr>
                 <w:pStyle w:val="Bibliography"/>
-                <w:ind w:left="720" w:hanging="720"/>
                 <w:rPr>
                   <w:noProof/>
                 </w:rPr>
@@ -1916,7 +2559,7 @@
                 <w:rPr>
                   <w:noProof/>
                 </w:rPr>
-                <w:t xml:space="preserve">Johnson, P. M., &amp; Outcalt, R. F. (2024). </w:t>
+                <w:t xml:space="preserve">Corsten, D. &amp; Gruen, T., 2004. </w:t>
               </w:r>
               <w:r>
                 <w:rPr>
@@ -1924,19 +2567,39 @@
                   <w:iCs/>
                   <w:noProof/>
                 </w:rPr>
-                <w:t>The Retail owners institute</w:t>
+                <w:t xml:space="preserve">Harvard Business Review. </w:t>
               </w:r>
               <w:r>
                 <w:rPr>
                   <w:noProof/>
                 </w:rPr>
-                <w:t>. Retrieved 02 25, 2025, from Why and How to Reduce the High Cost of Too Much Inventory: https://retailowner.com/Five-Steps-To-Financial-Strength/What-Do-I-Work-On-First/Inventory/Costs-of-Excess-Inventory?utm_source=chatgpt.com</w:t>
+                <w:t xml:space="preserve">[Online] </w:t>
+              </w:r>
+              <w:r>
+                <w:rPr>
+                  <w:noProof/>
+                </w:rPr>
+                <w:br/>
+                <w:t xml:space="preserve">Available at: </w:t>
+              </w:r>
+              <w:r>
+                <w:rPr>
+                  <w:noProof/>
+                  <w:u w:val="single"/>
+                </w:rPr>
+                <w:t>https://hbr.org/2004/05/stock-outs-cause-walkouts</w:t>
+              </w:r>
+              <w:r>
+                <w:rPr>
+                  <w:noProof/>
+                </w:rPr>
+                <w:br/>
+                <w:t>[Accessed 25 02 2025].</w:t>
               </w:r>
             </w:p>
             <w:p>
               <w:pPr>
                 <w:pStyle w:val="Bibliography"/>
-                <w:ind w:left="720" w:hanging="720"/>
                 <w:rPr>
                   <w:noProof/>
                 </w:rPr>
@@ -1945,7 +2608,7 @@
                 <w:rPr>
                   <w:noProof/>
                 </w:rPr>
-                <w:t xml:space="preserve">North Bay Distribution. (2024, 08 29). </w:t>
+                <w:t xml:space="preserve">North Bay Distribution, 2024. </w:t>
               </w:r>
               <w:r>
                 <w:rPr>
@@ -1953,19 +2616,39 @@
                   <w:iCs/>
                   <w:noProof/>
                 </w:rPr>
-                <w:t>North Bay Distribution INC</w:t>
+                <w:t xml:space="preserve">North Bay Distribution INC. </w:t>
               </w:r>
               <w:r>
                 <w:rPr>
                   <w:noProof/>
                 </w:rPr>
-                <w:t>. Retrieved 02 25, 2025, from Realizing Supply Chain Efficiency with Advanced Analytics: https://nbd3pl.com/fulfillment/realizing-supply-chain-efficiency-with-advanced-analytics/?utm_source=chatgpt.com</w:t>
+                <w:t xml:space="preserve">[Online] </w:t>
+              </w:r>
+              <w:r>
+                <w:rPr>
+                  <w:noProof/>
+                </w:rPr>
+                <w:br/>
+                <w:t xml:space="preserve">Available at: </w:t>
+              </w:r>
+              <w:r>
+                <w:rPr>
+                  <w:noProof/>
+                  <w:u w:val="single"/>
+                </w:rPr>
+                <w:t>https://nbd3pl.com/fulfillment/realizing-supply-chain-efficiency-with-advanced-analytics/?utm_source=chatgpt.com</w:t>
+              </w:r>
+              <w:r>
+                <w:rPr>
+                  <w:noProof/>
+                </w:rPr>
+                <w:br/>
+                <w:t>[Accessed 25 02 2025].</w:t>
               </w:r>
             </w:p>
             <w:p>
               <w:pPr>
                 <w:pStyle w:val="Bibliography"/>
-                <w:ind w:left="720" w:hanging="720"/>
                 <w:rPr>
                   <w:noProof/>
                 </w:rPr>
@@ -1974,7 +2657,7 @@
                 <w:rPr>
                   <w:noProof/>
                 </w:rPr>
-                <w:t xml:space="preserve">Reuters. (2025, 01 15). </w:t>
+                <w:t xml:space="preserve">Reuters, 2025. </w:t>
               </w:r>
               <w:r>
                 <w:rPr>
@@ -1982,19 +2665,39 @@
                   <w:iCs/>
                   <w:noProof/>
                 </w:rPr>
-                <w:t>Reuters</w:t>
+                <w:t xml:space="preserve">Reuters. </w:t>
               </w:r>
               <w:r>
                 <w:rPr>
                   <w:noProof/>
                 </w:rPr>
-                <w:t>. Retrieved 02 25, 2025, from UK's Mitchells &amp; Butlers posts higher sales during festive season: https://www.reuters.com/markets/europe/uks-mitchells-butlers-posts-higher-sales-during-festive-season-2025-01-15/?utm_source=chatgpt.com</w:t>
+                <w:t xml:space="preserve">[Online] </w:t>
+              </w:r>
+              <w:r>
+                <w:rPr>
+                  <w:noProof/>
+                </w:rPr>
+                <w:br/>
+                <w:t xml:space="preserve">Available at: </w:t>
+              </w:r>
+              <w:r>
+                <w:rPr>
+                  <w:noProof/>
+                  <w:u w:val="single"/>
+                </w:rPr>
+                <w:t>https://www.reuters.com/markets/europe/uks-mitchells-butlers-posts-higher-sales-during-festive-season-2025-01-15/?utm_source=chatgpt.com</w:t>
+              </w:r>
+              <w:r>
+                <w:rPr>
+                  <w:noProof/>
+                </w:rPr>
+                <w:br/>
+                <w:t>[Accessed 25 02 2025].</w:t>
               </w:r>
             </w:p>
             <w:p>
               <w:pPr>
                 <w:pStyle w:val="Bibliography"/>
-                <w:ind w:left="720" w:hanging="720"/>
                 <w:rPr>
                   <w:noProof/>
                 </w:rPr>
@@ -2003,7 +2706,7 @@
                 <w:rPr>
                   <w:noProof/>
                 </w:rPr>
-                <w:t xml:space="preserve">Turovski, M. (2023, 01 24). </w:t>
+                <w:t xml:space="preserve">Turovski, M., 2023. </w:t>
               </w:r>
               <w:r>
                 <w:rPr>
@@ -2011,13 +2714,34 @@
                   <w:iCs/>
                   <w:noProof/>
                 </w:rPr>
-                <w:t>MRPeasy</w:t>
+                <w:t xml:space="preserve">MRPeasy. </w:t>
               </w:r>
               <w:r>
                 <w:rPr>
                   <w:noProof/>
                 </w:rPr>
-                <w:t>. Retrieved 02 26, 2025, from What is Reorder Point and Reorder Point Formula?: https://www.mrpeasy.com/blog/what-is-reorder-point-and-reorder-point-formula/#:~:text=The%20reorder%20point%20formula%20is,rate)%20%2B%20safety%20stock%20level.</w:t>
+                <w:t xml:space="preserve">[Online] </w:t>
+              </w:r>
+              <w:r>
+                <w:rPr>
+                  <w:noProof/>
+                </w:rPr>
+                <w:br/>
+                <w:t xml:space="preserve">Available at: </w:t>
+              </w:r>
+              <w:r>
+                <w:rPr>
+                  <w:noProof/>
+                  <w:u w:val="single"/>
+                </w:rPr>
+                <w:t>https://www.mrpeasy.com/blog/what-is-reorder-point-and-reorder-point-formula/#:~:text=The%20reorder%20point%20formula%20is,rate)%20%2B%20safety%20stock%20level.</w:t>
+              </w:r>
+              <w:r>
+                <w:rPr>
+                  <w:noProof/>
+                </w:rPr>
+                <w:br/>
+                <w:t>[Accessed 26 02 2025].</w:t>
               </w:r>
             </w:p>
             <w:p>
@@ -5873,7 +6597,7 @@
 </file>
 
 <file path=customXml/item1.xml><?xml version="1.0" encoding="utf-8"?>
-<b:Sources xmlns:b="http://schemas.openxmlformats.org/officeDocument/2006/bibliography" xmlns="http://schemas.openxmlformats.org/officeDocument/2006/bibliography" SelectedStyle="\APASixthEditionOfficeOnline.xsl" StyleName="APA" Version="6">
+<b:Sources xmlns:b="http://schemas.openxmlformats.org/officeDocument/2006/bibliography" xmlns="http://schemas.openxmlformats.org/officeDocument/2006/bibliography" SelectedStyle="\HarvardAnglia2008OfficeOnline.xsl" StyleName="Harvard - Anglia" Version="2008">
   <b:Source>
     <b:Tag>Cor08</b:Tag>
     <b:SourceType>InternetSite</b:SourceType>
@@ -5901,7 +6625,7 @@
     <b:YearAccessed>2025</b:YearAccessed>
     <b:MonthAccessed>02</b:MonthAccessed>
     <b:DayAccessed>25</b:DayAccessed>
-    <b:RefOrder>1</b:RefOrder>
+    <b:RefOrder>6</b:RefOrder>
   </b:Source>
   <b:Source>
     <b:Tag>Reu25</b:Tag>
@@ -5921,36 +6645,7 @@
     <b:YearAccessed>2025</b:YearAccessed>
     <b:MonthAccessed>02</b:MonthAccessed>
     <b:DayAccessed>25</b:DayAccessed>
-    <b:RefOrder>3</b:RefOrder>
-  </b:Source>
-  <b:Source>
-    <b:Tag>Joh24</b:Tag>
-    <b:SourceType>InternetSite</b:SourceType>
-    <b:Guid>{C6B802E6-B3DD-4502-832F-27620662E5C1}</b:Guid>
-    <b:Author>
-      <b:Author>
-        <b:NameList>
-          <b:Person>
-            <b:Last>Johnson</b:Last>
-            <b:First>Patricia</b:First>
-            <b:Middle>M.</b:Middle>
-          </b:Person>
-          <b:Person>
-            <b:Last>Outcalt</b:Last>
-            <b:First>Richard</b:First>
-            <b:Middle>F.</b:Middle>
-          </b:Person>
-        </b:NameList>
-      </b:Author>
-    </b:Author>
-    <b:Title>The Retail owners institute</b:Title>
-    <b:InternetSiteTitle>Why and How to Reduce the High Cost of Too Much Inventory</b:InternetSiteTitle>
-    <b:Year>2024</b:Year>
-    <b:YearAccessed>2025</b:YearAccessed>
-    <b:MonthAccessed>02</b:MonthAccessed>
-    <b:DayAccessed>25</b:DayAccessed>
-    <b:URL>https://retailowner.com/Five-Steps-To-Financial-Strength/What-Do-I-Work-On-First/Inventory/Costs-of-Excess-Inventory?utm_source=chatgpt.com</b:URL>
-    <b:RefOrder>2</b:RefOrder>
+    <b:RefOrder>7</b:RefOrder>
   </b:Source>
   <b:Source>
     <b:Tag>Nor24</b:Tag>
@@ -5997,11 +6692,68 @@
     <b:DayAccessed>26</b:DayAccessed>
     <b:RefOrder>5</b:RefOrder>
   </b:Source>
+  <b:Source>
+    <b:Tag>Joh24</b:Tag>
+    <b:SourceType>InternetSite</b:SourceType>
+    <b:Guid>{940D0A0D-145A-4178-87FD-BB485D4F8109}</b:Guid>
+    <b:RefOrder>8</b:RefOrder>
+  </b:Source>
+  <b:Source>
+    <b:Tag>Con20</b:Tag>
+    <b:SourceType>InternetSite</b:SourceType>
+    <b:Guid>{3D5F7227-4475-4D1B-930C-C954F0832B54}</b:Guid>
+    <b:Title>Ready Meals Market Size, Share &amp; Trends Analysis Report By Product 2022-2030</b:Title>
+    <b:Year>2020</b:Year>
+    <b:YearAccessed>2025</b:YearAccessed>
+    <b:MonthAccessed>03</b:MonthAccessed>
+    <b:DayAccessed>01</b:DayAccessed>
+    <b:URL>https://www.grandviewresearch.com/industry-analysis/ready-meals-market</b:URL>
+    <b:Author>
+      <b:Author>
+        <b:Corporate>Consumer Goods</b:Corporate>
+      </b:Author>
+    </b:Author>
+    <b:RefOrder>1</b:RefOrder>
+  </b:Source>
+  <b:Source>
+    <b:Tag>The25</b:Tag>
+    <b:SourceType>InternetSite</b:SourceType>
+    <b:Guid>{E8BE53A7-012E-4B40-B598-4127CFBCC034}</b:Guid>
+    <b:Author>
+      <b:Author>
+        <b:Corporate>The Business Research Company</b:Corporate>
+      </b:Author>
+    </b:Author>
+    <b:Title>https://www.thebusinessresearchcompany.com/report/ready-meals-global-market-report</b:Title>
+    <b:Year>2025</b:Year>
+    <b:YearAccessed>2025</b:YearAccessed>
+    <b:MonthAccessed>03</b:MonthAccessed>
+    <b:DayAccessed>01</b:DayAccessed>
+    <b:URL>https://www.thebusinessresearchcompany.com/report/ready-meals-global-market-report</b:URL>
+    <b:RefOrder>2</b:RefOrder>
+  </b:Source>
+  <b:Source>
+    <b:Tag>For25</b:Tag>
+    <b:SourceType>InternetSite</b:SourceType>
+    <b:Guid>{C1CFD477-41AB-44CB-9992-29BA45229614}</b:Guid>
+    <b:Author>
+      <b:Author>
+        <b:Corporate>Fortune Business Insights </b:Corporate>
+      </b:Author>
+    </b:Author>
+    <b:Title>Food Processing &amp; Processed Food </b:Title>
+    <b:Year>2025</b:Year>
+    <b:YearAccessed>2025</b:YearAccessed>
+    <b:MonthAccessed>03</b:MonthAccessed>
+    <b:DayAccessed>01</b:DayAccessed>
+    <b:URL>http://fortunebusinessinsights.com/ready-to-eat-foods-market-110704</b:URL>
+    <b:RefOrder>3</b:RefOrder>
+  </b:Source>
 </b:Sources>
 </file>
 
 <file path=customXml/itemProps1.xml><?xml version="1.0" encoding="utf-8"?>
-<ds:datastoreItem xmlns:ds="http://schemas.openxmlformats.org/officeDocument/2006/customXml" ds:itemID="{08E0D310-2295-4BF4-A54E-23BCB0DAC53D}">
+<ds:datastoreItem xmlns:ds="http://schemas.openxmlformats.org/officeDocument/2006/customXml" ds:itemID="{C65B2445-04D6-44D1-93BE-6F28C79E45B9}">
   <ds:schemaRefs>
     <ds:schemaRef ds:uri="http://schemas.openxmlformats.org/officeDocument/2006/bibliography"/>
   </ds:schemaRefs>

</xml_diff>

<commit_message>
Data Collection & Analysis
Giving information on what data I'll use and preparing to added 2 week data
</commit_message>
<xml_diff>
--- a/Project Report.docx
+++ b/Project Report.docx
@@ -940,6 +940,9 @@
         <w:keepNext/>
       </w:pPr>
       <w:r>
+        <w:rPr>
+          <w:noProof/>
+        </w:rPr>
         <w:drawing>
           <wp:inline distT="0" distB="0" distL="0" distR="0" wp14:anchorId="3D2392AA" wp14:editId="5547A9B8">
             <wp:extent cx="2595721" cy="1927274"/>
@@ -1502,29 +1505,26 @@
     </w:p>
     <w:p>
       <w:r>
-        <w:t>•</w:t>
-      </w:r>
-      <w:r>
-        <w:tab/>
-        <w:t>Fastest Moving Sales Report: Identifies top-selling wines.</w:t>
-      </w:r>
-    </w:p>
-    <w:p>
-      <w:r>
-        <w:t>•</w:t>
-      </w:r>
-      <w:r>
-        <w:tab/>
-        <w:t>Slowest Moving Sales Report: Highlights wines that take too long to sell.</w:t>
-      </w:r>
-    </w:p>
-    <w:p>
-      <w:r>
-        <w:t>•</w:t>
-      </w:r>
-      <w:r>
-        <w:tab/>
-      </w:r>
+        <w:t>I’m</w:t>
+      </w:r>
+      <w:r>
+        <w:t xml:space="preserve"> staring this project with </w:t>
+      </w:r>
+      <w:r>
+        <w:t xml:space="preserve">two weeks sales data for </w:t>
+      </w:r>
+      <w:r>
+        <w:t xml:space="preserve">precise demand forecast that align the demand closely with customer needs </w:t>
+      </w:r>
+    </w:p>
+    <w:p>
+      <w:pPr>
+        <w:pStyle w:val="ListParagraph"/>
+        <w:numPr>
+          <w:ilvl w:val="0"/>
+          <w:numId w:val="20"/>
+        </w:numPr>
+      </w:pPr>
       <w:r>
         <w:t xml:space="preserve">Product Sales </w:t>
       </w:r>
@@ -1535,7 +1535,16 @@
         <w:t xml:space="preserve"> Week</w:t>
       </w:r>
       <w:r>
-        <w:t xml:space="preserve">: Shows </w:t>
+        <w:t>: Shows</w:t>
+      </w:r>
+      <w:r>
+        <w:t xml:space="preserve"> overall </w:t>
+      </w:r>
+      <w:r>
+        <w:t>meal</w:t>
+      </w:r>
+      <w:r>
+        <w:t xml:space="preserve"> </w:t>
       </w:r>
       <w:r>
         <w:t>sales by week</w:t>
@@ -1545,12 +1554,13 @@
       </w:r>
     </w:p>
     <w:p>
-      <w:r>
-        <w:t>•</w:t>
-      </w:r>
-      <w:r>
-        <w:tab/>
-      </w:r>
+      <w:pPr>
+        <w:pStyle w:val="ListParagraph"/>
+        <w:numPr>
+          <w:ilvl w:val="0"/>
+          <w:numId w:val="20"/>
+        </w:numPr>
+      </w:pPr>
       <w:r>
         <w:t>Stock Movement</w:t>
       </w:r>
@@ -1561,10 +1571,52 @@
         <w:t xml:space="preserve">the </w:t>
       </w:r>
       <w:r>
-        <w:t>number of wines sold during a specific period</w:t>
+        <w:t xml:space="preserve">number of </w:t>
+      </w:r>
+      <w:r>
+        <w:t>ready meals</w:t>
+      </w:r>
+      <w:r>
+        <w:t xml:space="preserve"> sold during </w:t>
+      </w:r>
+      <w:r>
+        <w:t xml:space="preserve">a </w:t>
+      </w:r>
+      <w:r>
+        <w:t>week</w:t>
       </w:r>
       <w:r>
         <w:t>.</w:t>
+      </w:r>
+    </w:p>
+    <w:p>
+      <w:pPr>
+        <w:pStyle w:val="ListParagraph"/>
+        <w:numPr>
+          <w:ilvl w:val="0"/>
+          <w:numId w:val="20"/>
+        </w:numPr>
+      </w:pPr>
+      <w:r>
+        <w:t xml:space="preserve">Meals </w:t>
+      </w:r>
+      <w:r>
+        <w:t>received report: data on how many meals were delivered from suppliers.</w:t>
+      </w:r>
+    </w:p>
+    <w:p>
+      <w:pPr>
+        <w:pStyle w:val="ListParagraph"/>
+        <w:numPr>
+          <w:ilvl w:val="0"/>
+          <w:numId w:val="20"/>
+        </w:numPr>
+      </w:pPr>
+      <w:r>
+        <w:t xml:space="preserve">Meals wasted report </w:t>
+      </w:r>
+      <w:r>
+        <w:t xml:space="preserve">Tracks food waste and helps analyse overstocking issues. </w:t>
       </w:r>
     </w:p>
     <w:p/>
@@ -1580,7 +1632,13 @@
         <w:t xml:space="preserve"> </w:t>
       </w:r>
       <w:r>
-        <w:t>Best-Selling Wines:</w:t>
+        <w:t xml:space="preserve">Best-Selling </w:t>
+      </w:r>
+      <w:r>
+        <w:t>Meals</w:t>
+      </w:r>
+      <w:r>
+        <w:t>:</w:t>
       </w:r>
     </w:p>
     <w:p>
@@ -1592,7 +1650,13 @@
         </w:numPr>
       </w:pPr>
       <w:r>
-        <w:t>Portillo Malbec Organic (36 units sold), So Prosecco DOC Treviso (22 units sold), and Saint Emilion A.C. (12 units sold).</w:t>
+        <w:t xml:space="preserve">I will add the meals that customers buy the most, ensuring they are in </w:t>
+      </w:r>
+      <w:r>
+        <w:t>stock)</w:t>
+      </w:r>
+      <w:r>
+        <w:t>.</w:t>
       </w:r>
     </w:p>
     <w:p>
@@ -1609,7 +1673,13 @@
         </w:numPr>
       </w:pPr>
       <w:r>
-        <w:t>Assyrtiko, and Bollini Rose (1 unit sold each).</w:t>
+        <w:t xml:space="preserve">I will add </w:t>
+      </w:r>
+      <w:r>
+        <w:t>meals with low demand to reduce unnecessary stock)</w:t>
+      </w:r>
+      <w:r>
+        <w:t>.</w:t>
       </w:r>
     </w:p>
     <w:p>
@@ -1632,7 +1702,13 @@
         </w:numPr>
       </w:pPr>
       <w:r>
-        <w:t>Sales spike before weekends (suggesting high weekend demand).</w:t>
+        <w:t>Peak demand periods (</w:t>
+      </w:r>
+      <w:r>
+        <w:t>for</w:t>
+      </w:r>
+      <w:r>
+        <w:t xml:space="preserve"> example lunchtime vs dinner sales) </w:t>
       </w:r>
     </w:p>
     <w:p>
@@ -1644,27 +1720,46 @@
         </w:numPr>
       </w:pPr>
       <w:r>
-        <w:t>Some wines</w:t>
-      </w:r>
-      <w:r>
-        <w:t xml:space="preserve"> </w:t>
-      </w:r>
-      <w:r>
-        <w:t>sell out, requiring better forecasting.</w:t>
-      </w:r>
-    </w:p>
-    <w:p>
-      <w:pPr>
-        <w:pStyle w:val="ListParagraph"/>
-        <w:numPr>
-          <w:ilvl w:val="0"/>
-          <w:numId w:val="15"/>
-        </w:numPr>
-      </w:pPr>
-      <w:r>
-        <w:t>Overstock of slow-moving wines leads to wasted space and capital.</w:t>
-      </w:r>
-    </w:p>
+        <w:t xml:space="preserve">Identify </w:t>
+      </w:r>
+      <w:r>
+        <w:t xml:space="preserve">trends like </w:t>
+      </w:r>
+      <w:r>
+        <w:t>high</w:t>
+      </w:r>
+      <w:r>
+        <w:t xml:space="preserve"> sales for weekends</w:t>
+      </w:r>
+      <w:r>
+        <w:t>.</w:t>
+      </w:r>
+    </w:p>
+    <w:p>
+      <w:r>
+        <w:t>Stock waste analyses:</w:t>
+      </w:r>
+    </w:p>
+    <w:p>
+      <w:r>
+        <w:t xml:space="preserve">Meals that frequently run out: better forecasting and reordering </w:t>
+      </w:r>
+    </w:p>
+    <w:p>
+      <w:r>
+        <w:t xml:space="preserve">Meals that </w:t>
+      </w:r>
+      <w:r>
+        <w:t xml:space="preserve">are </w:t>
+      </w:r>
+      <w:r>
+        <w:t xml:space="preserve">frequently </w:t>
+      </w:r>
+      <w:r>
+        <w:t xml:space="preserve">wasted: overordering or lack of demand. </w:t>
+      </w:r>
+    </w:p>
+    <w:p/>
     <w:p>
       <w:r>
         <w:t>5. Technology Selection &amp; Comparison</w:t>
@@ -1949,6 +2044,7 @@
         </w:numPr>
       </w:pPr>
       <w:r>
+        <w:lastRenderedPageBreak/>
         <w:t xml:space="preserve">Lead Time: </w:t>
       </w:r>
       <w:r>
@@ -2049,7 +2145,6 @@
         </w:numPr>
       </w:pPr>
       <w:r>
-        <w:lastRenderedPageBreak/>
         <w:t xml:space="preserve">Safety Stock:  </w:t>
       </w:r>
       <w:r>
@@ -2429,6 +2524,7 @@
         <w:ind w:firstLine="360"/>
       </w:pPr>
       <w:r>
+        <w:lastRenderedPageBreak/>
         <w:t>7.</w:t>
       </w:r>
       <w:r>
@@ -4006,6 +4102,119 @@
     </w:lvl>
   </w:abstractNum>
   <w:abstractNum w:abstractNumId="9" w15:restartNumberingAfterBreak="0">
+    <w:nsid w:val="33383BF2"/>
+    <w:multiLevelType w:val="hybridMultilevel"/>
+    <w:tmpl w:val="D3782AAE"/>
+    <w:lvl w:ilvl="0" w:tplc="18090001">
+      <w:start w:val="1"/>
+      <w:numFmt w:val="bullet"/>
+      <w:lvlText w:val=""/>
+      <w:lvlJc w:val="left"/>
+      <w:pPr>
+        <w:ind w:left="720" w:hanging="360"/>
+      </w:pPr>
+      <w:rPr>
+        <w:rFonts w:ascii="Symbol" w:hAnsi="Symbol" w:hint="default"/>
+      </w:rPr>
+    </w:lvl>
+    <w:lvl w:ilvl="1" w:tplc="18090003" w:tentative="1">
+      <w:start w:val="1"/>
+      <w:numFmt w:val="bullet"/>
+      <w:lvlText w:val="o"/>
+      <w:lvlJc w:val="left"/>
+      <w:pPr>
+        <w:ind w:left="1440" w:hanging="360"/>
+      </w:pPr>
+      <w:rPr>
+        <w:rFonts w:ascii="Courier New" w:hAnsi="Courier New" w:cs="Courier New" w:hint="default"/>
+      </w:rPr>
+    </w:lvl>
+    <w:lvl w:ilvl="2" w:tplc="18090005" w:tentative="1">
+      <w:start w:val="1"/>
+      <w:numFmt w:val="bullet"/>
+      <w:lvlText w:val=""/>
+      <w:lvlJc w:val="left"/>
+      <w:pPr>
+        <w:ind w:left="2160" w:hanging="360"/>
+      </w:pPr>
+      <w:rPr>
+        <w:rFonts w:ascii="Wingdings" w:hAnsi="Wingdings" w:hint="default"/>
+      </w:rPr>
+    </w:lvl>
+    <w:lvl w:ilvl="3" w:tplc="18090001" w:tentative="1">
+      <w:start w:val="1"/>
+      <w:numFmt w:val="bullet"/>
+      <w:lvlText w:val=""/>
+      <w:lvlJc w:val="left"/>
+      <w:pPr>
+        <w:ind w:left="2880" w:hanging="360"/>
+      </w:pPr>
+      <w:rPr>
+        <w:rFonts w:ascii="Symbol" w:hAnsi="Symbol" w:hint="default"/>
+      </w:rPr>
+    </w:lvl>
+    <w:lvl w:ilvl="4" w:tplc="18090003" w:tentative="1">
+      <w:start w:val="1"/>
+      <w:numFmt w:val="bullet"/>
+      <w:lvlText w:val="o"/>
+      <w:lvlJc w:val="left"/>
+      <w:pPr>
+        <w:ind w:left="3600" w:hanging="360"/>
+      </w:pPr>
+      <w:rPr>
+        <w:rFonts w:ascii="Courier New" w:hAnsi="Courier New" w:cs="Courier New" w:hint="default"/>
+      </w:rPr>
+    </w:lvl>
+    <w:lvl w:ilvl="5" w:tplc="18090005" w:tentative="1">
+      <w:start w:val="1"/>
+      <w:numFmt w:val="bullet"/>
+      <w:lvlText w:val=""/>
+      <w:lvlJc w:val="left"/>
+      <w:pPr>
+        <w:ind w:left="4320" w:hanging="360"/>
+      </w:pPr>
+      <w:rPr>
+        <w:rFonts w:ascii="Wingdings" w:hAnsi="Wingdings" w:hint="default"/>
+      </w:rPr>
+    </w:lvl>
+    <w:lvl w:ilvl="6" w:tplc="18090001" w:tentative="1">
+      <w:start w:val="1"/>
+      <w:numFmt w:val="bullet"/>
+      <w:lvlText w:val=""/>
+      <w:lvlJc w:val="left"/>
+      <w:pPr>
+        <w:ind w:left="5040" w:hanging="360"/>
+      </w:pPr>
+      <w:rPr>
+        <w:rFonts w:ascii="Symbol" w:hAnsi="Symbol" w:hint="default"/>
+      </w:rPr>
+    </w:lvl>
+    <w:lvl w:ilvl="7" w:tplc="18090003" w:tentative="1">
+      <w:start w:val="1"/>
+      <w:numFmt w:val="bullet"/>
+      <w:lvlText w:val="o"/>
+      <w:lvlJc w:val="left"/>
+      <w:pPr>
+        <w:ind w:left="5760" w:hanging="360"/>
+      </w:pPr>
+      <w:rPr>
+        <w:rFonts w:ascii="Courier New" w:hAnsi="Courier New" w:cs="Courier New" w:hint="default"/>
+      </w:rPr>
+    </w:lvl>
+    <w:lvl w:ilvl="8" w:tplc="18090005" w:tentative="1">
+      <w:start w:val="1"/>
+      <w:numFmt w:val="bullet"/>
+      <w:lvlText w:val=""/>
+      <w:lvlJc w:val="left"/>
+      <w:pPr>
+        <w:ind w:left="6480" w:hanging="360"/>
+      </w:pPr>
+      <w:rPr>
+        <w:rFonts w:ascii="Wingdings" w:hAnsi="Wingdings" w:hint="default"/>
+      </w:rPr>
+    </w:lvl>
+  </w:abstractNum>
+  <w:abstractNum w:abstractNumId="10" w15:restartNumberingAfterBreak="0">
     <w:nsid w:val="3B893057"/>
     <w:multiLevelType w:val="hybridMultilevel"/>
     <w:tmpl w:val="7884CFF2"/>
@@ -4118,7 +4327,7 @@
       </w:rPr>
     </w:lvl>
   </w:abstractNum>
-  <w:abstractNum w:abstractNumId="10" w15:restartNumberingAfterBreak="0">
+  <w:abstractNum w:abstractNumId="11" w15:restartNumberingAfterBreak="0">
     <w:nsid w:val="539A7CFC"/>
     <w:multiLevelType w:val="multilevel"/>
     <w:tmpl w:val="3C7CBDE4"/>
@@ -4267,7 +4476,7 @@
       </w:rPr>
     </w:lvl>
   </w:abstractNum>
-  <w:abstractNum w:abstractNumId="11" w15:restartNumberingAfterBreak="0">
+  <w:abstractNum w:abstractNumId="12" w15:restartNumberingAfterBreak="0">
     <w:nsid w:val="558922C6"/>
     <w:multiLevelType w:val="multilevel"/>
     <w:tmpl w:val="5B58A564"/>
@@ -4416,7 +4625,7 @@
       </w:rPr>
     </w:lvl>
   </w:abstractNum>
-  <w:abstractNum w:abstractNumId="12" w15:restartNumberingAfterBreak="0">
+  <w:abstractNum w:abstractNumId="13" w15:restartNumberingAfterBreak="0">
     <w:nsid w:val="62BE65BB"/>
     <w:multiLevelType w:val="multilevel"/>
     <w:tmpl w:val="048811FA"/>
@@ -4565,7 +4774,7 @@
       </w:rPr>
     </w:lvl>
   </w:abstractNum>
-  <w:abstractNum w:abstractNumId="13" w15:restartNumberingAfterBreak="0">
+  <w:abstractNum w:abstractNumId="14" w15:restartNumberingAfterBreak="0">
     <w:nsid w:val="6A1D256B"/>
     <w:multiLevelType w:val="hybridMultilevel"/>
     <w:tmpl w:val="7C9A8ADC"/>
@@ -4678,7 +4887,7 @@
       </w:rPr>
     </w:lvl>
   </w:abstractNum>
-  <w:abstractNum w:abstractNumId="14" w15:restartNumberingAfterBreak="0">
+  <w:abstractNum w:abstractNumId="15" w15:restartNumberingAfterBreak="0">
     <w:nsid w:val="6D7F77FE"/>
     <w:multiLevelType w:val="multilevel"/>
     <w:tmpl w:val="2710FDDA"/>
@@ -4827,7 +5036,7 @@
       </w:rPr>
     </w:lvl>
   </w:abstractNum>
-  <w:abstractNum w:abstractNumId="15" w15:restartNumberingAfterBreak="0">
+  <w:abstractNum w:abstractNumId="16" w15:restartNumberingAfterBreak="0">
     <w:nsid w:val="6E33664C"/>
     <w:multiLevelType w:val="multilevel"/>
     <w:tmpl w:val="59520974"/>
@@ -4976,7 +5185,120 @@
       </w:rPr>
     </w:lvl>
   </w:abstractNum>
-  <w:abstractNum w:abstractNumId="16" w15:restartNumberingAfterBreak="0">
+  <w:abstractNum w:abstractNumId="17" w15:restartNumberingAfterBreak="0">
+    <w:nsid w:val="70387638"/>
+    <w:multiLevelType w:val="hybridMultilevel"/>
+    <w:tmpl w:val="1DDCE614"/>
+    <w:lvl w:ilvl="0" w:tplc="18090001">
+      <w:start w:val="1"/>
+      <w:numFmt w:val="bullet"/>
+      <w:lvlText w:val=""/>
+      <w:lvlJc w:val="left"/>
+      <w:pPr>
+        <w:ind w:left="720" w:hanging="360"/>
+      </w:pPr>
+      <w:rPr>
+        <w:rFonts w:ascii="Symbol" w:hAnsi="Symbol" w:hint="default"/>
+      </w:rPr>
+    </w:lvl>
+    <w:lvl w:ilvl="1" w:tplc="18090003" w:tentative="1">
+      <w:start w:val="1"/>
+      <w:numFmt w:val="bullet"/>
+      <w:lvlText w:val="o"/>
+      <w:lvlJc w:val="left"/>
+      <w:pPr>
+        <w:ind w:left="1440" w:hanging="360"/>
+      </w:pPr>
+      <w:rPr>
+        <w:rFonts w:ascii="Courier New" w:hAnsi="Courier New" w:cs="Courier New" w:hint="default"/>
+      </w:rPr>
+    </w:lvl>
+    <w:lvl w:ilvl="2" w:tplc="18090005" w:tentative="1">
+      <w:start w:val="1"/>
+      <w:numFmt w:val="bullet"/>
+      <w:lvlText w:val=""/>
+      <w:lvlJc w:val="left"/>
+      <w:pPr>
+        <w:ind w:left="2160" w:hanging="360"/>
+      </w:pPr>
+      <w:rPr>
+        <w:rFonts w:ascii="Wingdings" w:hAnsi="Wingdings" w:hint="default"/>
+      </w:rPr>
+    </w:lvl>
+    <w:lvl w:ilvl="3" w:tplc="18090001" w:tentative="1">
+      <w:start w:val="1"/>
+      <w:numFmt w:val="bullet"/>
+      <w:lvlText w:val=""/>
+      <w:lvlJc w:val="left"/>
+      <w:pPr>
+        <w:ind w:left="2880" w:hanging="360"/>
+      </w:pPr>
+      <w:rPr>
+        <w:rFonts w:ascii="Symbol" w:hAnsi="Symbol" w:hint="default"/>
+      </w:rPr>
+    </w:lvl>
+    <w:lvl w:ilvl="4" w:tplc="18090003" w:tentative="1">
+      <w:start w:val="1"/>
+      <w:numFmt w:val="bullet"/>
+      <w:lvlText w:val="o"/>
+      <w:lvlJc w:val="left"/>
+      <w:pPr>
+        <w:ind w:left="3600" w:hanging="360"/>
+      </w:pPr>
+      <w:rPr>
+        <w:rFonts w:ascii="Courier New" w:hAnsi="Courier New" w:cs="Courier New" w:hint="default"/>
+      </w:rPr>
+    </w:lvl>
+    <w:lvl w:ilvl="5" w:tplc="18090005" w:tentative="1">
+      <w:start w:val="1"/>
+      <w:numFmt w:val="bullet"/>
+      <w:lvlText w:val=""/>
+      <w:lvlJc w:val="left"/>
+      <w:pPr>
+        <w:ind w:left="4320" w:hanging="360"/>
+      </w:pPr>
+      <w:rPr>
+        <w:rFonts w:ascii="Wingdings" w:hAnsi="Wingdings" w:hint="default"/>
+      </w:rPr>
+    </w:lvl>
+    <w:lvl w:ilvl="6" w:tplc="18090001" w:tentative="1">
+      <w:start w:val="1"/>
+      <w:numFmt w:val="bullet"/>
+      <w:lvlText w:val=""/>
+      <w:lvlJc w:val="left"/>
+      <w:pPr>
+        <w:ind w:left="5040" w:hanging="360"/>
+      </w:pPr>
+      <w:rPr>
+        <w:rFonts w:ascii="Symbol" w:hAnsi="Symbol" w:hint="default"/>
+      </w:rPr>
+    </w:lvl>
+    <w:lvl w:ilvl="7" w:tplc="18090003" w:tentative="1">
+      <w:start w:val="1"/>
+      <w:numFmt w:val="bullet"/>
+      <w:lvlText w:val="o"/>
+      <w:lvlJc w:val="left"/>
+      <w:pPr>
+        <w:ind w:left="5760" w:hanging="360"/>
+      </w:pPr>
+      <w:rPr>
+        <w:rFonts w:ascii="Courier New" w:hAnsi="Courier New" w:cs="Courier New" w:hint="default"/>
+      </w:rPr>
+    </w:lvl>
+    <w:lvl w:ilvl="8" w:tplc="18090005" w:tentative="1">
+      <w:start w:val="1"/>
+      <w:numFmt w:val="bullet"/>
+      <w:lvlText w:val=""/>
+      <w:lvlJc w:val="left"/>
+      <w:pPr>
+        <w:ind w:left="6480" w:hanging="360"/>
+      </w:pPr>
+      <w:rPr>
+        <w:rFonts w:ascii="Wingdings" w:hAnsi="Wingdings" w:hint="default"/>
+      </w:rPr>
+    </w:lvl>
+  </w:abstractNum>
+  <w:abstractNum w:abstractNumId="18" w15:restartNumberingAfterBreak="0">
     <w:nsid w:val="74C45F33"/>
     <w:multiLevelType w:val="multilevel"/>
     <w:tmpl w:val="F864B5D8"/>
@@ -5125,7 +5447,7 @@
       </w:rPr>
     </w:lvl>
   </w:abstractNum>
-  <w:abstractNum w:abstractNumId="17" w15:restartNumberingAfterBreak="0">
+  <w:abstractNum w:abstractNumId="19" w15:restartNumberingAfterBreak="0">
     <w:nsid w:val="7BF7048E"/>
     <w:multiLevelType w:val="multilevel"/>
     <w:tmpl w:val="D2EAFCE6"/>
@@ -5275,7 +5597,7 @@
     </w:lvl>
   </w:abstractNum>
   <w:num w:numId="1" w16cid:durableId="1905293843">
-    <w:abstractNumId w:val="15"/>
+    <w:abstractNumId w:val="16"/>
   </w:num>
   <w:num w:numId="2" w16cid:durableId="849175946">
     <w:abstractNumId w:val="2"/>
@@ -5287,19 +5609,19 @@
     <w:abstractNumId w:val="7"/>
   </w:num>
   <w:num w:numId="5" w16cid:durableId="1112556247">
+    <w:abstractNumId w:val="12"/>
+  </w:num>
+  <w:num w:numId="6" w16cid:durableId="269550114">
+    <w:abstractNumId w:val="13"/>
+  </w:num>
+  <w:num w:numId="7" w16cid:durableId="1532256504">
+    <w:abstractNumId w:val="18"/>
+  </w:num>
+  <w:num w:numId="8" w16cid:durableId="635109628">
     <w:abstractNumId w:val="11"/>
   </w:num>
-  <w:num w:numId="6" w16cid:durableId="269550114">
-    <w:abstractNumId w:val="12"/>
-  </w:num>
-  <w:num w:numId="7" w16cid:durableId="1532256504">
-    <w:abstractNumId w:val="16"/>
-  </w:num>
-  <w:num w:numId="8" w16cid:durableId="635109628">
-    <w:abstractNumId w:val="10"/>
-  </w:num>
   <w:num w:numId="9" w16cid:durableId="1186754716">
-    <w:abstractNumId w:val="17"/>
+    <w:abstractNumId w:val="19"/>
   </w:num>
   <w:num w:numId="10" w16cid:durableId="1105275105">
     <w:abstractNumId w:val="1"/>
@@ -5308,7 +5630,7 @@
     <w:abstractNumId w:val="0"/>
   </w:num>
   <w:num w:numId="12" w16cid:durableId="472019014">
-    <w:abstractNumId w:val="14"/>
+    <w:abstractNumId w:val="15"/>
   </w:num>
   <w:num w:numId="13" w16cid:durableId="1720014099">
     <w:abstractNumId w:val="3"/>
@@ -5317,7 +5639,7 @@
     <w:abstractNumId w:val="5"/>
   </w:num>
   <w:num w:numId="15" w16cid:durableId="913852121">
-    <w:abstractNumId w:val="9"/>
+    <w:abstractNumId w:val="10"/>
   </w:num>
   <w:num w:numId="16" w16cid:durableId="998924147">
     <w:abstractNumId w:val="4"/>
@@ -5326,7 +5648,13 @@
     <w:abstractNumId w:val="8"/>
   </w:num>
   <w:num w:numId="18" w16cid:durableId="951668676">
-    <w:abstractNumId w:val="13"/>
+    <w:abstractNumId w:val="14"/>
+  </w:num>
+  <w:num w:numId="19" w16cid:durableId="3820998">
+    <w:abstractNumId w:val="17"/>
+  </w:num>
+  <w:num w:numId="20" w16cid:durableId="1169365718">
+    <w:abstractNumId w:val="9"/>
   </w:num>
 </w:numbering>
 </file>

</xml_diff>

<commit_message>
Adding clean data on the excel
I added the Lotts and co Advantages and also started to  structure the Excel with the data I have, once I finish Ill be using python
</commit_message>
<xml_diff>
--- a/Project Report.docx
+++ b/Project Report.docx
@@ -600,6 +600,13 @@
         <w:t xml:space="preserve"> Management at Lotts &amp; Co. Using Data Analytics</w:t>
       </w:r>
     </w:p>
+    <w:p/>
+    <w:p/>
+    <w:p>
+      <w:r>
+        <w:t xml:space="preserve">Why I used this module </w:t>
+      </w:r>
+    </w:p>
     <w:p>
       <w:r>
         <w:br w:type="page"/>
@@ -662,9 +669,45 @@
       </w:r>
       <w:r>
         <w:tab/>
-        <w:t>Setting Automatic Reordering for Fast-Moving Wines</w:t>
-      </w:r>
-    </w:p>
+        <w:t xml:space="preserve">Setting Automatic Reordering for Fast-Moving </w:t>
+      </w:r>
+      <w:r>
+        <w:t xml:space="preserve">Meals </w:t>
+      </w:r>
+    </w:p>
+    <w:p>
+      <w:r>
+        <w:t xml:space="preserve">(once I get all the DATA) </w:t>
+      </w:r>
+    </w:p>
+    <w:p>
+      <w:r>
+        <w:t>7.</w:t>
+      </w:r>
+      <w:r>
+        <w:tab/>
+        <w:t>Legal &amp; Ethical Considerations</w:t>
+      </w:r>
+    </w:p>
+    <w:p>
+      <w:r>
+        <w:t>8.</w:t>
+      </w:r>
+      <w:r>
+        <w:tab/>
+        <w:t>Competitive Advantage for Lotts &amp; Co.</w:t>
+      </w:r>
+    </w:p>
+    <w:p>
+      <w:r>
+        <w:t>9.</w:t>
+      </w:r>
+      <w:r>
+        <w:tab/>
+        <w:t>Conclusion &amp; Recommendations</w:t>
+      </w:r>
+    </w:p>
+    <w:p/>
     <w:p/>
     <w:p>
       <w:r>
@@ -1074,7 +1117,15 @@
               <w:sz w:val="16"/>
               <w:szCs w:val="16"/>
             </w:rPr>
-            <w:t xml:space="preserve"> (The Business Research Company, 2025)</w:t>
+            <w:t xml:space="preserve"> </w:t>
+          </w:r>
+          <w:r>
+            <w:rPr>
+              <w:noProof/>
+              <w:sz w:val="16"/>
+              <w:szCs w:val="16"/>
+            </w:rPr>
+            <w:t>(The Business Research Company, 2025)</w:t>
           </w:r>
           <w:r>
             <w:rPr>
@@ -1508,10 +1559,25 @@
         <w:t>I’m</w:t>
       </w:r>
       <w:r>
-        <w:t xml:space="preserve"> staring this project with </w:t>
-      </w:r>
-      <w:r>
-        <w:t xml:space="preserve">two weeks sales data for </w:t>
+        <w:t xml:space="preserve"> </w:t>
+      </w:r>
+      <w:r>
+        <w:t>starting</w:t>
+      </w:r>
+      <w:r>
+        <w:t xml:space="preserve"> this project with </w:t>
+      </w:r>
+      <w:r>
+        <w:t xml:space="preserve">two weeks </w:t>
+      </w:r>
+      <w:r>
+        <w:t xml:space="preserve">of </w:t>
+      </w:r>
+      <w:r>
+        <w:t xml:space="preserve">sales data for </w:t>
+      </w:r>
+      <w:r>
+        <w:t xml:space="preserve">a </w:t>
       </w:r>
       <w:r>
         <w:t xml:space="preserve">precise demand forecast that align the demand closely with customer needs </w:t>
@@ -1747,16 +1813,7 @@
     </w:p>
     <w:p>
       <w:r>
-        <w:t xml:space="preserve">Meals that </w:t>
-      </w:r>
-      <w:r>
-        <w:t xml:space="preserve">are </w:t>
-      </w:r>
-      <w:r>
-        <w:t xml:space="preserve">frequently </w:t>
-      </w:r>
-      <w:r>
-        <w:t xml:space="preserve">wasted: overordering or lack of demand. </w:t>
+        <w:t xml:space="preserve">Meals that are frequently wasted: overordering or lack of demand. </w:t>
       </w:r>
     </w:p>
     <w:p/>
@@ -1831,7 +1888,38 @@
           </w:tcPr>
           <w:p>
             <w:r>
-              <w:t>Best for visualizing sales &amp; stock trends in a user-friendly way.</w:t>
+              <w:t xml:space="preserve">Best for visualizing sales &amp; </w:t>
+            </w:r>
+            <w:r>
+              <w:t xml:space="preserve">waste trends </w:t>
+            </w:r>
+            <w:r>
+              <w:t>-friendly way.</w:t>
+            </w:r>
+          </w:p>
+          <w:p>
+            <w:r>
+              <w:t xml:space="preserve">Easily </w:t>
+            </w:r>
+            <w:r>
+              <w:t>integrated</w:t>
+            </w:r>
+            <w:r>
+              <w:t xml:space="preserve"> with Excel </w:t>
+            </w:r>
+            <w:r>
+              <w:t>it</w:t>
+            </w:r>
+            <w:r>
+              <w:t xml:space="preserve"> is used for inventory </w:t>
+            </w:r>
+          </w:p>
+          <w:p>
+            <w:r>
+              <w:t xml:space="preserve">Drag and drop </w:t>
+            </w:r>
+            <w:r>
+              <w:t xml:space="preserve">reports, monitoring fast selling and wasted </w:t>
             </w:r>
           </w:p>
         </w:tc>
@@ -1863,7 +1951,44 @@
           </w:tcPr>
           <w:p>
             <w:r>
-              <w:t>Better for automating demand forecasting.</w:t>
+              <w:t>Better for automating demand forecasting</w:t>
+            </w:r>
+            <w:r>
+              <w:t xml:space="preserve"> </w:t>
+            </w:r>
+            <w:r>
+              <w:t>using</w:t>
+            </w:r>
+            <w:r>
+              <w:t xml:space="preserve"> </w:t>
+            </w:r>
+            <w:r>
+              <w:t xml:space="preserve">data sale </w:t>
+            </w:r>
+            <w:r>
+              <w:t>history</w:t>
+            </w:r>
+            <w:r>
+              <w:t>.</w:t>
+            </w:r>
+          </w:p>
+          <w:p>
+            <w:r>
+              <w:t xml:space="preserve">Help </w:t>
+            </w:r>
+            <w:r>
+              <w:t>predict</w:t>
+            </w:r>
+            <w:r>
+              <w:t xml:space="preserve"> demand (lunch vs</w:t>
+            </w:r>
+            <w:r>
+              <w:t xml:space="preserve"> dinner)</w:t>
+            </w:r>
+          </w:p>
+          <w:p>
+            <w:r>
+              <w:t xml:space="preserve">Detect waste: which meals are constantly wasted </w:t>
             </w:r>
           </w:p>
         </w:tc>
@@ -1910,47 +2035,71 @@
         </w:numPr>
       </w:pPr>
       <w:r>
-        <w:t xml:space="preserve">Power BI for data visualization </w:t>
-      </w:r>
-      <w:r>
-        <w:t xml:space="preserve">and </w:t>
-      </w:r>
-      <w:r>
-        <w:t>reporting.</w:t>
-      </w:r>
-    </w:p>
-    <w:p>
-      <w:pPr>
-        <w:pStyle w:val="ListParagraph"/>
-        <w:numPr>
-          <w:ilvl w:val="0"/>
-          <w:numId w:val="16"/>
-        </w:numPr>
-      </w:pPr>
-      <w:r>
-        <w:t>Python for advanced trend forecasting.</w:t>
-      </w:r>
-    </w:p>
-    <w:p>
-      <w:r>
-        <w:t>6. Setting Automatic Reordering for Fast-Moving Wines</w:t>
-      </w:r>
-    </w:p>
-    <w:p>
-      <w:r>
-        <w:t>Point Formula:</w:t>
-      </w:r>
-    </w:p>
-    <w:p>
-      <w:r>
-        <w:t xml:space="preserve">Anticipating fast-moving wines, an automatic reorder point (ROP) system </w:t>
+        <w:t xml:space="preserve">Power BI </w:t>
+      </w:r>
+      <w:r>
+        <w:t xml:space="preserve">is ideal for </w:t>
+      </w:r>
+      <w:r>
+        <w:t>daily</w:t>
+      </w:r>
+      <w:r>
+        <w:t xml:space="preserve"> and </w:t>
+      </w:r>
+      <w:r>
+        <w:t>weekly</w:t>
+      </w:r>
+      <w:r>
+        <w:t xml:space="preserve"> </w:t>
+      </w:r>
+      <w:r>
+        <w:t xml:space="preserve">monitoring of </w:t>
+      </w:r>
+      <w:r>
+        <w:t>meal stock</w:t>
+      </w:r>
+      <w:r>
+        <w:t>.</w:t>
+      </w:r>
+      <w:r>
+        <w:t xml:space="preserve"> </w:t>
+      </w:r>
+      <w:r>
+        <w:t>It’s</w:t>
+      </w:r>
+      <w:r>
+        <w:t xml:space="preserve"> </w:t>
+      </w:r>
+      <w:r>
+        <w:t>going to</w:t>
+      </w:r>
+      <w:r>
+        <w:t xml:space="preserve"> </w:t>
+      </w:r>
+      <w:r>
+        <w:t>help</w:t>
+      </w:r>
+      <w:r>
+        <w:t xml:space="preserve"> </w:t>
+      </w:r>
+      <w:r>
+        <w:t>visualise</w:t>
+      </w:r>
+      <w:r>
+        <w:t xml:space="preserve"> which meals are selling faster, wasted </w:t>
+      </w:r>
+      <w:r>
+        <w:t>or when demand fluctuates</w:t>
+      </w:r>
+      <w:r>
+        <w:t xml:space="preserve"> while Tablets will offer similar visualization but with more cost</w:t>
       </w:r>
       <w:r>
         <w:t xml:space="preserve"> </w:t>
       </w:r>
       <w:sdt>
         <w:sdtPr>
-          <w:id w:val="148413301"/>
+          <w:id w:val="505567943"/>
           <w:citation/>
         </w:sdtPr>
         <w:sdtContent>
@@ -1958,7 +2107,7 @@
             <w:fldChar w:fldCharType="begin"/>
           </w:r>
           <w:r>
-            <w:instrText xml:space="preserve"> CITATION Tur23 \l 6153 </w:instrText>
+            <w:instrText xml:space="preserve"> CITATION Avi25 \l 6153 </w:instrText>
           </w:r>
           <w:r>
             <w:fldChar w:fldCharType="separate"/>
@@ -1967,7 +2116,7 @@
             <w:rPr>
               <w:noProof/>
             </w:rPr>
-            <w:t>(Turovski, 2023)</w:t>
+            <w:t>(Biswal, 2025)</w:t>
           </w:r>
           <w:r>
             <w:fldChar w:fldCharType="end"/>
@@ -1975,52 +2124,7 @@
         </w:sdtContent>
       </w:sdt>
       <w:r>
-        <w:t xml:space="preserve"> </w:t>
-      </w:r>
-      <w:r>
-        <w:t xml:space="preserve">for effective stock management </w:t>
-      </w:r>
-      <w:r>
-        <w:t>can be</w:t>
-      </w:r>
-      <w:r>
-        <w:t xml:space="preserve"> </w:t>
-      </w:r>
-      <w:r>
-        <w:t>established considering the</w:t>
-      </w:r>
-      <w:r>
-        <w:t xml:space="preserve"> supplier delivery schedules and off </w:t>
-      </w:r>
-      <w:r>
-        <w:t>times</w:t>
-      </w:r>
-      <w:r>
         <w:t xml:space="preserve">. </w:t>
-      </w:r>
-      <w:r>
-        <w:t>The</w:t>
-      </w:r>
-      <w:r>
-        <w:t xml:space="preserve"> </w:t>
-      </w:r>
-      <w:r>
-        <w:rPr>
-          <w:b/>
-          <w:bCs/>
-        </w:rPr>
-        <w:t>Reorder Point (ROP) Formula</w:t>
-      </w:r>
-      <w:r>
-        <w:t xml:space="preserve"> applied </w:t>
-      </w:r>
-      <w:r>
-        <w:t>is:</w:t>
-      </w:r>
-    </w:p>
-    <w:p>
-      <w:r>
-        <w:t>Example Calculation for Portillo Malbec Organic:</w:t>
       </w:r>
     </w:p>
     <w:p>
@@ -2028,11 +2132,120 @@
         <w:pStyle w:val="ListParagraph"/>
         <w:numPr>
           <w:ilvl w:val="0"/>
-          <w:numId w:val="18"/>
+          <w:numId w:val="16"/>
         </w:numPr>
       </w:pPr>
       <w:r>
-        <w:t>Sales Rate: 36 bottles sold in 21 days → 1.7 bottles/day.</w:t>
+        <w:lastRenderedPageBreak/>
+        <w:t xml:space="preserve">Python </w:t>
+      </w:r>
+      <w:r>
+        <w:t>is better for predictive analyses, specific days reducing the ever-order and minimising food waste</w:t>
+      </w:r>
+      <w:r>
+        <w:t xml:space="preserve"> while excel will be easy to use more won’t give as many features</w:t>
+      </w:r>
+      <w:r>
+        <w:t xml:space="preserve"> </w:t>
+      </w:r>
+      <w:sdt>
+        <w:sdtPr>
+          <w:id w:val="-895972157"/>
+          <w:citation/>
+        </w:sdtPr>
+        <w:sdtContent>
+          <w:r>
+            <w:fldChar w:fldCharType="begin"/>
+          </w:r>
+          <w:r>
+            <w:instrText xml:space="preserve"> CITATION Pyt24 \l 6153 </w:instrText>
+          </w:r>
+          <w:r>
+            <w:fldChar w:fldCharType="separate"/>
+          </w:r>
+          <w:r>
+            <w:rPr>
+              <w:noProof/>
+            </w:rPr>
+            <w:t>(Python, 2024)</w:t>
+          </w:r>
+          <w:r>
+            <w:fldChar w:fldCharType="end"/>
+          </w:r>
+        </w:sdtContent>
+      </w:sdt>
+      <w:r>
+        <w:t xml:space="preserve">. </w:t>
+      </w:r>
+    </w:p>
+    <w:p>
+      <w:r>
+        <w:t>6. Setting Automatic Reordering for Fast-Moving Wines</w:t>
+      </w:r>
+    </w:p>
+    <w:p/>
+    <w:p/>
+    <w:p/>
+    <w:p/>
+    <w:p>
+      <w:pPr>
+        <w:ind w:firstLine="360"/>
+      </w:pPr>
+      <w:r>
+        <w:t xml:space="preserve">TAKE DATA FOR THIS </w:t>
+      </w:r>
+    </w:p>
+    <w:p>
+      <w:pPr>
+        <w:ind w:firstLine="360"/>
+      </w:pPr>
+    </w:p>
+    <w:p>
+      <w:pPr>
+        <w:ind w:firstLine="360"/>
+      </w:pPr>
+    </w:p>
+    <w:p>
+      <w:pPr>
+        <w:ind w:firstLine="360"/>
+      </w:pPr>
+    </w:p>
+    <w:p>
+      <w:pPr>
+        <w:ind w:firstLine="360"/>
+      </w:pPr>
+    </w:p>
+    <w:p>
+      <w:pPr>
+        <w:ind w:firstLine="360"/>
+      </w:pPr>
+    </w:p>
+    <w:p>
+      <w:pPr>
+        <w:ind w:firstLine="360"/>
+      </w:pPr>
+      <w:r>
+        <w:t>7. Legal &amp; Ethical Considerations</w:t>
+      </w:r>
+      <w:r>
+        <w:t xml:space="preserve"> </w:t>
+      </w:r>
+      <w:r>
+        <w:t>for</w:t>
+      </w:r>
+      <w:r>
+        <w:t xml:space="preserve"> Ready Meals </w:t>
+      </w:r>
+    </w:p>
+    <w:p>
+      <w:pPr>
+        <w:ind w:firstLine="360"/>
+      </w:pPr>
+      <w:r>
+        <w:t>Legal</w:t>
+      </w:r>
+      <w:r>
+        <w:t xml:space="preserve"> Considerations: </w:t>
       </w:r>
     </w:p>
     <w:p>
@@ -2040,100 +2253,43 @@
         <w:pStyle w:val="ListParagraph"/>
         <w:numPr>
           <w:ilvl w:val="0"/>
-          <w:numId w:val="18"/>
+          <w:numId w:val="21"/>
         </w:numPr>
       </w:pPr>
       <w:r>
-        <w:lastRenderedPageBreak/>
-        <w:t xml:space="preserve">Lead Time: </w:t>
-      </w:r>
-      <w:r>
-        <w:t>1</w:t>
-      </w:r>
-      <w:r>
-        <w:t xml:space="preserve"> day </w:t>
-      </w:r>
-      <w:r>
-        <w:t>if </w:t>
-      </w:r>
-      <w:r>
-        <w:t xml:space="preserve">the </w:t>
-      </w:r>
-      <w:r>
-        <w:t>order </w:t>
-      </w:r>
-      <w:r>
-        <w:t xml:space="preserve">is </w:t>
-      </w:r>
-      <w:r>
-        <w:t>placed before Thursday 1:15 PM (Friday delivery)</w:t>
-      </w:r>
-      <w:r>
-        <w:t>, 4 d</w:t>
-      </w:r>
-      <w:r>
-        <w:t>ays if an order is placed after Thursday 1:15 PM (Tuesday delivery)</w:t>
-      </w:r>
-    </w:p>
-    <w:p>
-      <w:r>
-        <w:t>Scenario 1: Ordering Before Thursday 1:15 PM (for Friday Delivery)</w:t>
-      </w:r>
-    </w:p>
-    <w:p>
-      <w:pPr>
-        <w:jc w:val="center"/>
-      </w:pPr>
-      <w:r>
-        <w:rPr>
-          <w:rFonts w:ascii="Cambria Math" w:hAnsi="Cambria Math" w:cs="Cambria Math"/>
-        </w:rPr>
-        <w:t xml:space="preserve">𝑅𝑂𝑃 </w:t>
-      </w:r>
-      <w:r>
-        <w:t>= (1.7 × 1)</w:t>
+        <w:t>FSAI Regulations on Food Safety: Ready meals should conform to safety norms regarding the storage conditions, handling, and expiry tracking</w:t>
       </w:r>
       <w:r>
         <w:t xml:space="preserve"> </w:t>
       </w:r>
-      <w:r>
-        <w:t>+</w:t>
-      </w:r>
-      <w:r>
-        <w:t xml:space="preserve"> </w:t>
-      </w:r>
-      <w:r>
-        <w:t>5</w:t>
-      </w:r>
-      <w:r>
-        <w:t xml:space="preserve"> </w:t>
-      </w:r>
-      <w:r>
-        <w:t>=</w:t>
-      </w:r>
-      <w:r>
-        <w:t xml:space="preserve"> </w:t>
-      </w:r>
-      <w:r>
-        <w:t>6.7</w:t>
-      </w:r>
-      <w:r>
-        <w:t xml:space="preserve"> </w:t>
-      </w:r>
-      <w:r>
-        <w:t>≈</w:t>
-      </w:r>
-      <w:r>
-        <w:t xml:space="preserve"> </w:t>
-      </w:r>
-      <w:r>
-        <w:t>7</w:t>
-      </w:r>
-      <w:r>
-        <w:t xml:space="preserve"> </w:t>
-      </w:r>
-      <w:r>
-        <w:t>bottle</w:t>
+      <w:sdt>
+        <w:sdtPr>
+          <w:id w:val="79418342"/>
+          <w:citation/>
+        </w:sdtPr>
+        <w:sdtContent>
+          <w:r>
+            <w:fldChar w:fldCharType="begin"/>
+          </w:r>
+          <w:r>
+            <w:instrText xml:space="preserve">CITATION Foo24 \l 6153 </w:instrText>
+          </w:r>
+          <w:r>
+            <w:fldChar w:fldCharType="separate"/>
+          </w:r>
+          <w:r>
+            <w:rPr>
+              <w:noProof/>
+            </w:rPr>
+            <w:t>(Food Safety Standards &amp; Regulations, 2024)</w:t>
+          </w:r>
+          <w:r>
+            <w:fldChar w:fldCharType="end"/>
+          </w:r>
+        </w:sdtContent>
+      </w:sdt>
+      <w:r>
+        <w:t xml:space="preserve">. </w:t>
       </w:r>
     </w:p>
     <w:p>
@@ -2141,42 +2297,43 @@
         <w:pStyle w:val="ListParagraph"/>
         <w:numPr>
           <w:ilvl w:val="0"/>
-          <w:numId w:val="17"/>
+          <w:numId w:val="21"/>
         </w:numPr>
       </w:pPr>
       <w:r>
-        <w:t xml:space="preserve">Safety Stock:  </w:t>
-      </w:r>
-      <w:r>
-        <w:t xml:space="preserve">Reorder when </w:t>
-      </w:r>
-      <w:r>
-        <w:t xml:space="preserve">the </w:t>
-      </w:r>
-      <w:r>
-        <w:t>stock reaches 7 bottles to receive delivery on Friday.</w:t>
-      </w:r>
-    </w:p>
-    <w:p>
-      <w:pPr>
-        <w:ind w:left="360"/>
-      </w:pPr>
-      <w:r>
-        <w:t>Scenario 2: Ordering After Thursday 1:15 PM (for Tuesday Delivery)</w:t>
-      </w:r>
-    </w:p>
-    <w:p>
-      <w:pPr>
-        <w:jc w:val="center"/>
-      </w:pPr>
-      <w:r>
-        <w:rPr>
-          <w:rFonts w:ascii="Cambria Math" w:hAnsi="Cambria Math" w:cs="Cambria Math"/>
-        </w:rPr>
-        <w:t xml:space="preserve">𝑅𝑂𝑃 </w:t>
-      </w:r>
-      <w:r>
-        <w:t>= (1.7 × 4) + 5 = 11.8 ≈ 12 bottles</w:t>
+        <w:t>EU Food Information to Consumers Regulation No 1169/2011: The labelling of nutritional information, allergens, and expiry dates must be accurate</w:t>
+      </w:r>
+      <w:r>
+        <w:t xml:space="preserve"> </w:t>
+      </w:r>
+      <w:sdt>
+        <w:sdtPr>
+          <w:id w:val="-593939032"/>
+          <w:citation/>
+        </w:sdtPr>
+        <w:sdtContent>
+          <w:r>
+            <w:fldChar w:fldCharType="begin"/>
+          </w:r>
+          <w:r>
+            <w:instrText xml:space="preserve"> CITATION Eur24 \l 6153 </w:instrText>
+          </w:r>
+          <w:r>
+            <w:fldChar w:fldCharType="separate"/>
+          </w:r>
+          <w:r>
+            <w:rPr>
+              <w:noProof/>
+            </w:rPr>
+            <w:t>(European Commission, 2024)</w:t>
+          </w:r>
+          <w:r>
+            <w:fldChar w:fldCharType="end"/>
+          </w:r>
+        </w:sdtContent>
+      </w:sdt>
+      <w:r>
+        <w:t xml:space="preserve">. </w:t>
       </w:r>
     </w:p>
     <w:p>
@@ -2184,418 +2341,294 @@
         <w:pStyle w:val="ListParagraph"/>
         <w:numPr>
           <w:ilvl w:val="0"/>
-          <w:numId w:val="17"/>
+          <w:numId w:val="21"/>
         </w:numPr>
       </w:pPr>
       <w:r>
-        <w:t xml:space="preserve">Safety Stock:  </w:t>
-      </w:r>
-      <w:r>
-        <w:t xml:space="preserve">Reorder when </w:t>
-      </w:r>
-      <w:r>
-        <w:t xml:space="preserve">the </w:t>
-      </w:r>
-      <w:r>
-        <w:t>stock reaches 12 bottles to receive delivery on Tuesday.</w:t>
+        <w:t xml:space="preserve">Waste Disposal Compliance: The proper disposal and recycling of food waste are governed by the European Union Waste Framework Directive 2008/98/EC with the purpose of minimizing </w:t>
+      </w:r>
+      <w:r>
+        <w:t>the</w:t>
+      </w:r>
+      <w:r>
+        <w:t xml:space="preserve"> impact on the environment</w:t>
+      </w:r>
+      <w:r>
+        <w:t xml:space="preserve"> </w:t>
+      </w:r>
+      <w:sdt>
+        <w:sdtPr>
+          <w:id w:val="-1534252573"/>
+          <w:citation/>
+        </w:sdtPr>
+        <w:sdtContent>
+          <w:r>
+            <w:fldChar w:fldCharType="begin"/>
+          </w:r>
+          <w:r>
+            <w:instrText xml:space="preserve"> CITATION Eur23 \l 6153 </w:instrText>
+          </w:r>
+          <w:r>
+            <w:fldChar w:fldCharType="separate"/>
+          </w:r>
+          <w:r>
+            <w:rPr>
+              <w:noProof/>
+            </w:rPr>
+            <w:t>(European Environment Agency (EEA), 2023)</w:t>
+          </w:r>
+          <w:r>
+            <w:fldChar w:fldCharType="end"/>
+          </w:r>
+        </w:sdtContent>
+      </w:sdt>
+      <w:r>
+        <w:t>.</w:t>
+      </w:r>
+      <w:r>
+        <w:t xml:space="preserve"> Competitive Advantage for Lotts &amp; Co.</w:t>
+      </w:r>
+    </w:p>
+    <w:p>
+      <w:pPr>
+        <w:ind w:left="720"/>
+      </w:pPr>
+      <w:r>
+        <w:t xml:space="preserve">Food Waste Reduction &amp; Sustainability </w:t>
+      </w:r>
+    </w:p>
+    <w:p>
+      <w:pPr>
+        <w:pStyle w:val="ListParagraph"/>
+        <w:numPr>
+          <w:ilvl w:val="0"/>
+          <w:numId w:val="22"/>
+        </w:numPr>
+      </w:pPr>
+      <w:r>
+        <w:t xml:space="preserve">Minimizing Food Waste: </w:t>
+      </w:r>
+      <w:r>
+        <w:t>By reducing over-ordering through utilization of analytics, stock control for instance is promoted to the sustainable management of them</w:t>
+      </w:r>
+      <w:r>
+        <w:t xml:space="preserve"> </w:t>
+      </w:r>
+      <w:sdt>
+        <w:sdtPr>
+          <w:id w:val="312838827"/>
+          <w:citation/>
+        </w:sdtPr>
+        <w:sdtContent>
+          <w:r>
+            <w:fldChar w:fldCharType="begin"/>
+          </w:r>
+          <w:r>
+            <w:instrText xml:space="preserve"> CITATION WRA23 \l 6153 </w:instrText>
+          </w:r>
+          <w:r>
+            <w:fldChar w:fldCharType="separate"/>
+          </w:r>
+          <w:r>
+            <w:rPr>
+              <w:noProof/>
+            </w:rPr>
+            <w:t>(WRAP UK, 2023)</w:t>
+          </w:r>
+          <w:r>
+            <w:fldChar w:fldCharType="end"/>
+          </w:r>
+        </w:sdtContent>
+      </w:sdt>
+    </w:p>
+    <w:p>
+      <w:r>
+        <w:t>8. Competitive Advantage for Lotts &amp; Co.</w:t>
+      </w:r>
+    </w:p>
+    <w:p>
+      <w:r>
+        <w:t>Avoiding out-of-stock</w:t>
+      </w:r>
+    </w:p>
+    <w:p>
+      <w:r>
+        <w:t xml:space="preserve">All best-selling ready meals will always be available, ensuring that sales are not lost, </w:t>
+      </w:r>
+      <w:r>
+        <w:t>and increasing loyalty of customers.</w:t>
+      </w:r>
+    </w:p>
+    <w:p>
+      <w:r>
+        <w:t xml:space="preserve">Stockouts result </w:t>
+      </w:r>
+      <w:r>
+        <w:t xml:space="preserve">reduce customer </w:t>
+      </w:r>
+      <w:r>
+        <w:t>in retention by up to 30%</w:t>
+      </w:r>
+      <w:r>
+        <w:t xml:space="preserve"> </w:t>
+      </w:r>
+      <w:sdt>
+        <w:sdtPr>
+          <w:id w:val="-337395834"/>
+          <w:citation/>
+        </w:sdtPr>
+        <w:sdtContent>
+          <w:r>
+            <w:fldChar w:fldCharType="begin"/>
+          </w:r>
+          <w:r>
+            <w:instrText xml:space="preserve"> CITATION Dan04 \l 6153 </w:instrText>
+          </w:r>
+          <w:r>
+            <w:fldChar w:fldCharType="separate"/>
+          </w:r>
+          <w:r>
+            <w:rPr>
+              <w:noProof/>
+            </w:rPr>
+            <w:t>(Corsten &amp; Gruen, 2004)</w:t>
+          </w:r>
+          <w:r>
+            <w:fldChar w:fldCharType="end"/>
+          </w:r>
+        </w:sdtContent>
+      </w:sdt>
+      <w:r>
+        <w:t xml:space="preserve"> since when </w:t>
+      </w:r>
+      <w:r>
+        <w:t xml:space="preserve">frequently </w:t>
+      </w:r>
+      <w:r>
+        <w:t>out-of-</w:t>
+      </w:r>
+      <w:r>
+        <w:t>stock</w:t>
+      </w:r>
+      <w:r>
+        <w:t xml:space="preserve"> </w:t>
+      </w:r>
+      <w:r>
+        <w:t>products customers</w:t>
+      </w:r>
+      <w:r>
+        <w:t xml:space="preserve"> can easily switch to </w:t>
+      </w:r>
+      <w:r>
+        <w:t xml:space="preserve">competitors </w:t>
+      </w:r>
+    </w:p>
+    <w:p>
+      <w:r>
+        <w:lastRenderedPageBreak/>
+        <w:t>Meal stock levels</w:t>
+      </w:r>
+    </w:p>
+    <w:p>
+      <w:r>
+        <w:t>By predictive analytics, food waste is reduced by as much as 40%, avoiding unnecessary losses</w:t>
+      </w:r>
+      <w:r>
+        <w:t xml:space="preserve"> </w:t>
+      </w:r>
+      <w:sdt>
+        <w:sdtPr>
+          <w:id w:val="74941267"/>
+          <w:citation/>
+        </w:sdtPr>
+        <w:sdtContent>
+          <w:r>
+            <w:fldChar w:fldCharType="begin"/>
+          </w:r>
+          <w:r>
+            <w:instrText xml:space="preserve"> CITATION WRA231 \l 6153 </w:instrText>
+          </w:r>
+          <w:r>
+            <w:fldChar w:fldCharType="separate"/>
+          </w:r>
+          <w:r>
+            <w:rPr>
+              <w:noProof/>
+            </w:rPr>
+            <w:t>(WRAP UK, 2023)</w:t>
+          </w:r>
+          <w:r>
+            <w:fldChar w:fldCharType="end"/>
+          </w:r>
+        </w:sdtContent>
+      </w:sdt>
+      <w:r>
+        <w:t xml:space="preserve">. </w:t>
+      </w:r>
+      <w:r>
+        <w:t xml:space="preserve">Helps order the right size quantities, to avoid over stock and storage costs. </w:t>
+      </w:r>
+    </w:p>
+    <w:p>
+      <w:r>
+        <w:t xml:space="preserve">When optimized the inventory systems can </w:t>
+      </w:r>
+      <w:r>
+        <w:t>increase</w:t>
+      </w:r>
+      <w:r>
+        <w:t xml:space="preserve"> 5-10% annually </w:t>
+      </w:r>
+      <w:sdt>
+        <w:sdtPr>
+          <w:id w:val="-625164119"/>
+          <w:citation/>
+        </w:sdtPr>
+        <w:sdtContent>
+          <w:r>
+            <w:fldChar w:fldCharType="begin"/>
+          </w:r>
+          <w:r>
+            <w:instrText xml:space="preserve"> CITATION ByJ25 \l 6153 </w:instrText>
+          </w:r>
+          <w:r>
+            <w:fldChar w:fldCharType="separate"/>
+          </w:r>
+          <w:r>
+            <w:rPr>
+              <w:noProof/>
+            </w:rPr>
+            <w:t>(Sharma, et al., 2025)</w:t>
+          </w:r>
+          <w:r>
+            <w:fldChar w:fldCharType="end"/>
+          </w:r>
+        </w:sdtContent>
+      </w:sdt>
+      <w:r>
+        <w:t>, d</w:t>
+      </w:r>
+      <w:r>
+        <w:t>ocuments of Boston Consulting Group often tell that the companies are reported to be getting a considerable amount of profit annually by adopting optimized inventory systems.</w:t>
+      </w:r>
+    </w:p>
+    <w:p>
+      <w:r>
+        <w:t>9. Conclusion &amp; Recommendations</w:t>
       </w:r>
     </w:p>
     <w:p>
       <w:pPr>
         <w:ind w:firstLine="360"/>
       </w:pPr>
-      <w:r>
-        <w:t xml:space="preserve">Overall, this procedure appears to ensure that </w:t>
-      </w:r>
-      <w:r>
-        <w:t xml:space="preserve">the stock </w:t>
-      </w:r>
-      <w:r>
-        <w:t xml:space="preserve">is replenished </w:t>
-      </w:r>
-      <w:r>
-        <w:t>in time</w:t>
-      </w:r>
-      <w:r>
-        <w:t xml:space="preserve"> </w:t>
-      </w:r>
-      <w:r>
-        <w:t>preventing shortage</w:t>
-      </w:r>
-      <w:r>
-        <w:t xml:space="preserve">, while also minimizing </w:t>
-      </w:r>
-      <w:r>
-        <w:t>excess</w:t>
-      </w:r>
-      <w:r>
-        <w:t xml:space="preserve"> inventory.</w:t>
-      </w:r>
-    </w:p>
-    <w:p>
-      <w:pPr>
-        <w:ind w:firstLine="360"/>
-      </w:pPr>
-    </w:p>
-    <w:p>
-      <w:pPr>
-        <w:ind w:firstLine="360"/>
-      </w:pPr>
-      <w:r>
-        <w:t>7. Legal &amp; Ethical Considerations</w:t>
-      </w:r>
-    </w:p>
-    <w:p>
-      <w:pPr>
-        <w:ind w:firstLine="360"/>
-      </w:pPr>
-      <w:r>
-        <w:rPr>
-          <w:rFonts w:ascii="Segoe UI Emoji" w:hAnsi="Segoe UI Emoji" w:cs="Segoe UI Emoji"/>
-        </w:rPr>
-        <w:t>✅</w:t>
-      </w:r>
-      <w:r>
-        <w:t xml:space="preserve"> No Personal Data Used: Only product sales data </w:t>
-      </w:r>
-      <w:proofErr w:type="spellStart"/>
-      <w:r>
-        <w:t>analyzed</w:t>
-      </w:r>
-      <w:proofErr w:type="spellEnd"/>
-      <w:r>
-        <w:t>, ensuring GDPR compliance.</w:t>
-      </w:r>
-    </w:p>
-    <w:p>
-      <w:pPr>
-        <w:ind w:firstLine="360"/>
-      </w:pPr>
-      <w:r>
-        <w:rPr>
-          <w:rFonts w:ascii="Segoe UI Emoji" w:hAnsi="Segoe UI Emoji" w:cs="Segoe UI Emoji"/>
-        </w:rPr>
-        <w:t>✅</w:t>
-      </w:r>
-      <w:r>
-        <w:t xml:space="preserve"> Ethical Data Use: Insights focus on stock trends, not individual customer </w:t>
-      </w:r>
-      <w:proofErr w:type="spellStart"/>
-      <w:r>
-        <w:t>behaviors</w:t>
-      </w:r>
-      <w:proofErr w:type="spellEnd"/>
-      <w:r>
-        <w:t>.</w:t>
-      </w:r>
-    </w:p>
-    <w:p>
-      <w:pPr>
-        <w:ind w:firstLine="360"/>
-      </w:pPr>
-      <w:r>
-        <w:rPr>
-          <w:rFonts w:ascii="Segoe UI Emoji" w:hAnsi="Segoe UI Emoji" w:cs="Segoe UI Emoji"/>
-        </w:rPr>
-        <w:t>✅</w:t>
-      </w:r>
-      <w:r>
-        <w:t xml:space="preserve"> Accuracy &amp; Transparency: Data should be verified for accuracy before making business decisions.</w:t>
-      </w:r>
-    </w:p>
-    <w:p>
-      <w:pPr>
-        <w:ind w:firstLine="360"/>
-      </w:pPr>
-      <w:r>
-        <w:t>8. Competitive Advantage for Lotts &amp; Co.</w:t>
-      </w:r>
-    </w:p>
-    <w:p>
-      <w:pPr>
-        <w:ind w:firstLine="360"/>
-      </w:pPr>
-      <w:r>
-        <w:rPr>
-          <w:rFonts w:ascii="Segoe UI Emoji" w:hAnsi="Segoe UI Emoji" w:cs="Segoe UI Emoji"/>
-        </w:rPr>
-        <w:t>📌</w:t>
-      </w:r>
-      <w:r>
-        <w:t xml:space="preserve"> How This Project Helps Lotts &amp; Co. Compete Better: </w:t>
-      </w:r>
-      <w:r>
-        <w:rPr>
-          <w:rFonts w:ascii="Segoe UI Emoji" w:hAnsi="Segoe UI Emoji" w:cs="Segoe UI Emoji"/>
-        </w:rPr>
-        <w:t>✅</w:t>
-      </w:r>
-      <w:r>
-        <w:t xml:space="preserve"> Reduces Stockouts </w:t>
-      </w:r>
-      <w:r>
-        <w:rPr>
-          <w:rFonts w:ascii="Aptos" w:hAnsi="Aptos" w:cs="Aptos"/>
-        </w:rPr>
-        <w:t>→</w:t>
-      </w:r>
-      <w:r>
-        <w:t xml:space="preserve"> Ensures best-selling wines are always available. </w:t>
-      </w:r>
-      <w:r>
-        <w:rPr>
-          <w:rFonts w:ascii="Segoe UI Emoji" w:hAnsi="Segoe UI Emoji" w:cs="Segoe UI Emoji"/>
-        </w:rPr>
-        <w:t>✅</w:t>
-      </w:r>
-      <w:r>
-        <w:t xml:space="preserve"> Data-Driven Ordering </w:t>
-      </w:r>
-      <w:r>
-        <w:rPr>
-          <w:rFonts w:ascii="Aptos" w:hAnsi="Aptos" w:cs="Aptos"/>
-        </w:rPr>
-        <w:t>→</w:t>
-      </w:r>
-      <w:r>
-        <w:t xml:space="preserve"> Avoids overstocking &amp; ties up less capital. </w:t>
-      </w:r>
-      <w:r>
-        <w:rPr>
-          <w:rFonts w:ascii="Segoe UI Emoji" w:hAnsi="Segoe UI Emoji" w:cs="Segoe UI Emoji"/>
-        </w:rPr>
-        <w:t>✅</w:t>
-      </w:r>
-      <w:r>
-        <w:t xml:space="preserve"> Improved Supplier Coordination </w:t>
-      </w:r>
-      <w:r>
-        <w:rPr>
-          <w:rFonts w:ascii="Aptos" w:hAnsi="Aptos" w:cs="Aptos"/>
-        </w:rPr>
-        <w:t>→</w:t>
-      </w:r>
-      <w:r>
-        <w:t xml:space="preserve"> Orders based on real sales data, not guesswork. </w:t>
-      </w:r>
-      <w:r>
-        <w:rPr>
-          <w:rFonts w:ascii="Segoe UI Emoji" w:hAnsi="Segoe UI Emoji" w:cs="Segoe UI Emoji"/>
-        </w:rPr>
-        <w:t>✅</w:t>
-      </w:r>
-      <w:r>
-        <w:t xml:space="preserve"> Supports Future Growth </w:t>
-      </w:r>
-      <w:r>
-        <w:rPr>
-          <w:rFonts w:ascii="Aptos" w:hAnsi="Aptos" w:cs="Aptos"/>
-        </w:rPr>
-        <w:t>→</w:t>
-      </w:r>
-      <w:r>
-        <w:t xml:space="preserve"> Can scale with other product categories (cheese, bread, deli).</w:t>
-      </w:r>
-    </w:p>
-    <w:p>
-      <w:pPr>
-        <w:ind w:firstLine="360"/>
-      </w:pPr>
-      <w:r>
-        <w:t>9. Conclusion &amp; Recommendations</w:t>
-      </w:r>
-    </w:p>
-    <w:p>
-      <w:pPr>
-        <w:ind w:firstLine="360"/>
-      </w:pPr>
-      <w:r>
-        <w:rPr>
-          <w:rFonts w:ascii="Segoe UI Emoji" w:hAnsi="Segoe UI Emoji" w:cs="Segoe UI Emoji"/>
-        </w:rPr>
-        <w:t>📌</w:t>
-      </w:r>
-      <w:r>
-        <w:t xml:space="preserve"> Key Takeaways:</w:t>
-      </w:r>
-    </w:p>
-    <w:p>
-      <w:pPr>
-        <w:ind w:firstLine="360"/>
-      </w:pPr>
-      <w:r>
-        <w:t>•</w:t>
-      </w:r>
-      <w:r>
-        <w:tab/>
-        <w:t>Wine stockouts are a recurring issue.</w:t>
-      </w:r>
-    </w:p>
-    <w:p>
-      <w:pPr>
-        <w:ind w:firstLine="360"/>
-      </w:pPr>
-      <w:r>
-        <w:t>•</w:t>
-      </w:r>
-      <w:r>
-        <w:tab/>
-        <w:t>Data analytics helps predict demand &amp; optimize orders.</w:t>
-      </w:r>
-    </w:p>
-    <w:p>
-      <w:pPr>
-        <w:ind w:firstLine="360"/>
-      </w:pPr>
-      <w:r>
-        <w:t>•</w:t>
-      </w:r>
-      <w:r>
-        <w:tab/>
-        <w:t>Automating inventory insights will improve efficiency.</w:t>
-      </w:r>
-    </w:p>
-    <w:p>
-      <w:pPr>
-        <w:ind w:firstLine="360"/>
-      </w:pPr>
-      <w:r>
-        <w:rPr>
-          <w:rFonts w:ascii="Segoe UI Emoji" w:hAnsi="Segoe UI Emoji" w:cs="Segoe UI Emoji"/>
-        </w:rPr>
-        <w:t>📌</w:t>
-      </w:r>
-      <w:r>
-        <w:t xml:space="preserve"> Next Steps for Lotts &amp; Co.:</w:t>
-      </w:r>
-    </w:p>
-    <w:p>
-      <w:pPr>
-        <w:ind w:firstLine="360"/>
-      </w:pPr>
-      <w:r>
-        <w:t>•</w:t>
-      </w:r>
-      <w:r>
-        <w:tab/>
-        <w:t>Implement Power BI dashboards for real-time stock tracking.</w:t>
-      </w:r>
-    </w:p>
-    <w:p>
-      <w:pPr>
-        <w:ind w:firstLine="360"/>
-      </w:pPr>
-      <w:r>
-        <w:t>•</w:t>
-      </w:r>
-      <w:r>
-        <w:tab/>
-        <w:t>Introduce automated reorder points based on sales trends.</w:t>
-      </w:r>
-    </w:p>
-    <w:p>
-      <w:pPr>
-        <w:ind w:firstLine="360"/>
-      </w:pPr>
-      <w:r>
-        <w:t>•</w:t>
-      </w:r>
-      <w:r>
-        <w:tab/>
-        <w:t>Expand the model to other categories (cheese, bread, deli).</w:t>
-      </w:r>
-    </w:p>
-    <w:p>
-      <w:pPr>
-        <w:ind w:firstLine="360"/>
-      </w:pPr>
-      <w:r>
-        <w:rPr>
-          <w:rFonts w:ascii="Segoe UI Emoji" w:hAnsi="Segoe UI Emoji" w:cs="Segoe UI Emoji"/>
-        </w:rPr>
-        <w:t>🚀</w:t>
-      </w:r>
-      <w:r>
-        <w:t xml:space="preserve"> Final Thought: Data-driven inventory management will reduce losses and increase efficiency at Lotts &amp; Co.</w:t>
-      </w:r>
-    </w:p>
-    <w:p>
-      <w:pPr>
-        <w:ind w:firstLine="360"/>
-      </w:pPr>
-      <w:r>
-        <w:lastRenderedPageBreak/>
-        <w:t>7.</w:t>
-      </w:r>
-      <w:r>
-        <w:tab/>
-        <w:t>Legal &amp; Ethical Considerations</w:t>
-      </w:r>
-    </w:p>
-    <w:p>
-      <w:pPr>
-        <w:ind w:firstLine="360"/>
-      </w:pPr>
-      <w:r>
-        <w:t>8.</w:t>
-      </w:r>
-      <w:r>
-        <w:tab/>
-        <w:t>Competitive Advantage for Lotts &amp; Co.</w:t>
-      </w:r>
-    </w:p>
-    <w:p>
-      <w:pPr>
-        <w:ind w:firstLine="360"/>
-      </w:pPr>
-      <w:r>
-        <w:t>9.</w:t>
-      </w:r>
-      <w:r>
-        <w:tab/>
-        <w:t>Conclusion &amp; Recommendations</w:t>
-      </w:r>
-    </w:p>
-    <w:p/>
+    </w:p>
     <w:p>
       <w:r>
         <w:br w:type="page"/>
-      </w:r>
-      <w:r>
-        <w:lastRenderedPageBreak/>
-        <w:t xml:space="preserve">Read meal </w:t>
-      </w:r>
-      <w:r>
-        <w:t>sandwich</w:t>
-      </w:r>
-      <w:r>
-        <w:t xml:space="preserve"> </w:t>
-      </w:r>
-    </w:p>
-    <w:p>
-      <w:r>
-        <w:t>kevin@lottsandco.ie</w:t>
-      </w:r>
-    </w:p>
-    <w:p/>
-    <w:p>
-      <w:r>
-        <w:t>Point of sale</w:t>
-      </w:r>
-    </w:p>
-    <w:p>
-      <w:r>
-        <w:t xml:space="preserve">Reduced price </w:t>
       </w:r>
     </w:p>
     <w:sdt>
       <w:sdtPr>
-        <w:rPr>
-          <w:rFonts w:asciiTheme="minorHAnsi" w:eastAsiaTheme="minorHAnsi" w:hAnsiTheme="minorHAnsi" w:cstheme="minorBidi"/>
-          <w:color w:val="auto"/>
-          <w:sz w:val="22"/>
-          <w:szCs w:val="22"/>
-        </w:rPr>
         <w:id w:val="-1632932086"/>
         <w:docPartObj>
           <w:docPartGallery w:val="Bibliographies"/>
@@ -2604,9 +2637,6 @@
       </w:sdtPr>
       <w:sdtContent>
         <w:p>
-          <w:pPr>
-            <w:pStyle w:val="Heading1"/>
-          </w:pPr>
           <w:r>
             <w:t>References</w:t>
           </w:r>
@@ -2622,10 +2652,6 @@
                 <w:pStyle w:val="Bibliography"/>
                 <w:rPr>
                   <w:noProof/>
-                  <w:kern w:val="0"/>
-                  <w:sz w:val="24"/>
-                  <w:szCs w:val="24"/>
-                  <w14:ligatures w14:val="none"/>
                 </w:rPr>
               </w:pPr>
               <w:r>
@@ -2641,7 +2667,91 @@
                 <w:rPr>
                   <w:noProof/>
                 </w:rPr>
-                <w:t>Anon., n.d. [Online].</w:t>
+                <w:t xml:space="preserve">Biswal, A., 2025. </w:t>
+              </w:r>
+              <w:r>
+                <w:rPr>
+                  <w:i/>
+                  <w:iCs/>
+                  <w:noProof/>
+                </w:rPr>
+                <w:t xml:space="preserve">Power BI vs Tableau: Which Is Better Data Visualization Tool. </w:t>
+              </w:r>
+              <w:r>
+                <w:rPr>
+                  <w:noProof/>
+                </w:rPr>
+                <w:t xml:space="preserve">[Online] </w:t>
+              </w:r>
+              <w:r>
+                <w:rPr>
+                  <w:noProof/>
+                </w:rPr>
+                <w:br/>
+                <w:t xml:space="preserve">Available at: </w:t>
+              </w:r>
+              <w:r>
+                <w:rPr>
+                  <w:noProof/>
+                  <w:u w:val="single"/>
+                </w:rPr>
+                <w:t>https://www.simplilearn.com/tutorials/power-bi-tutorial/power-bi-vs-tableau#GoTop</w:t>
+              </w:r>
+              <w:r>
+                <w:rPr>
+                  <w:noProof/>
+                </w:rPr>
+                <w:br/>
+                <w:t>[Accessed 03 03 2025].</w:t>
+              </w:r>
+            </w:p>
+            <w:p>
+              <w:pPr>
+                <w:pStyle w:val="Bibliography"/>
+                <w:rPr>
+                  <w:noProof/>
+                </w:rPr>
+              </w:pPr>
+              <w:r>
+                <w:rPr>
+                  <w:noProof/>
+                </w:rPr>
+                <w:t xml:space="preserve">Consumer Goods, 2020. </w:t>
+              </w:r>
+              <w:r>
+                <w:rPr>
+                  <w:i/>
+                  <w:iCs/>
+                  <w:noProof/>
+                </w:rPr>
+                <w:t xml:space="preserve">Ready Meals Market Size, Share &amp; Trends Analysis Report By Product 2022-2030. </w:t>
+              </w:r>
+              <w:r>
+                <w:rPr>
+                  <w:noProof/>
+                </w:rPr>
+                <w:t xml:space="preserve">[Online] </w:t>
+              </w:r>
+              <w:r>
+                <w:rPr>
+                  <w:noProof/>
+                </w:rPr>
+                <w:br/>
+                <w:t xml:space="preserve">Available at: </w:t>
+              </w:r>
+              <w:r>
+                <w:rPr>
+                  <w:noProof/>
+                  <w:u w:val="single"/>
+                </w:rPr>
+                <w:t>https://www.grandviewresearch.com/industry-analysis/ready-meals-market</w:t>
+              </w:r>
+              <w:r>
+                <w:rPr>
+                  <w:noProof/>
+                </w:rPr>
+                <w:br/>
+                <w:t>[Accessed 01 03 2025].</w:t>
               </w:r>
             </w:p>
             <w:p>
@@ -2704,7 +2814,7 @@
                 <w:rPr>
                   <w:noProof/>
                 </w:rPr>
-                <w:t xml:space="preserve">North Bay Distribution, 2024. </w:t>
+                <w:t xml:space="preserve">European Commission, 2024. </w:t>
               </w:r>
               <w:r>
                 <w:rPr>
@@ -2712,7 +2822,7 @@
                   <w:iCs/>
                   <w:noProof/>
                 </w:rPr>
-                <w:t xml:space="preserve">North Bay Distribution INC. </w:t>
+                <w:t xml:space="preserve">Food Information Regulation (EU) No 1169/2011. </w:t>
               </w:r>
               <w:r>
                 <w:rPr>
@@ -2732,14 +2842,210 @@
                   <w:noProof/>
                   <w:u w:val="single"/>
                 </w:rPr>
-                <w:t>https://nbd3pl.com/fulfillment/realizing-supply-chain-efficiency-with-advanced-analytics/?utm_source=chatgpt.com</w:t>
+                <w:t>https://commission.europa.eu/index_en</w:t>
               </w:r>
               <w:r>
                 <w:rPr>
                   <w:noProof/>
                 </w:rPr>
                 <w:br/>
-                <w:t>[Accessed 25 02 2025].</w:t>
+                <w:t>[Accessed 01 03 2025].</w:t>
+              </w:r>
+            </w:p>
+            <w:p>
+              <w:pPr>
+                <w:pStyle w:val="Bibliography"/>
+                <w:rPr>
+                  <w:noProof/>
+                </w:rPr>
+              </w:pPr>
+              <w:r>
+                <w:rPr>
+                  <w:noProof/>
+                </w:rPr>
+                <w:t xml:space="preserve">European Environment Agency (EEA), 2023. </w:t>
+              </w:r>
+              <w:r>
+                <w:rPr>
+                  <w:i/>
+                  <w:iCs/>
+                  <w:noProof/>
+                </w:rPr>
+                <w:t xml:space="preserve">Food Waste and Sustainability Policies in the EU. </w:t>
+              </w:r>
+              <w:r>
+                <w:rPr>
+                  <w:noProof/>
+                </w:rPr>
+                <w:t xml:space="preserve">[Online] </w:t>
+              </w:r>
+              <w:r>
+                <w:rPr>
+                  <w:noProof/>
+                </w:rPr>
+                <w:br/>
+                <w:t xml:space="preserve">Available at: </w:t>
+              </w:r>
+              <w:r>
+                <w:rPr>
+                  <w:noProof/>
+                  <w:u w:val="single"/>
+                </w:rPr>
+                <w:t>https://www.eea.europa.eu/en</w:t>
+              </w:r>
+              <w:r>
+                <w:rPr>
+                  <w:noProof/>
+                </w:rPr>
+                <w:br/>
+                <w:t>[Accessed 01 03 2025].</w:t>
+              </w:r>
+            </w:p>
+            <w:p>
+              <w:pPr>
+                <w:pStyle w:val="Bibliography"/>
+                <w:rPr>
+                  <w:noProof/>
+                </w:rPr>
+              </w:pPr>
+              <w:r>
+                <w:rPr>
+                  <w:noProof/>
+                </w:rPr>
+                <w:t xml:space="preserve">Food Safety Standards &amp; Regulations, 2024. </w:t>
+              </w:r>
+              <w:r>
+                <w:rPr>
+                  <w:i/>
+                  <w:iCs/>
+                  <w:noProof/>
+                </w:rPr>
+                <w:t xml:space="preserve">Food Safety Authority of Ireland (FSAI). </w:t>
+              </w:r>
+              <w:r>
+                <w:rPr>
+                  <w:noProof/>
+                </w:rPr>
+                <w:t xml:space="preserve">[Online] </w:t>
+              </w:r>
+              <w:r>
+                <w:rPr>
+                  <w:noProof/>
+                </w:rPr>
+                <w:br/>
+                <w:t xml:space="preserve">Available at: </w:t>
+              </w:r>
+              <w:r>
+                <w:rPr>
+                  <w:noProof/>
+                  <w:u w:val="single"/>
+                </w:rPr>
+                <w:t>https://www.fsai.ie/</w:t>
+              </w:r>
+              <w:r>
+                <w:rPr>
+                  <w:noProof/>
+                </w:rPr>
+                <w:br/>
+                <w:t>[Accessed 01 03 2025].</w:t>
+              </w:r>
+            </w:p>
+            <w:p>
+              <w:pPr>
+                <w:pStyle w:val="Bibliography"/>
+                <w:rPr>
+                  <w:noProof/>
+                </w:rPr>
+              </w:pPr>
+              <w:r>
+                <w:rPr>
+                  <w:noProof/>
+                </w:rPr>
+                <w:t xml:space="preserve">Fortune Business Insights , 2025. </w:t>
+              </w:r>
+              <w:r>
+                <w:rPr>
+                  <w:i/>
+                  <w:iCs/>
+                  <w:noProof/>
+                </w:rPr>
+                <w:t xml:space="preserve">Food Processing &amp; Processed Food. </w:t>
+              </w:r>
+              <w:r>
+                <w:rPr>
+                  <w:noProof/>
+                </w:rPr>
+                <w:t xml:space="preserve">[Online] </w:t>
+              </w:r>
+              <w:r>
+                <w:rPr>
+                  <w:noProof/>
+                </w:rPr>
+                <w:br/>
+                <w:t xml:space="preserve">Available at: </w:t>
+              </w:r>
+              <w:r>
+                <w:rPr>
+                  <w:noProof/>
+                  <w:u w:val="single"/>
+                </w:rPr>
+                <w:t>http://fortunebusinessinsights.com/ready-to-eat-foods-market-110704</w:t>
+              </w:r>
+              <w:r>
+                <w:rPr>
+                  <w:noProof/>
+                </w:rPr>
+                <w:br/>
+                <w:t>[Accessed 01 03 2025].</w:t>
+              </w:r>
+            </w:p>
+            <w:p>
+              <w:pPr>
+                <w:pStyle w:val="Bibliography"/>
+                <w:rPr>
+                  <w:noProof/>
+                </w:rPr>
+              </w:pPr>
+              <w:r>
+                <w:rPr>
+                  <w:noProof/>
+                </w:rPr>
+                <w:t xml:space="preserve">Python, 2024. </w:t>
+              </w:r>
+              <w:r>
+                <w:rPr>
+                  <w:i/>
+                  <w:iCs/>
+                  <w:noProof/>
+                </w:rPr>
+                <w:t xml:space="preserve">Noble Desktop. </w:t>
+              </w:r>
+              <w:r>
+                <w:rPr>
+                  <w:noProof/>
+                </w:rPr>
+                <w:t xml:space="preserve">[Online] </w:t>
+              </w:r>
+              <w:r>
+                <w:rPr>
+                  <w:noProof/>
+                </w:rPr>
+                <w:br/>
+                <w:t xml:space="preserve">Available at: </w:t>
+              </w:r>
+              <w:r>
+                <w:rPr>
+                  <w:noProof/>
+                  <w:u w:val="single"/>
+                </w:rPr>
+                <w:t>https://www.nobledesktop.com/learn/python/transitioning-from-excel-to-python-for-data-analysis-key-differences</w:t>
+              </w:r>
+              <w:r>
+                <w:rPr>
+                  <w:noProof/>
+                </w:rPr>
+                <w:br/>
+                <w:t>[Accessed 2025 03 01].</w:t>
               </w:r>
             </w:p>
             <w:p>
@@ -2802,7 +3108,7 @@
                 <w:rPr>
                   <w:noProof/>
                 </w:rPr>
-                <w:t xml:space="preserve">Turovski, M., 2023. </w:t>
+                <w:t xml:space="preserve">The Business Research Company, 2025. </w:t>
               </w:r>
               <w:r>
                 <w:rPr>
@@ -2810,7 +3116,7 @@
                   <w:iCs/>
                   <w:noProof/>
                 </w:rPr>
-                <w:t xml:space="preserve">MRPeasy. </w:t>
+                <w:t xml:space="preserve">https://www.thebusinessresearchcompany.com/report/ready-meals-global-market-report. </w:t>
               </w:r>
               <w:r>
                 <w:rPr>
@@ -2830,14 +3136,63 @@
                   <w:noProof/>
                   <w:u w:val="single"/>
                 </w:rPr>
-                <w:t>https://www.mrpeasy.com/blog/what-is-reorder-point-and-reorder-point-formula/#:~:text=The%20reorder%20point%20formula%20is,rate)%20%2B%20safety%20stock%20level.</w:t>
+                <w:t>https://www.thebusinessresearchcompany.com/report/ready-meals-global-market-report</w:t>
               </w:r>
               <w:r>
                 <w:rPr>
                   <w:noProof/>
                 </w:rPr>
                 <w:br/>
-                <w:t>[Accessed 26 02 2025].</w:t>
+                <w:t>[Accessed 01 03 2025].</w:t>
+              </w:r>
+            </w:p>
+            <w:p>
+              <w:pPr>
+                <w:pStyle w:val="Bibliography"/>
+                <w:rPr>
+                  <w:noProof/>
+                </w:rPr>
+              </w:pPr>
+              <w:r>
+                <w:rPr>
+                  <w:noProof/>
+                </w:rPr>
+                <w:t xml:space="preserve">WRAP UK, 2023. </w:t>
+              </w:r>
+              <w:r>
+                <w:rPr>
+                  <w:i/>
+                  <w:iCs/>
+                  <w:noProof/>
+                </w:rPr>
+                <w:t xml:space="preserve">Reducing Food Waste with Data Analytics in Retail. </w:t>
+              </w:r>
+              <w:r>
+                <w:rPr>
+                  <w:noProof/>
+                </w:rPr>
+                <w:t xml:space="preserve">[Online] </w:t>
+              </w:r>
+              <w:r>
+                <w:rPr>
+                  <w:noProof/>
+                </w:rPr>
+                <w:br/>
+                <w:t xml:space="preserve">Available at: </w:t>
+              </w:r>
+              <w:r>
+                <w:rPr>
+                  <w:noProof/>
+                  <w:u w:val="single"/>
+                </w:rPr>
+                <w:t>https://www.wrap.ngo/eu</w:t>
+              </w:r>
+              <w:r>
+                <w:rPr>
+                  <w:noProof/>
+                </w:rPr>
+                <w:br/>
+                <w:t>[Accessed 01 03 2025].</w:t>
               </w:r>
             </w:p>
             <w:p>
@@ -2847,6 +3202,7 @@
                   <w:bCs/>
                   <w:noProof/>
                 </w:rPr>
+                <w:lastRenderedPageBreak/>
                 <w:fldChar w:fldCharType="end"/>
               </w:r>
             </w:p>
@@ -3989,6 +4345,119 @@
     </w:lvl>
   </w:abstractNum>
   <w:abstractNum w:abstractNumId="8" w15:restartNumberingAfterBreak="0">
+    <w:nsid w:val="2A4600BC"/>
+    <w:multiLevelType w:val="hybridMultilevel"/>
+    <w:tmpl w:val="C7E42AD2"/>
+    <w:lvl w:ilvl="0" w:tplc="18090001">
+      <w:start w:val="1"/>
+      <w:numFmt w:val="bullet"/>
+      <w:lvlText w:val=""/>
+      <w:lvlJc w:val="left"/>
+      <w:pPr>
+        <w:ind w:left="1080" w:hanging="360"/>
+      </w:pPr>
+      <w:rPr>
+        <w:rFonts w:ascii="Symbol" w:hAnsi="Symbol" w:hint="default"/>
+      </w:rPr>
+    </w:lvl>
+    <w:lvl w:ilvl="1" w:tplc="18090003" w:tentative="1">
+      <w:start w:val="1"/>
+      <w:numFmt w:val="bullet"/>
+      <w:lvlText w:val="o"/>
+      <w:lvlJc w:val="left"/>
+      <w:pPr>
+        <w:ind w:left="1800" w:hanging="360"/>
+      </w:pPr>
+      <w:rPr>
+        <w:rFonts w:ascii="Courier New" w:hAnsi="Courier New" w:cs="Courier New" w:hint="default"/>
+      </w:rPr>
+    </w:lvl>
+    <w:lvl w:ilvl="2" w:tplc="18090005" w:tentative="1">
+      <w:start w:val="1"/>
+      <w:numFmt w:val="bullet"/>
+      <w:lvlText w:val=""/>
+      <w:lvlJc w:val="left"/>
+      <w:pPr>
+        <w:ind w:left="2520" w:hanging="360"/>
+      </w:pPr>
+      <w:rPr>
+        <w:rFonts w:ascii="Wingdings" w:hAnsi="Wingdings" w:hint="default"/>
+      </w:rPr>
+    </w:lvl>
+    <w:lvl w:ilvl="3" w:tplc="18090001" w:tentative="1">
+      <w:start w:val="1"/>
+      <w:numFmt w:val="bullet"/>
+      <w:lvlText w:val=""/>
+      <w:lvlJc w:val="left"/>
+      <w:pPr>
+        <w:ind w:left="3240" w:hanging="360"/>
+      </w:pPr>
+      <w:rPr>
+        <w:rFonts w:ascii="Symbol" w:hAnsi="Symbol" w:hint="default"/>
+      </w:rPr>
+    </w:lvl>
+    <w:lvl w:ilvl="4" w:tplc="18090003" w:tentative="1">
+      <w:start w:val="1"/>
+      <w:numFmt w:val="bullet"/>
+      <w:lvlText w:val="o"/>
+      <w:lvlJc w:val="left"/>
+      <w:pPr>
+        <w:ind w:left="3960" w:hanging="360"/>
+      </w:pPr>
+      <w:rPr>
+        <w:rFonts w:ascii="Courier New" w:hAnsi="Courier New" w:cs="Courier New" w:hint="default"/>
+      </w:rPr>
+    </w:lvl>
+    <w:lvl w:ilvl="5" w:tplc="18090005" w:tentative="1">
+      <w:start w:val="1"/>
+      <w:numFmt w:val="bullet"/>
+      <w:lvlText w:val=""/>
+      <w:lvlJc w:val="left"/>
+      <w:pPr>
+        <w:ind w:left="4680" w:hanging="360"/>
+      </w:pPr>
+      <w:rPr>
+        <w:rFonts w:ascii="Wingdings" w:hAnsi="Wingdings" w:hint="default"/>
+      </w:rPr>
+    </w:lvl>
+    <w:lvl w:ilvl="6" w:tplc="18090001" w:tentative="1">
+      <w:start w:val="1"/>
+      <w:numFmt w:val="bullet"/>
+      <w:lvlText w:val=""/>
+      <w:lvlJc w:val="left"/>
+      <w:pPr>
+        <w:ind w:left="5400" w:hanging="360"/>
+      </w:pPr>
+      <w:rPr>
+        <w:rFonts w:ascii="Symbol" w:hAnsi="Symbol" w:hint="default"/>
+      </w:rPr>
+    </w:lvl>
+    <w:lvl w:ilvl="7" w:tplc="18090003" w:tentative="1">
+      <w:start w:val="1"/>
+      <w:numFmt w:val="bullet"/>
+      <w:lvlText w:val="o"/>
+      <w:lvlJc w:val="left"/>
+      <w:pPr>
+        <w:ind w:left="6120" w:hanging="360"/>
+      </w:pPr>
+      <w:rPr>
+        <w:rFonts w:ascii="Courier New" w:hAnsi="Courier New" w:cs="Courier New" w:hint="default"/>
+      </w:rPr>
+    </w:lvl>
+    <w:lvl w:ilvl="8" w:tplc="18090005" w:tentative="1">
+      <w:start w:val="1"/>
+      <w:numFmt w:val="bullet"/>
+      <w:lvlText w:val=""/>
+      <w:lvlJc w:val="left"/>
+      <w:pPr>
+        <w:ind w:left="6840" w:hanging="360"/>
+      </w:pPr>
+      <w:rPr>
+        <w:rFonts w:ascii="Wingdings" w:hAnsi="Wingdings" w:hint="default"/>
+      </w:rPr>
+    </w:lvl>
+  </w:abstractNum>
+  <w:abstractNum w:abstractNumId="9" w15:restartNumberingAfterBreak="0">
     <w:nsid w:val="2A7A43CB"/>
     <w:multiLevelType w:val="hybridMultilevel"/>
     <w:tmpl w:val="CA3E534A"/>
@@ -4101,7 +4570,7 @@
       </w:rPr>
     </w:lvl>
   </w:abstractNum>
-  <w:abstractNum w:abstractNumId="9" w15:restartNumberingAfterBreak="0">
+  <w:abstractNum w:abstractNumId="10" w15:restartNumberingAfterBreak="0">
     <w:nsid w:val="33383BF2"/>
     <w:multiLevelType w:val="hybridMultilevel"/>
     <w:tmpl w:val="D3782AAE"/>
@@ -4214,7 +4683,7 @@
       </w:rPr>
     </w:lvl>
   </w:abstractNum>
-  <w:abstractNum w:abstractNumId="10" w15:restartNumberingAfterBreak="0">
+  <w:abstractNum w:abstractNumId="11" w15:restartNumberingAfterBreak="0">
     <w:nsid w:val="3B893057"/>
     <w:multiLevelType w:val="hybridMultilevel"/>
     <w:tmpl w:val="7884CFF2"/>
@@ -4327,7 +4796,7 @@
       </w:rPr>
     </w:lvl>
   </w:abstractNum>
-  <w:abstractNum w:abstractNumId="11" w15:restartNumberingAfterBreak="0">
+  <w:abstractNum w:abstractNumId="12" w15:restartNumberingAfterBreak="0">
     <w:nsid w:val="539A7CFC"/>
     <w:multiLevelType w:val="multilevel"/>
     <w:tmpl w:val="3C7CBDE4"/>
@@ -4476,7 +4945,7 @@
       </w:rPr>
     </w:lvl>
   </w:abstractNum>
-  <w:abstractNum w:abstractNumId="12" w15:restartNumberingAfterBreak="0">
+  <w:abstractNum w:abstractNumId="13" w15:restartNumberingAfterBreak="0">
     <w:nsid w:val="558922C6"/>
     <w:multiLevelType w:val="multilevel"/>
     <w:tmpl w:val="5B58A564"/>
@@ -4625,7 +5094,7 @@
       </w:rPr>
     </w:lvl>
   </w:abstractNum>
-  <w:abstractNum w:abstractNumId="13" w15:restartNumberingAfterBreak="0">
+  <w:abstractNum w:abstractNumId="14" w15:restartNumberingAfterBreak="0">
     <w:nsid w:val="62BE65BB"/>
     <w:multiLevelType w:val="multilevel"/>
     <w:tmpl w:val="048811FA"/>
@@ -4774,7 +5243,7 @@
       </w:rPr>
     </w:lvl>
   </w:abstractNum>
-  <w:abstractNum w:abstractNumId="14" w15:restartNumberingAfterBreak="0">
+  <w:abstractNum w:abstractNumId="15" w15:restartNumberingAfterBreak="0">
     <w:nsid w:val="6A1D256B"/>
     <w:multiLevelType w:val="hybridMultilevel"/>
     <w:tmpl w:val="7C9A8ADC"/>
@@ -4887,7 +5356,7 @@
       </w:rPr>
     </w:lvl>
   </w:abstractNum>
-  <w:abstractNum w:abstractNumId="15" w15:restartNumberingAfterBreak="0">
+  <w:abstractNum w:abstractNumId="16" w15:restartNumberingAfterBreak="0">
     <w:nsid w:val="6D7F77FE"/>
     <w:multiLevelType w:val="multilevel"/>
     <w:tmpl w:val="2710FDDA"/>
@@ -5036,7 +5505,7 @@
       </w:rPr>
     </w:lvl>
   </w:abstractNum>
-  <w:abstractNum w:abstractNumId="16" w15:restartNumberingAfterBreak="0">
+  <w:abstractNum w:abstractNumId="17" w15:restartNumberingAfterBreak="0">
     <w:nsid w:val="6E33664C"/>
     <w:multiLevelType w:val="multilevel"/>
     <w:tmpl w:val="59520974"/>
@@ -5185,7 +5654,7 @@
       </w:rPr>
     </w:lvl>
   </w:abstractNum>
-  <w:abstractNum w:abstractNumId="17" w15:restartNumberingAfterBreak="0">
+  <w:abstractNum w:abstractNumId="18" w15:restartNumberingAfterBreak="0">
     <w:nsid w:val="70387638"/>
     <w:multiLevelType w:val="hybridMultilevel"/>
     <w:tmpl w:val="1DDCE614"/>
@@ -5298,7 +5767,7 @@
       </w:rPr>
     </w:lvl>
   </w:abstractNum>
-  <w:abstractNum w:abstractNumId="18" w15:restartNumberingAfterBreak="0">
+  <w:abstractNum w:abstractNumId="19" w15:restartNumberingAfterBreak="0">
     <w:nsid w:val="74C45F33"/>
     <w:multiLevelType w:val="multilevel"/>
     <w:tmpl w:val="F864B5D8"/>
@@ -5447,7 +5916,120 @@
       </w:rPr>
     </w:lvl>
   </w:abstractNum>
-  <w:abstractNum w:abstractNumId="19" w15:restartNumberingAfterBreak="0">
+  <w:abstractNum w:abstractNumId="20" w15:restartNumberingAfterBreak="0">
+    <w:nsid w:val="79BC7CF2"/>
+    <w:multiLevelType w:val="hybridMultilevel"/>
+    <w:tmpl w:val="6508824A"/>
+    <w:lvl w:ilvl="0" w:tplc="18090001">
+      <w:start w:val="1"/>
+      <w:numFmt w:val="bullet"/>
+      <w:lvlText w:val=""/>
+      <w:lvlJc w:val="left"/>
+      <w:pPr>
+        <w:ind w:left="1440" w:hanging="360"/>
+      </w:pPr>
+      <w:rPr>
+        <w:rFonts w:ascii="Symbol" w:hAnsi="Symbol" w:hint="default"/>
+      </w:rPr>
+    </w:lvl>
+    <w:lvl w:ilvl="1" w:tplc="18090003" w:tentative="1">
+      <w:start w:val="1"/>
+      <w:numFmt w:val="bullet"/>
+      <w:lvlText w:val="o"/>
+      <w:lvlJc w:val="left"/>
+      <w:pPr>
+        <w:ind w:left="2160" w:hanging="360"/>
+      </w:pPr>
+      <w:rPr>
+        <w:rFonts w:ascii="Courier New" w:hAnsi="Courier New" w:cs="Courier New" w:hint="default"/>
+      </w:rPr>
+    </w:lvl>
+    <w:lvl w:ilvl="2" w:tplc="18090005" w:tentative="1">
+      <w:start w:val="1"/>
+      <w:numFmt w:val="bullet"/>
+      <w:lvlText w:val=""/>
+      <w:lvlJc w:val="left"/>
+      <w:pPr>
+        <w:ind w:left="2880" w:hanging="360"/>
+      </w:pPr>
+      <w:rPr>
+        <w:rFonts w:ascii="Wingdings" w:hAnsi="Wingdings" w:hint="default"/>
+      </w:rPr>
+    </w:lvl>
+    <w:lvl w:ilvl="3" w:tplc="18090001" w:tentative="1">
+      <w:start w:val="1"/>
+      <w:numFmt w:val="bullet"/>
+      <w:lvlText w:val=""/>
+      <w:lvlJc w:val="left"/>
+      <w:pPr>
+        <w:ind w:left="3600" w:hanging="360"/>
+      </w:pPr>
+      <w:rPr>
+        <w:rFonts w:ascii="Symbol" w:hAnsi="Symbol" w:hint="default"/>
+      </w:rPr>
+    </w:lvl>
+    <w:lvl w:ilvl="4" w:tplc="18090003" w:tentative="1">
+      <w:start w:val="1"/>
+      <w:numFmt w:val="bullet"/>
+      <w:lvlText w:val="o"/>
+      <w:lvlJc w:val="left"/>
+      <w:pPr>
+        <w:ind w:left="4320" w:hanging="360"/>
+      </w:pPr>
+      <w:rPr>
+        <w:rFonts w:ascii="Courier New" w:hAnsi="Courier New" w:cs="Courier New" w:hint="default"/>
+      </w:rPr>
+    </w:lvl>
+    <w:lvl w:ilvl="5" w:tplc="18090005" w:tentative="1">
+      <w:start w:val="1"/>
+      <w:numFmt w:val="bullet"/>
+      <w:lvlText w:val=""/>
+      <w:lvlJc w:val="left"/>
+      <w:pPr>
+        <w:ind w:left="5040" w:hanging="360"/>
+      </w:pPr>
+      <w:rPr>
+        <w:rFonts w:ascii="Wingdings" w:hAnsi="Wingdings" w:hint="default"/>
+      </w:rPr>
+    </w:lvl>
+    <w:lvl w:ilvl="6" w:tplc="18090001" w:tentative="1">
+      <w:start w:val="1"/>
+      <w:numFmt w:val="bullet"/>
+      <w:lvlText w:val=""/>
+      <w:lvlJc w:val="left"/>
+      <w:pPr>
+        <w:ind w:left="5760" w:hanging="360"/>
+      </w:pPr>
+      <w:rPr>
+        <w:rFonts w:ascii="Symbol" w:hAnsi="Symbol" w:hint="default"/>
+      </w:rPr>
+    </w:lvl>
+    <w:lvl w:ilvl="7" w:tplc="18090003" w:tentative="1">
+      <w:start w:val="1"/>
+      <w:numFmt w:val="bullet"/>
+      <w:lvlText w:val="o"/>
+      <w:lvlJc w:val="left"/>
+      <w:pPr>
+        <w:ind w:left="6480" w:hanging="360"/>
+      </w:pPr>
+      <w:rPr>
+        <w:rFonts w:ascii="Courier New" w:hAnsi="Courier New" w:cs="Courier New" w:hint="default"/>
+      </w:rPr>
+    </w:lvl>
+    <w:lvl w:ilvl="8" w:tplc="18090005" w:tentative="1">
+      <w:start w:val="1"/>
+      <w:numFmt w:val="bullet"/>
+      <w:lvlText w:val=""/>
+      <w:lvlJc w:val="left"/>
+      <w:pPr>
+        <w:ind w:left="7200" w:hanging="360"/>
+      </w:pPr>
+      <w:rPr>
+        <w:rFonts w:ascii="Wingdings" w:hAnsi="Wingdings" w:hint="default"/>
+      </w:rPr>
+    </w:lvl>
+  </w:abstractNum>
+  <w:abstractNum w:abstractNumId="21" w15:restartNumberingAfterBreak="0">
     <w:nsid w:val="7BF7048E"/>
     <w:multiLevelType w:val="multilevel"/>
     <w:tmpl w:val="D2EAFCE6"/>
@@ -5597,7 +6179,7 @@
     </w:lvl>
   </w:abstractNum>
   <w:num w:numId="1" w16cid:durableId="1905293843">
-    <w:abstractNumId w:val="16"/>
+    <w:abstractNumId w:val="17"/>
   </w:num>
   <w:num w:numId="2" w16cid:durableId="849175946">
     <w:abstractNumId w:val="2"/>
@@ -5609,19 +6191,19 @@
     <w:abstractNumId w:val="7"/>
   </w:num>
   <w:num w:numId="5" w16cid:durableId="1112556247">
+    <w:abstractNumId w:val="13"/>
+  </w:num>
+  <w:num w:numId="6" w16cid:durableId="269550114">
+    <w:abstractNumId w:val="14"/>
+  </w:num>
+  <w:num w:numId="7" w16cid:durableId="1532256504">
+    <w:abstractNumId w:val="19"/>
+  </w:num>
+  <w:num w:numId="8" w16cid:durableId="635109628">
     <w:abstractNumId w:val="12"/>
   </w:num>
-  <w:num w:numId="6" w16cid:durableId="269550114">
-    <w:abstractNumId w:val="13"/>
-  </w:num>
-  <w:num w:numId="7" w16cid:durableId="1532256504">
-    <w:abstractNumId w:val="18"/>
-  </w:num>
-  <w:num w:numId="8" w16cid:durableId="635109628">
-    <w:abstractNumId w:val="11"/>
-  </w:num>
   <w:num w:numId="9" w16cid:durableId="1186754716">
-    <w:abstractNumId w:val="19"/>
+    <w:abstractNumId w:val="21"/>
   </w:num>
   <w:num w:numId="10" w16cid:durableId="1105275105">
     <w:abstractNumId w:val="1"/>
@@ -5630,7 +6212,7 @@
     <w:abstractNumId w:val="0"/>
   </w:num>
   <w:num w:numId="12" w16cid:durableId="472019014">
-    <w:abstractNumId w:val="15"/>
+    <w:abstractNumId w:val="16"/>
   </w:num>
   <w:num w:numId="13" w16cid:durableId="1720014099">
     <w:abstractNumId w:val="3"/>
@@ -5639,22 +6221,28 @@
     <w:abstractNumId w:val="5"/>
   </w:num>
   <w:num w:numId="15" w16cid:durableId="913852121">
-    <w:abstractNumId w:val="10"/>
+    <w:abstractNumId w:val="11"/>
   </w:num>
   <w:num w:numId="16" w16cid:durableId="998924147">
     <w:abstractNumId w:val="4"/>
   </w:num>
   <w:num w:numId="17" w16cid:durableId="931474809">
+    <w:abstractNumId w:val="9"/>
+  </w:num>
+  <w:num w:numId="18" w16cid:durableId="951668676">
+    <w:abstractNumId w:val="15"/>
+  </w:num>
+  <w:num w:numId="19" w16cid:durableId="3820998">
+    <w:abstractNumId w:val="18"/>
+  </w:num>
+  <w:num w:numId="20" w16cid:durableId="1169365718">
+    <w:abstractNumId w:val="10"/>
+  </w:num>
+  <w:num w:numId="21" w16cid:durableId="345640774">
     <w:abstractNumId w:val="8"/>
   </w:num>
-  <w:num w:numId="18" w16cid:durableId="951668676">
-    <w:abstractNumId w:val="14"/>
-  </w:num>
-  <w:num w:numId="19" w16cid:durableId="3820998">
-    <w:abstractNumId w:val="17"/>
-  </w:num>
-  <w:num w:numId="20" w16cid:durableId="1169365718">
-    <w:abstractNumId w:val="9"/>
+  <w:num w:numId="22" w16cid:durableId="997269371">
+    <w:abstractNumId w:val="20"/>
   </w:num>
 </w:numbering>
 </file>
@@ -6262,7 +6850,6 @@
   <w:style w:type="character" w:default="1" w:styleId="DefaultParagraphFont">
     <w:name w:val="Default Paragraph Font"/>
     <w:uiPriority w:val="1"/>
-    <w:semiHidden/>
     <w:unhideWhenUsed/>
   </w:style>
   <w:style w:type="table" w:default="1" w:styleId="TableNormal">
@@ -6953,7 +7540,7 @@
     <b:YearAccessed>2025</b:YearAccessed>
     <b:MonthAccessed>02</b:MonthAccessed>
     <b:DayAccessed>25</b:DayAccessed>
-    <b:RefOrder>6</b:RefOrder>
+    <b:RefOrder>14</b:RefOrder>
   </b:Source>
   <b:Source>
     <b:Tag>Reu25</b:Tag>
@@ -6973,7 +7560,7 @@
     <b:YearAccessed>2025</b:YearAccessed>
     <b:MonthAccessed>02</b:MonthAccessed>
     <b:DayAccessed>25</b:DayAccessed>
-    <b:RefOrder>7</b:RefOrder>
+    <b:RefOrder>15</b:RefOrder>
   </b:Source>
   <b:Source>
     <b:Tag>Nor24</b:Tag>
@@ -7018,13 +7605,13 @@
     <b:YearAccessed>2025</b:YearAccessed>
     <b:MonthAccessed>02</b:MonthAccessed>
     <b:DayAccessed>26</b:DayAccessed>
-    <b:RefOrder>5</b:RefOrder>
+    <b:RefOrder>16</b:RefOrder>
   </b:Source>
   <b:Source>
     <b:Tag>Joh24</b:Tag>
     <b:SourceType>InternetSite</b:SourceType>
     <b:Guid>{940D0A0D-145A-4178-87FD-BB485D4F8109}</b:Guid>
-    <b:RefOrder>8</b:RefOrder>
+    <b:RefOrder>17</b:RefOrder>
   </b:Source>
   <b:Source>
     <b:Tag>Con20</b:Tag>
@@ -7077,11 +7664,230 @@
     <b:URL>http://fortunebusinessinsights.com/ready-to-eat-foods-market-110704</b:URL>
     <b:RefOrder>3</b:RefOrder>
   </b:Source>
+  <b:Source>
+    <b:Tag>Avi25</b:Tag>
+    <b:SourceType>InternetSite</b:SourceType>
+    <b:Guid>{41DF8689-898E-4042-9658-FB3E8B380B65}</b:Guid>
+    <b:Author>
+      <b:Author>
+        <b:NameList>
+          <b:Person>
+            <b:Last>Biswal</b:Last>
+            <b:First>Avijeet</b:First>
+          </b:Person>
+        </b:NameList>
+      </b:Author>
+    </b:Author>
+    <b:Title>Power BI vs Tableau: Which Is Better Data Visualization Tool</b:Title>
+    <b:Year>2025</b:Year>
+    <b:YearAccessed>2025</b:YearAccessed>
+    <b:MonthAccessed>03</b:MonthAccessed>
+    <b:DayAccessed>03</b:DayAccessed>
+    <b:URL>https://www.simplilearn.com/tutorials/power-bi-tutorial/power-bi-vs-tableau#GoTop</b:URL>
+    <b:RefOrder>5</b:RefOrder>
+  </b:Source>
+  <b:Source>
+    <b:Tag>Pyt24</b:Tag>
+    <b:SourceType>InternetSite</b:SourceType>
+    <b:Guid>{DAB912E0-2835-4828-9B7A-D97C07F8112F}</b:Guid>
+    <b:Author>
+      <b:Author>
+        <b:NameList>
+          <b:Person>
+            <b:Last>Python</b:Last>
+          </b:Person>
+        </b:NameList>
+      </b:Author>
+    </b:Author>
+    <b:Title>Noble Desktop</b:Title>
+    <b:Year>2024</b:Year>
+    <b:YearAccessed>01</b:YearAccessed>
+    <b:MonthAccessed>03</b:MonthAccessed>
+    <b:DayAccessed>2025</b:DayAccessed>
+    <b:URL>https://www.nobledesktop.com/learn/python/transitioning-from-excel-to-python-for-data-analysis-key-differences</b:URL>
+    <b:RefOrder>6</b:RefOrder>
+  </b:Source>
+  <b:Source>
+    <b:Tag>Foo24</b:Tag>
+    <b:SourceType>InternetSite</b:SourceType>
+    <b:Guid>{5E100455-4883-4DBF-AB2F-696171A3C22C}</b:Guid>
+    <b:Author>
+      <b:Author>
+        <b:Corporate>Food Safety Standards &amp; Regulations</b:Corporate>
+      </b:Author>
+    </b:Author>
+    <b:Title>Food Safety Authority of Ireland (FSAI)</b:Title>
+    <b:Year>2024</b:Year>
+    <b:YearAccessed>2025</b:YearAccessed>
+    <b:URL>https://www.fsai.ie/</b:URL>
+    <b:MonthAccessed>03</b:MonthAccessed>
+    <b:DayAccessed>01</b:DayAccessed>
+    <b:RefOrder>7</b:RefOrder>
+  </b:Source>
+  <b:Source>
+    <b:Tag>Eur24</b:Tag>
+    <b:SourceType>InternetSite</b:SourceType>
+    <b:Guid>{C21E74D7-18B3-49EA-B0EB-2C2F152270EE}</b:Guid>
+    <b:Author>
+      <b:Author>
+        <b:Corporate>European Commission</b:Corporate>
+      </b:Author>
+    </b:Author>
+    <b:Title>Food Information Regulation (EU) No 1169/2011</b:Title>
+    <b:Year>2024</b:Year>
+    <b:YearAccessed>2025</b:YearAccessed>
+    <b:MonthAccessed>03</b:MonthAccessed>
+    <b:DayAccessed>01</b:DayAccessed>
+    <b:URL>https://commission.europa.eu/index_en</b:URL>
+    <b:RefOrder>8</b:RefOrder>
+  </b:Source>
+  <b:Source>
+    <b:Tag>Eur23</b:Tag>
+    <b:SourceType>InternetSite</b:SourceType>
+    <b:Guid>{F3371A49-5F36-4BD0-B167-C03A7D4E9F8E}</b:Guid>
+    <b:Author>
+      <b:Author>
+        <b:Corporate>European Environment Agency (EEA)</b:Corporate>
+      </b:Author>
+    </b:Author>
+    <b:Title>Food Waste and Sustainability Policies in the EU</b:Title>
+    <b:Year>2023</b:Year>
+    <b:YearAccessed>2025</b:YearAccessed>
+    <b:MonthAccessed>03</b:MonthAccessed>
+    <b:DayAccessed>01</b:DayAccessed>
+    <b:URL>https://www.eea.europa.eu/en</b:URL>
+    <b:RefOrder>9</b:RefOrder>
+  </b:Source>
+  <b:Source>
+    <b:Tag>WRA23</b:Tag>
+    <b:SourceType>InternetSite</b:SourceType>
+    <b:Guid>{EAA0ED1B-2BF7-4648-A799-40B8FDFB97EF}</b:Guid>
+    <b:Author>
+      <b:Author>
+        <b:Corporate>WRAP UK</b:Corporate>
+      </b:Author>
+    </b:Author>
+    <b:Title>Reducing Food Waste with Data Analytics in Retail</b:Title>
+    <b:Year>2023</b:Year>
+    <b:YearAccessed>2025</b:YearAccessed>
+    <b:MonthAccessed>03</b:MonthAccessed>
+    <b:DayAccessed>01</b:DayAccessed>
+    <b:URL>https://www.wrap.ngo/eu</b:URL>
+    <b:RefOrder>10</b:RefOrder>
+  </b:Source>
+  <b:Source>
+    <b:Tag>Dan04</b:Tag>
+    <b:SourceType>InternetSite</b:SourceType>
+    <b:Guid>{E7A9DBAC-8208-49CD-ADAE-2D5A665FEFE1}</b:Guid>
+    <b:Author>
+      <b:Author>
+        <b:NameList>
+          <b:Person>
+            <b:Last>Corsten</b:Last>
+            <b:First>Daniel</b:First>
+          </b:Person>
+          <b:Person>
+            <b:Last>Gruen</b:Last>
+            <b:First>Thomas</b:First>
+          </b:Person>
+        </b:NameList>
+      </b:Author>
+    </b:Author>
+    <b:Title>Harvard Business Review</b:Title>
+    <b:Year>2004</b:Year>
+    <b:YearAccessed>2025</b:YearAccessed>
+    <b:MonthAccessed>03</b:MonthAccessed>
+    <b:DayAccessed>01</b:DayAccessed>
+    <b:URL>https://hbr.org/2004/05/stock-outs-cause-walkouts</b:URL>
+    <b:RefOrder>11</b:RefOrder>
+  </b:Source>
+  <b:Source>
+    <b:Tag>WRA231</b:Tag>
+    <b:SourceType>InternetSite</b:SourceType>
+    <b:Guid>{F73983D1-BEBA-4973-B506-3600F2647156}</b:Guid>
+    <b:Author>
+      <b:Author>
+        <b:Corporate>WRAP UK</b:Corporate>
+      </b:Author>
+    </b:Author>
+    <b:Title>WRAP</b:Title>
+    <b:Year>2023</b:Year>
+    <b:YearAccessed>2025</b:YearAccessed>
+    <b:MonthAccessed>03</b:MonthAccessed>
+    <b:DayAccessed>01</b:DayAccessed>
+    <b:URL>https://www.wrap.ngo/take-action/uk-food-drink-pact/food-waste-reduction-roadmap</b:URL>
+    <b:RefOrder>12</b:RefOrder>
+  </b:Source>
+  <b:Source>
+    <b:Tag>Ryl24</b:Tag>
+    <b:SourceType>InternetSite</b:SourceType>
+    <b:Guid>{1C036CDC-3BF2-4C8C-8D52-FB009E221CB1}</b:Guid>
+    <b:Author>
+      <b:Author>
+        <b:NameList>
+          <b:Person>
+            <b:Last>Czuczman</b:Last>
+            <b:First>Rylan</b:First>
+          </b:Person>
+        </b:NameList>
+      </b:Author>
+    </b:Author>
+    <b:Title>Nutritics</b:Title>
+    <b:Year>2024</b:Year>
+    <b:YearAccessed>2025</b:YearAccessed>
+    <b:MonthAccessed>03</b:MonthAccessed>
+    <b:DayAccessed>03</b:DayAccessed>
+    <b:URL>https://www.nutritics.com/en/blog/lets-say-no-to-food-waste-in-2023/</b:URL>
+    <b:RefOrder>18</b:RefOrder>
+  </b:Source>
+  <b:Source>
+    <b:Tag>ByJ25</b:Tag>
+    <b:SourceType>InternetSite</b:SourceType>
+    <b:Guid>{5A1CE784-0178-4638-8DB5-66459CCDF8D5}</b:Guid>
+    <b:Author>
+      <b:Author>
+        <b:NameList>
+          <b:Person>
+            <b:Last>Sharma</b:Last>
+            <b:First>By</b:First>
+            <b:Middle>Jay</b:Middle>
+          </b:Person>
+          <b:Person>
+            <b:Last>Elgeti</b:Last>
+            <b:First>Clemens</b:First>
+          </b:Person>
+          <b:Person>
+            <b:Last>Dolezalek</b:Last>
+            <b:First>Lorenz</b:First>
+          </b:Person>
+          <b:Person>
+            <b:Last>Seppä</b:Last>
+            <b:First>Tuukka</b:First>
+          </b:Person>
+          <b:Person>
+            <b:Last>Vogt</b:Last>
+            <b:First>Pascal</b:First>
+          </b:Person>
+          <b:Person>
+            <b:Last>Roos</b:Last>
+            <b:First>Alexander</b:First>
+          </b:Person>
+        </b:NameList>
+      </b:Author>
+    </b:Author>
+    <b:Title>Boston Consultin group </b:Title>
+    <b:Year>2025</b:Year>
+    <b:YearAccessed>2025</b:YearAccessed>
+    <b:MonthAccessed>03</b:MonthAccessed>
+    <b:DayAccessed>03</b:DayAccessed>
+    <b:URL>https://www.bcg.com/publications/2025/three-factors-driving-firms-to-improve-balance-sheets</b:URL>
+    <b:RefOrder>13</b:RefOrder>
+  </b:Source>
 </b:Sources>
 </file>
 
 <file path=customXml/itemProps1.xml><?xml version="1.0" encoding="utf-8"?>
-<ds:datastoreItem xmlns:ds="http://schemas.openxmlformats.org/officeDocument/2006/customXml" ds:itemID="{C65B2445-04D6-44D1-93BE-6F28C79E45B9}">
+<ds:datastoreItem xmlns:ds="http://schemas.openxmlformats.org/officeDocument/2006/customXml" ds:itemID="{670561FC-A105-4AF3-84CE-6462528BB862}">
   <ds:schemaRefs>
     <ds:schemaRef ds:uri="http://schemas.openxmlformats.org/officeDocument/2006/bibliography"/>
   </ds:schemaRefs>

</xml_diff>

<commit_message>
Fixing code on Jupiter Notebook and working on the word
Looking for better visualisation graphs after I added more info to the Excel sheet. Working on the word information I'm writing as well
</commit_message>
<xml_diff>
--- a/Project Report.docx
+++ b/Project Report.docx
@@ -602,9 +602,36 @@
     </w:p>
     <w:p/>
     <w:p/>
-    <w:p>
-      <w:r>
+    <w:p/>
+    <w:p/>
+    <w:p>
+      <w:pPr>
+        <w:rPr>
+          <w:b/>
+          <w:bCs/>
+        </w:rPr>
+      </w:pPr>
+    </w:p>
+    <w:p>
+      <w:pPr>
+        <w:rPr>
+          <w:b/>
+          <w:bCs/>
+        </w:rPr>
+      </w:pPr>
+      <w:r>
+        <w:rPr>
+          <w:b/>
+          <w:bCs/>
+        </w:rPr>
         <w:t xml:space="preserve">Why I used this module </w:t>
+      </w:r>
+      <w:r>
+        <w:rPr>
+          <w:b/>
+          <w:bCs/>
+        </w:rPr>
+        <w:t xml:space="preserve">– question </w:t>
       </w:r>
     </w:p>
     <w:p>
@@ -882,11 +909,11 @@
       </w:r>
     </w:p>
     <w:p>
-      <w:r>
-        <w:t xml:space="preserve">2. </w:t>
-      </w:r>
-      <w:r>
-        <w:t xml:space="preserve"> Ensuring that </w:t>
+      <w:pPr>
+        <w:ind w:firstLine="720"/>
+      </w:pPr>
+      <w:r>
+        <w:t xml:space="preserve">Ensuring that </w:t>
       </w:r>
       <w:r>
         <w:t>popular meals</w:t>
@@ -895,13 +922,16 @@
         <w:t xml:space="preserve"> </w:t>
       </w:r>
       <w:r>
-        <w:t xml:space="preserve">are available - </w:t>
-      </w:r>
-      <w:r>
-        <w:t xml:space="preserve">Prevents lost sales and </w:t>
-      </w:r>
-      <w:r>
-        <w:t>guarantees</w:t>
+        <w:t xml:space="preserve">are available </w:t>
+      </w:r>
+      <w:r>
+        <w:t>will prevent</w:t>
+      </w:r>
+      <w:r>
+        <w:t xml:space="preserve"> lost sales and </w:t>
+      </w:r>
+      <w:r>
+        <w:t>guarantee</w:t>
       </w:r>
       <w:r>
         <w:t xml:space="preserve"> customer satisfaction and revenue increase.  </w:t>
@@ -1138,168 +1168,6 @@
       </w:sdt>
     </w:p>
     <w:p>
-      <w:pPr>
-        <w:rPr>
-          <w:sz w:val="20"/>
-          <w:szCs w:val="20"/>
-        </w:rPr>
-      </w:pPr>
-      <w:r>
-        <w:t xml:space="preserve"> Demand trend forecasting </w:t>
-      </w:r>
-      <w:r>
-        <w:t>–</w:t>
-      </w:r>
-      <w:r>
-        <w:t xml:space="preserve"> </w:t>
-      </w:r>
-      <w:r>
-        <w:t>Seasonal demand will give timely stock replenishment</w:t>
-      </w:r>
-      <w:r>
-        <w:t xml:space="preserve">. </w:t>
-      </w:r>
-      <w:r>
-        <w:t xml:space="preserve">The </w:t>
-      </w:r>
-      <w:r>
-        <w:t>survey</w:t>
-      </w:r>
-      <w:r>
-        <w:t xml:space="preserve"> called </w:t>
-      </w:r>
-      <w:r>
-        <w:t>the A</w:t>
-      </w:r>
-      <w:r>
-        <w:t>tomic Survey</w:t>
-      </w:r>
-      <w:r>
-        <w:t xml:space="preserve"> </w:t>
-      </w:r>
-      <w:sdt>
-        <w:sdtPr>
-          <w:id w:val="-489405274"/>
-          <w:citation/>
-        </w:sdtPr>
-        <w:sdtContent>
-          <w:r>
-            <w:fldChar w:fldCharType="begin"/>
-          </w:r>
-          <w:r>
-            <w:instrText xml:space="preserve"> CITATION For25 \l 6153 </w:instrText>
-          </w:r>
-          <w:r>
-            <w:fldChar w:fldCharType="separate"/>
-          </w:r>
-          <w:r>
-            <w:rPr>
-              <w:noProof/>
-            </w:rPr>
-            <w:t>(Fortune Business Insights , 2025)</w:t>
-          </w:r>
-          <w:r>
-            <w:fldChar w:fldCharType="end"/>
-          </w:r>
-        </w:sdtContent>
-      </w:sdt>
-      <w:r>
-        <w:t xml:space="preserve"> </w:t>
-      </w:r>
-      <w:r>
-        <w:t xml:space="preserve">realised a study where </w:t>
-      </w:r>
-      <w:r>
-        <w:t>83</w:t>
-      </w:r>
-      <w:r>
-        <w:t xml:space="preserve">% of individuals consume </w:t>
-      </w:r>
-      <w:r>
-        <w:t>easily</w:t>
-      </w:r>
-      <w:r>
-        <w:t xml:space="preserve"> </w:t>
-      </w:r>
-      <w:r>
-        <w:t>prepared</w:t>
-      </w:r>
-      <w:r>
-        <w:t xml:space="preserve"> meals </w:t>
-      </w:r>
-      <w:r>
-        <w:t xml:space="preserve">as convenience along with easy </w:t>
-      </w:r>
-      <w:r>
-        <w:t>storage</w:t>
-      </w:r>
-      <w:r>
-        <w:t xml:space="preserve"> and </w:t>
-      </w:r>
-      <w:r>
-        <w:t>cost-effective</w:t>
-      </w:r>
-      <w:r>
-        <w:t xml:space="preserve">. </w:t>
-      </w:r>
-    </w:p>
-    <w:p>
-      <w:pPr>
-        <w:jc w:val="right"/>
-        <w:rPr>
-          <w:sz w:val="20"/>
-          <w:szCs w:val="20"/>
-        </w:rPr>
-      </w:pPr>
-    </w:p>
-    <w:p>
-      <w:r>
-        <w:t xml:space="preserve">Optimize supplier coordination - Align stock orders in real-time with sales to avoid delays and improve order accuracy. Supplier analytics can empower companies to deliver </w:t>
-      </w:r>
-      <w:r>
-        <w:t>20% more</w:t>
-      </w:r>
-      <w:r>
-        <w:t xml:space="preserve"> </w:t>
-      </w:r>
-      <w:r>
-        <w:lastRenderedPageBreak/>
-        <w:t>efficiently</w:t>
-      </w:r>
-      <w:r>
-        <w:t xml:space="preserve"> and a 15% reduction in operational costs, making companies more proactive with informed decisions. </w:t>
-      </w:r>
-      <w:sdt>
-        <w:sdtPr>
-          <w:id w:val="-1202548286"/>
-          <w:citation/>
-        </w:sdtPr>
-        <w:sdtContent>
-          <w:r>
-            <w:fldChar w:fldCharType="begin"/>
-          </w:r>
-          <w:r>
-            <w:instrText xml:space="preserve"> CITATION Nor24 \l 6153 </w:instrText>
-          </w:r>
-          <w:r>
-            <w:fldChar w:fldCharType="separate"/>
-          </w:r>
-          <w:r>
-            <w:rPr>
-              <w:noProof/>
-            </w:rPr>
-            <w:t>(North Bay Distribution, 2024)</w:t>
-          </w:r>
-          <w:r>
-            <w:fldChar w:fldCharType="end"/>
-          </w:r>
-        </w:sdtContent>
-      </w:sdt>
-      <w:r>
-        <w:t>.</w:t>
-      </w:r>
-    </w:p>
-    <w:p>
       <w:r>
         <w:t>Commercial Relevance:</w:t>
       </w:r>
@@ -1336,6 +1204,7 @@
     </w:p>
     <w:p>
       <w:r>
+        <w:lastRenderedPageBreak/>
         <w:t>Strengths</w:t>
       </w:r>
     </w:p>
@@ -1345,19 +1214,21 @@
       </w:r>
       <w:r>
         <w:tab/>
-        <w:t xml:space="preserve">An extremely strong demand for </w:t>
+      </w:r>
+      <w:r>
+        <w:t>A</w:t>
+      </w:r>
+      <w:r>
+        <w:t>n extreme</w:t>
+      </w:r>
+      <w:r>
+        <w:t xml:space="preserve"> demand for </w:t>
       </w:r>
       <w:r>
         <w:t xml:space="preserve">the </w:t>
       </w:r>
       <w:r>
         <w:t>best ready meals</w:t>
-      </w:r>
-      <w:r>
-        <w:t xml:space="preserve"> as a preference for convenience and quality of products</w:t>
-      </w:r>
-      <w:r>
-        <w:t>.</w:t>
       </w:r>
     </w:p>
     <w:p>
@@ -1402,13 +1273,7 @@
         <w:t xml:space="preserve">Frequent unavailability </w:t>
       </w:r>
       <w:r>
-        <w:t xml:space="preserve">of popular ready meals </w:t>
-      </w:r>
-      <w:r>
-        <w:t>which</w:t>
-      </w:r>
-      <w:r>
-        <w:t xml:space="preserve"> causes lost sales</w:t>
+        <w:t>of popular ready meals</w:t>
       </w:r>
       <w:r>
         <w:t xml:space="preserve">. </w:t>
@@ -1422,7 +1287,13 @@
         <w:tab/>
       </w:r>
       <w:r>
-        <w:t>Slow-moving meals cause overstock which results in waste and storage costs</w:t>
+        <w:t>Slow-moving meals cause overstock</w:t>
+      </w:r>
+      <w:r>
+        <w:t xml:space="preserve"> resulting</w:t>
+      </w:r>
+      <w:r>
+        <w:t xml:space="preserve"> in waste</w:t>
       </w:r>
       <w:r>
         <w:t xml:space="preserve">. </w:t>
@@ -1470,32 +1341,6 @@
     </w:p>
     <w:p>
       <w:r>
-        <w:t>•</w:t>
-      </w:r>
-      <w:r>
-        <w:tab/>
-      </w:r>
-      <w:r>
-        <w:t xml:space="preserve">Expand variety – introducing new </w:t>
-      </w:r>
-      <w:r>
-        <w:t>meal</w:t>
-      </w:r>
-      <w:r>
-        <w:t xml:space="preserve"> options based on </w:t>
-      </w:r>
-      <w:r>
-        <w:t>customers</w:t>
-      </w:r>
-      <w:r>
-        <w:t xml:space="preserve"> preferences </w:t>
-      </w:r>
-      <w:r>
-        <w:t xml:space="preserve"> </w:t>
-      </w:r>
-    </w:p>
-    <w:p>
-      <w:r>
         <w:t>Threats</w:t>
       </w:r>
     </w:p>
@@ -1523,188 +1368,60 @@
         <w:t xml:space="preserve">Delays from suppliers keep stock unavailability. </w:t>
       </w:r>
     </w:p>
-    <w:p>
-      <w:r>
-        <w:t>•</w:t>
-      </w:r>
-      <w:r>
-        <w:tab/>
-        <w:t xml:space="preserve">Regular fluctuations </w:t>
-      </w:r>
-      <w:r>
-        <w:t>a</w:t>
-      </w:r>
-      <w:r>
-        <w:t>s</w:t>
+    <w:p/>
+    <w:p>
+      <w:r>
+        <w:t>4. Data Collection &amp; Analysis</w:t>
+      </w:r>
+    </w:p>
+    <w:p>
+      <w:r>
+        <w:t>What Data Was Collected?</w:t>
+      </w:r>
+    </w:p>
+    <w:p>
+      <w:r>
+        <w:t>I’</w:t>
+      </w:r>
+      <w:r>
+        <w:t>ve been</w:t>
+      </w:r>
+      <w:r>
+        <w:t xml:space="preserve"> collecting data for</w:t>
+      </w:r>
+      <w:r>
+        <w:t xml:space="preserve"> this project </w:t>
+      </w:r>
+      <w:r>
+        <w:t>from 10/02 to 10/03 -</w:t>
       </w:r>
       <w:r>
         <w:t xml:space="preserve"> </w:t>
       </w:r>
       <w:r>
-        <w:t xml:space="preserve">seasonal trends, dietary and economic conditions. </w:t>
-      </w:r>
-    </w:p>
-    <w:p>
-      <w:r>
-        <w:t>4. Data Collection &amp; Analysis</w:t>
-      </w:r>
-    </w:p>
-    <w:p>
-      <w:r>
-        <w:t>What Data Was Collected?</w:t>
-      </w:r>
-    </w:p>
-    <w:p>
-      <w:r>
-        <w:t>I’m</w:t>
-      </w:r>
-      <w:r>
-        <w:t xml:space="preserve"> </w:t>
-      </w:r>
-      <w:r>
-        <w:t>starting</w:t>
-      </w:r>
-      <w:r>
-        <w:t xml:space="preserve"> this project with </w:t>
-      </w:r>
-      <w:r>
-        <w:t xml:space="preserve">two weeks </w:t>
-      </w:r>
-      <w:r>
-        <w:t xml:space="preserve">of </w:t>
-      </w:r>
-      <w:r>
         <w:t xml:space="preserve">sales data for </w:t>
       </w:r>
       <w:r>
         <w:t xml:space="preserve">a </w:t>
       </w:r>
       <w:r>
-        <w:t xml:space="preserve">precise demand forecast that align the demand closely with customer needs </w:t>
-      </w:r>
-    </w:p>
-    <w:p>
-      <w:pPr>
-        <w:pStyle w:val="ListParagraph"/>
-        <w:numPr>
-          <w:ilvl w:val="0"/>
-          <w:numId w:val="20"/>
-        </w:numPr>
-      </w:pPr>
-      <w:r>
-        <w:t xml:space="preserve">Product Sales </w:t>
-      </w:r>
-      <w:r>
-        <w:t>by</w:t>
-      </w:r>
-      <w:r>
-        <w:t xml:space="preserve"> Week</w:t>
-      </w:r>
-      <w:r>
-        <w:t>: Shows</w:t>
-      </w:r>
-      <w:r>
-        <w:t xml:space="preserve"> overall </w:t>
-      </w:r>
-      <w:r>
-        <w:t>meal</w:t>
-      </w:r>
-      <w:r>
-        <w:t xml:space="preserve"> </w:t>
-      </w:r>
-      <w:r>
-        <w:t>sales by week</w:t>
-      </w:r>
-      <w:r>
-        <w:t>.</w:t>
-      </w:r>
-    </w:p>
-    <w:p>
-      <w:pPr>
-        <w:pStyle w:val="ListParagraph"/>
-        <w:numPr>
-          <w:ilvl w:val="0"/>
-          <w:numId w:val="20"/>
-        </w:numPr>
-      </w:pPr>
-      <w:r>
-        <w:t>Stock Movement</w:t>
-      </w:r>
-      <w:r>
-        <w:t xml:space="preserve">: Indicates </w:t>
-      </w:r>
-      <w:r>
-        <w:t xml:space="preserve">the </w:t>
-      </w:r>
-      <w:r>
-        <w:t xml:space="preserve">number of </w:t>
-      </w:r>
-      <w:r>
-        <w:t>ready meals</w:t>
-      </w:r>
-      <w:r>
-        <w:t xml:space="preserve"> sold during </w:t>
-      </w:r>
-      <w:r>
-        <w:t xml:space="preserve">a </w:t>
-      </w:r>
-      <w:r>
-        <w:t>week</w:t>
-      </w:r>
-      <w:r>
-        <w:t>.</w:t>
-      </w:r>
-    </w:p>
-    <w:p>
-      <w:pPr>
-        <w:pStyle w:val="ListParagraph"/>
-        <w:numPr>
-          <w:ilvl w:val="0"/>
-          <w:numId w:val="20"/>
-        </w:numPr>
-      </w:pPr>
-      <w:r>
-        <w:t xml:space="preserve">Meals </w:t>
-      </w:r>
-      <w:r>
-        <w:t>received report: data on how many meals were delivered from suppliers.</w:t>
-      </w:r>
-    </w:p>
-    <w:p>
-      <w:pPr>
-        <w:pStyle w:val="ListParagraph"/>
-        <w:numPr>
-          <w:ilvl w:val="0"/>
-          <w:numId w:val="20"/>
-        </w:numPr>
-      </w:pPr>
-      <w:r>
-        <w:t xml:space="preserve">Meals wasted report </w:t>
-      </w:r>
-      <w:r>
-        <w:t xml:space="preserve">Tracks food waste and helps analyse overstocking issues. </w:t>
-      </w:r>
-    </w:p>
-    <w:p/>
-    <w:p/>
-    <w:p/>
-    <w:p>
-      <w:r>
-        <w:t>Key Insights from the Reports:</w:t>
-      </w:r>
-    </w:p>
-    <w:p>
-      <w:r>
-        <w:t xml:space="preserve"> </w:t>
-      </w:r>
-      <w:r>
-        <w:t xml:space="preserve">Best-Selling </w:t>
-      </w:r>
-      <w:r>
-        <w:t>Meals</w:t>
-      </w:r>
-      <w:r>
-        <w:t>:</w:t>
+        <w:t xml:space="preserve">precise demand forecast that </w:t>
+      </w:r>
+      <w:r>
+        <w:t>aligns</w:t>
+      </w:r>
+      <w:r>
+        <w:t xml:space="preserve"> the demand closely with customer needs </w:t>
+      </w:r>
+    </w:p>
+    <w:p>
+      <w:r>
+        <w:t xml:space="preserve">Key Findings: </w:t>
+      </w:r>
+    </w:p>
+    <w:p>
+      <w:r>
+        <w:t>Sales Trend Over Time:</w:t>
       </w:r>
     </w:p>
     <w:p>
@@ -1716,19 +1433,121 @@
         </w:numPr>
       </w:pPr>
       <w:r>
-        <w:t xml:space="preserve">I will add the meals that customers buy the most, ensuring they are in </w:t>
-      </w:r>
-      <w:r>
-        <w:t>stock)</w:t>
-      </w:r>
-      <w:r>
-        <w:t>.</w:t>
-      </w:r>
-    </w:p>
-    <w:p>
-      <w:r>
-        <w:t>Slow-Moving Wines:</w:t>
-      </w:r>
+        <w:t xml:space="preserve">Helping </w:t>
+      </w:r>
+      <w:proofErr w:type="gramStart"/>
+      <w:r>
+        <w:t>identify</w:t>
+      </w:r>
+      <w:proofErr w:type="gramEnd"/>
+      <w:r>
+        <w:t xml:space="preserve"> peak sales days, slow periods and demand across different days,</w:t>
+      </w:r>
+    </w:p>
+    <w:p>
+      <w:pPr>
+        <w:pStyle w:val="ListParagraph"/>
+      </w:pPr>
+      <w:r>
+        <w:rPr>
+          <w:noProof/>
+        </w:rPr>
+        <w:lastRenderedPageBreak/>
+        <w:drawing>
+          <wp:inline distT="0" distB="0" distL="0" distR="0" wp14:anchorId="5A68F27A" wp14:editId="2A2F8C79">
+            <wp:extent cx="5731510" cy="4030980"/>
+            <wp:effectExtent l="0" t="0" r="2540" b="7620"/>
+            <wp:docPr id="507938877" name="Picture 1" descr="A graph with blue lines and numbers&#10;&#10;AI-generated content may be incorrect."/>
+            <wp:cNvGraphicFramePr>
+              <a:graphicFrameLocks xmlns:a="http://schemas.openxmlformats.org/drawingml/2006/main" noChangeAspect="1"/>
+            </wp:cNvGraphicFramePr>
+            <a:graphic xmlns:a="http://schemas.openxmlformats.org/drawingml/2006/main">
+              <a:graphicData uri="http://schemas.openxmlformats.org/drawingml/2006/picture">
+                <pic:pic xmlns:pic="http://schemas.openxmlformats.org/drawingml/2006/picture">
+                  <pic:nvPicPr>
+                    <pic:cNvPr id="507938877" name="Picture 1" descr="A graph with blue lines and numbers&#10;&#10;AI-generated content may be incorrect."/>
+                    <pic:cNvPicPr>
+                      <a:picLocks noChangeAspect="1" noChangeArrowheads="1"/>
+                    </pic:cNvPicPr>
+                  </pic:nvPicPr>
+                  <pic:blipFill>
+                    <a:blip r:embed="rId7">
+                      <a:extLst>
+                        <a:ext uri="{28A0092B-C50C-407E-A947-70E740481C1C}">
+                          <a14:useLocalDpi xmlns:a14="http://schemas.microsoft.com/office/drawing/2010/main" val="0"/>
+                        </a:ext>
+                      </a:extLst>
+                    </a:blip>
+                    <a:srcRect/>
+                    <a:stretch>
+                      <a:fillRect/>
+                    </a:stretch>
+                  </pic:blipFill>
+                  <pic:spPr bwMode="auto">
+                    <a:xfrm>
+                      <a:off x="0" y="0"/>
+                      <a:ext cx="5731510" cy="4030980"/>
+                    </a:xfrm>
+                    <a:prstGeom prst="rect">
+                      <a:avLst/>
+                    </a:prstGeom>
+                    <a:noFill/>
+                    <a:ln>
+                      <a:noFill/>
+                    </a:ln>
+                  </pic:spPr>
+                </pic:pic>
+              </a:graphicData>
+            </a:graphic>
+          </wp:inline>
+        </w:drawing>
+      </w:r>
+    </w:p>
+    <w:p>
+      <w:pPr>
+        <w:pStyle w:val="ListParagraph"/>
+      </w:pPr>
+      <w:r>
+        <w:t>The graph shows the sales peak on Fridays and Saturdays</w:t>
+      </w:r>
+      <w:r>
+        <w:t xml:space="preserve"> and </w:t>
+      </w:r>
+      <w:proofErr w:type="spellStart"/>
+      <w:r>
+        <w:t>sunday</w:t>
+      </w:r>
+      <w:proofErr w:type="spellEnd"/>
+      <w:r>
+        <w:t xml:space="preserve"> and the lowest on Mondays and Tuesdays. </w:t>
+      </w:r>
+    </w:p>
+    <w:p>
+      <w:pPr>
+        <w:pStyle w:val="ListParagraph"/>
+      </w:pPr>
+    </w:p>
+    <w:p>
+      <w:pPr>
+        <w:pStyle w:val="ListParagraph"/>
+      </w:pPr>
+      <w:r>
+        <w:t xml:space="preserve"> </w:t>
+      </w:r>
+      <w:r>
+        <w:t xml:space="preserve">Best-Selling </w:t>
+      </w:r>
+      <w:r>
+        <w:t>Meals</w:t>
+      </w:r>
+      <w:r>
+        <w:t>:</w:t>
+      </w:r>
+    </w:p>
+    <w:p>
+      <w:pPr>
+        <w:pStyle w:val="ListParagraph"/>
+      </w:pPr>
     </w:p>
     <w:p>
       <w:pPr>
@@ -1739,24 +1558,28 @@
         </w:numPr>
       </w:pPr>
       <w:r>
-        <w:t xml:space="preserve">I will add </w:t>
-      </w:r>
-      <w:r>
-        <w:t>meals with low demand to reduce unnecessary stock)</w:t>
-      </w:r>
-      <w:r>
-        <w:t>.</w:t>
-      </w:r>
-    </w:p>
-    <w:p>
-      <w:r>
-        <w:rPr>
-          <w:rFonts w:ascii="Segoe UI Emoji" w:hAnsi="Segoe UI Emoji" w:cs="Segoe UI Emoji"/>
-        </w:rPr>
-        <w:t>S</w:t>
-      </w:r>
-      <w:r>
-        <w:t>ales Trends:</w:t>
+        <w:t>I add</w:t>
+      </w:r>
+      <w:r>
+        <w:t>ed</w:t>
+      </w:r>
+      <w:r>
+        <w:t xml:space="preserve"> the </w:t>
+      </w:r>
+      <w:r>
+        <w:t xml:space="preserve">15 </w:t>
+      </w:r>
+      <w:r>
+        <w:t xml:space="preserve">best-selling </w:t>
+      </w:r>
+      <w:r>
+        <w:t>meal</w:t>
+      </w:r>
+      <w:r>
+        <w:t xml:space="preserve">s that </w:t>
+      </w:r>
+      <w:r>
+        <w:t>customers buy the most</w:t>
       </w:r>
     </w:p>
     <w:p>
@@ -1768,13 +1591,87 @@
         </w:numPr>
       </w:pPr>
       <w:r>
-        <w:t>Peak demand periods (</w:t>
-      </w:r>
-      <w:r>
-        <w:t>for</w:t>
-      </w:r>
-      <w:r>
-        <w:t xml:space="preserve"> example lunchtime vs dinner sales) </w:t>
+        <w:rPr>
+          <w:noProof/>
+        </w:rPr>
+        <w:drawing>
+          <wp:inline distT="0" distB="0" distL="0" distR="0" wp14:anchorId="62E0EE22" wp14:editId="4A4E30FA">
+            <wp:extent cx="4555968" cy="3403600"/>
+            <wp:effectExtent l="0" t="0" r="0" b="6350"/>
+            <wp:docPr id="979561475" name="Picture 3" descr="A graph of a bar graph&#10;&#10;AI-generated content may be incorrect."/>
+            <wp:cNvGraphicFramePr>
+              <a:graphicFrameLocks xmlns:a="http://schemas.openxmlformats.org/drawingml/2006/main" noChangeAspect="1"/>
+            </wp:cNvGraphicFramePr>
+            <a:graphic xmlns:a="http://schemas.openxmlformats.org/drawingml/2006/main">
+              <a:graphicData uri="http://schemas.openxmlformats.org/drawingml/2006/picture">
+                <pic:pic xmlns:pic="http://schemas.openxmlformats.org/drawingml/2006/picture">
+                  <pic:nvPicPr>
+                    <pic:cNvPr id="979561475" name="Picture 3" descr="A graph of a bar graph&#10;&#10;AI-generated content may be incorrect."/>
+                    <pic:cNvPicPr>
+                      <a:picLocks noChangeAspect="1" noChangeArrowheads="1"/>
+                    </pic:cNvPicPr>
+                  </pic:nvPicPr>
+                  <pic:blipFill>
+                    <a:blip r:embed="rId8">
+                      <a:extLst>
+                        <a:ext uri="{28A0092B-C50C-407E-A947-70E740481C1C}">
+                          <a14:useLocalDpi xmlns:a14="http://schemas.microsoft.com/office/drawing/2010/main" val="0"/>
+                        </a:ext>
+                      </a:extLst>
+                    </a:blip>
+                    <a:srcRect/>
+                    <a:stretch>
+                      <a:fillRect/>
+                    </a:stretch>
+                  </pic:blipFill>
+                  <pic:spPr bwMode="auto">
+                    <a:xfrm>
+                      <a:off x="0" y="0"/>
+                      <a:ext cx="4559427" cy="3406184"/>
+                    </a:xfrm>
+                    <a:prstGeom prst="rect">
+                      <a:avLst/>
+                    </a:prstGeom>
+                    <a:noFill/>
+                    <a:ln>
+                      <a:noFill/>
+                    </a:ln>
+                  </pic:spPr>
+                </pic:pic>
+              </a:graphicData>
+            </a:graphic>
+          </wp:inline>
+        </w:drawing>
+      </w:r>
+    </w:p>
+    <w:p>
+      <w:pPr>
+        <w:pStyle w:val="ListParagraph"/>
+      </w:pPr>
+      <w:r>
+        <w:lastRenderedPageBreak/>
+        <w:t>Considering at least the 5 bestselling meals</w:t>
+      </w:r>
+      <w:r>
+        <w:t xml:space="preserve"> Meatballs, Crispy Goujons, Thai Curry, Aubergine parmigiana and Homemade Cottage pie should always be in </w:t>
+      </w:r>
+      <w:proofErr w:type="gramStart"/>
+      <w:r>
+        <w:t>stock .</w:t>
+      </w:r>
+      <w:proofErr w:type="gramEnd"/>
+      <w:r>
+        <w:t xml:space="preserve"> </w:t>
+      </w:r>
+    </w:p>
+    <w:p>
+      <w:pPr>
+        <w:pStyle w:val="ListParagraph"/>
+      </w:pPr>
+    </w:p>
+    <w:p>
+      <w:r>
+        <w:t>Stock Needs vs. Sales</w:t>
       </w:r>
     </w:p>
     <w:p>
@@ -1786,21 +1683,227 @@
         </w:numPr>
       </w:pPr>
       <w:r>
-        <w:t xml:space="preserve">Identify </w:t>
-      </w:r>
-      <w:r>
-        <w:t xml:space="preserve">trends like </w:t>
-      </w:r>
-      <w:r>
-        <w:t>high</w:t>
-      </w:r>
-      <w:r>
-        <w:t xml:space="preserve"> sales for weekends</w:t>
-      </w:r>
-      <w:r>
-        <w:t>.</w:t>
-      </w:r>
-    </w:p>
+        <w:t>Compar</w:t>
+      </w:r>
+      <w:r>
+        <w:t>ing</w:t>
+      </w:r>
+      <w:r>
+        <w:t xml:space="preserve"> stock received vs. sales to know if stock is too high or too low</w:t>
+      </w:r>
+    </w:p>
+    <w:p>
+      <w:pPr>
+        <w:pStyle w:val="ListParagraph"/>
+      </w:pPr>
+      <w:r>
+        <w:rPr>
+          <w:noProof/>
+        </w:rPr>
+        <w:drawing>
+          <wp:inline distT="0" distB="0" distL="0" distR="0" wp14:anchorId="38D7E7C4" wp14:editId="2E3631FD">
+            <wp:extent cx="4249040" cy="4864100"/>
+            <wp:effectExtent l="0" t="0" r="0" b="0"/>
+            <wp:docPr id="92413498" name="Picture 8" descr="A graph of sales and stock received&#10;&#10;AI-generated content may be incorrect."/>
+            <wp:cNvGraphicFramePr>
+              <a:graphicFrameLocks xmlns:a="http://schemas.openxmlformats.org/drawingml/2006/main" noChangeAspect="1"/>
+            </wp:cNvGraphicFramePr>
+            <a:graphic xmlns:a="http://schemas.openxmlformats.org/drawingml/2006/main">
+              <a:graphicData uri="http://schemas.openxmlformats.org/drawingml/2006/picture">
+                <pic:pic xmlns:pic="http://schemas.openxmlformats.org/drawingml/2006/picture">
+                  <pic:nvPicPr>
+                    <pic:cNvPr id="92413498" name="Picture 8" descr="A graph of sales and stock received&#10;&#10;AI-generated content may be incorrect."/>
+                    <pic:cNvPicPr>
+                      <a:picLocks noChangeAspect="1" noChangeArrowheads="1"/>
+                    </pic:cNvPicPr>
+                  </pic:nvPicPr>
+                  <pic:blipFill>
+                    <a:blip r:embed="rId9">
+                      <a:extLst>
+                        <a:ext uri="{28A0092B-C50C-407E-A947-70E740481C1C}">
+                          <a14:useLocalDpi xmlns:a14="http://schemas.microsoft.com/office/drawing/2010/main" val="0"/>
+                        </a:ext>
+                      </a:extLst>
+                    </a:blip>
+                    <a:srcRect/>
+                    <a:stretch>
+                      <a:fillRect/>
+                    </a:stretch>
+                  </pic:blipFill>
+                  <pic:spPr bwMode="auto">
+                    <a:xfrm>
+                      <a:off x="0" y="0"/>
+                      <a:ext cx="4251703" cy="4867149"/>
+                    </a:xfrm>
+                    <a:prstGeom prst="rect">
+                      <a:avLst/>
+                    </a:prstGeom>
+                    <a:noFill/>
+                    <a:ln>
+                      <a:noFill/>
+                    </a:ln>
+                  </pic:spPr>
+                </pic:pic>
+              </a:graphicData>
+            </a:graphic>
+          </wp:inline>
+        </w:drawing>
+      </w:r>
+    </w:p>
+    <w:p>
+      <w:pPr>
+        <w:pStyle w:val="ListParagraph"/>
+      </w:pPr>
+      <w:r>
+        <w:t xml:space="preserve">Examples </w:t>
+      </w:r>
+      <w:r>
+        <w:t xml:space="preserve">such </w:t>
+      </w:r>
+      <w:r>
+        <w:t xml:space="preserve">as Crispy </w:t>
+      </w:r>
+      <w:r>
+        <w:t>Goujons</w:t>
+      </w:r>
+      <w:r>
+        <w:t xml:space="preserve">, aubergine </w:t>
+      </w:r>
+      <w:r>
+        <w:t>parmigiana</w:t>
+      </w:r>
+      <w:r>
+        <w:t xml:space="preserve">, </w:t>
+      </w:r>
+      <w:r>
+        <w:t xml:space="preserve">and </w:t>
+      </w:r>
+      <w:r>
+        <w:t xml:space="preserve">lasagna </w:t>
+      </w:r>
+      <w:r>
+        <w:t xml:space="preserve">traditionally have potential overstock. Meatballs, Thai curry, Cottage </w:t>
+      </w:r>
+      <w:proofErr w:type="gramStart"/>
+      <w:r>
+        <w:t>pie ,</w:t>
+      </w:r>
+      <w:proofErr w:type="gramEnd"/>
+      <w:r>
+        <w:t xml:space="preserve"> Creamy mash, beef stroganoff and crusted potatoes indicate reordering issues </w:t>
+      </w:r>
+    </w:p>
+    <w:p>
+      <w:pPr>
+        <w:pStyle w:val="ListParagraph"/>
+      </w:pPr>
+    </w:p>
+    <w:p>
+      <w:r>
+        <w:t xml:space="preserve">Meals are missing on Fridays and Saturdays (busiest days) </w:t>
+      </w:r>
+    </w:p>
+    <w:p>
+      <w:r>
+        <w:rPr>
+          <w:noProof/>
+        </w:rPr>
+        <w:lastRenderedPageBreak/>
+        <w:drawing>
+          <wp:inline distT="0" distB="0" distL="0" distR="0" wp14:anchorId="670E086D" wp14:editId="3BC55069">
+            <wp:extent cx="5731510" cy="4987290"/>
+            <wp:effectExtent l="0" t="0" r="2540" b="3810"/>
+            <wp:docPr id="1401804562" name="Picture 3" descr="A graph of a number of red and black bars&#10;&#10;AI-generated content may be incorrect."/>
+            <wp:cNvGraphicFramePr>
+              <a:graphicFrameLocks xmlns:a="http://schemas.openxmlformats.org/drawingml/2006/main" noChangeAspect="1"/>
+            </wp:cNvGraphicFramePr>
+            <a:graphic xmlns:a="http://schemas.openxmlformats.org/drawingml/2006/main">
+              <a:graphicData uri="http://schemas.openxmlformats.org/drawingml/2006/picture">
+                <pic:pic xmlns:pic="http://schemas.openxmlformats.org/drawingml/2006/picture">
+                  <pic:nvPicPr>
+                    <pic:cNvPr id="1401804562" name="Picture 3" descr="A graph of a number of red and black bars&#10;&#10;AI-generated content may be incorrect."/>
+                    <pic:cNvPicPr>
+                      <a:picLocks noChangeAspect="1" noChangeArrowheads="1"/>
+                    </pic:cNvPicPr>
+                  </pic:nvPicPr>
+                  <pic:blipFill>
+                    <a:blip r:embed="rId10">
+                      <a:extLst>
+                        <a:ext uri="{28A0092B-C50C-407E-A947-70E740481C1C}">
+                          <a14:useLocalDpi xmlns:a14="http://schemas.microsoft.com/office/drawing/2010/main" val="0"/>
+                        </a:ext>
+                      </a:extLst>
+                    </a:blip>
+                    <a:srcRect/>
+                    <a:stretch>
+                      <a:fillRect/>
+                    </a:stretch>
+                  </pic:blipFill>
+                  <pic:spPr bwMode="auto">
+                    <a:xfrm>
+                      <a:off x="0" y="0"/>
+                      <a:ext cx="5731510" cy="4987290"/>
+                    </a:xfrm>
+                    <a:prstGeom prst="rect">
+                      <a:avLst/>
+                    </a:prstGeom>
+                    <a:noFill/>
+                    <a:ln>
+                      <a:noFill/>
+                    </a:ln>
+                  </pic:spPr>
+                </pic:pic>
+              </a:graphicData>
+            </a:graphic>
+          </wp:inline>
+        </w:drawing>
+      </w:r>
+    </w:p>
+    <w:p>
+      <w:r>
+        <w:drawing>
+          <wp:inline distT="0" distB="0" distL="0" distR="0" wp14:anchorId="4D59B304" wp14:editId="4A3BCE09">
+            <wp:extent cx="3479177" cy="1931173"/>
+            <wp:effectExtent l="0" t="0" r="6985" b="0"/>
+            <wp:docPr id="1044742635" name="Picture 1" descr="A list of food items&#10;&#10;AI-generated content may be incorrect."/>
+            <wp:cNvGraphicFramePr>
+              <a:graphicFrameLocks xmlns:a="http://schemas.openxmlformats.org/drawingml/2006/main" noChangeAspect="1"/>
+            </wp:cNvGraphicFramePr>
+            <a:graphic xmlns:a="http://schemas.openxmlformats.org/drawingml/2006/main">
+              <a:graphicData uri="http://schemas.openxmlformats.org/drawingml/2006/picture">
+                <pic:pic xmlns:pic="http://schemas.openxmlformats.org/drawingml/2006/picture">
+                  <pic:nvPicPr>
+                    <pic:cNvPr id="1044742635" name="Picture 1" descr="A list of food items&#10;&#10;AI-generated content may be incorrect."/>
+                    <pic:cNvPicPr/>
+                  </pic:nvPicPr>
+                  <pic:blipFill>
+                    <a:blip r:embed="rId11"/>
+                    <a:stretch>
+                      <a:fillRect/>
+                    </a:stretch>
+                  </pic:blipFill>
+                  <pic:spPr>
+                    <a:xfrm>
+                      <a:off x="0" y="0"/>
+                      <a:ext cx="3485236" cy="1934536"/>
+                    </a:xfrm>
+                    <a:prstGeom prst="rect">
+                      <a:avLst/>
+                    </a:prstGeom>
+                  </pic:spPr>
+                </pic:pic>
+              </a:graphicData>
+            </a:graphic>
+          </wp:inline>
+        </w:drawing>
+      </w:r>
+    </w:p>
+    <w:p>
+      <w:r>
+        <w:t xml:space="preserve">Prevent shortages and ensure customers satisfaction. </w:t>
+      </w:r>
+    </w:p>
+    <w:p/>
     <w:p>
       <w:r>
         <w:t>Stock waste analyses:</w:t>
@@ -1808,13 +1911,75 @@
     </w:p>
     <w:p>
       <w:r>
-        <w:t xml:space="preserve">Meals that frequently run out: better forecasting and reordering </w:t>
-      </w:r>
-    </w:p>
-    <w:p>
-      <w:r>
         <w:t xml:space="preserve">Meals that are frequently wasted: overordering or lack of demand. </w:t>
       </w:r>
+      <w:r>
+        <w:t xml:space="preserve">As bee </w:t>
+      </w:r>
+      <w:proofErr w:type="spellStart"/>
+      <w:r>
+        <w:t>teriak</w:t>
+      </w:r>
+      <w:proofErr w:type="spellEnd"/>
+      <w:r>
+        <w:t xml:space="preserve"> and chilli con carne</w:t>
+      </w:r>
+    </w:p>
+    <w:p>
+      <w:r>
+        <w:rPr>
+          <w:noProof/>
+        </w:rPr>
+        <w:lastRenderedPageBreak/>
+        <w:drawing>
+          <wp:inline distT="0" distB="0" distL="0" distR="0" wp14:anchorId="4DB54DDD" wp14:editId="6D4CF39E">
+            <wp:extent cx="5731510" cy="4167505"/>
+            <wp:effectExtent l="0" t="0" r="2540" b="4445"/>
+            <wp:docPr id="758142242" name="Picture 2" descr="A graph with orange bars&#10;&#10;AI-generated content may be incorrect."/>
+            <wp:cNvGraphicFramePr>
+              <a:graphicFrameLocks xmlns:a="http://schemas.openxmlformats.org/drawingml/2006/main" noChangeAspect="1"/>
+            </wp:cNvGraphicFramePr>
+            <a:graphic xmlns:a="http://schemas.openxmlformats.org/drawingml/2006/main">
+              <a:graphicData uri="http://schemas.openxmlformats.org/drawingml/2006/picture">
+                <pic:pic xmlns:pic="http://schemas.openxmlformats.org/drawingml/2006/picture">
+                  <pic:nvPicPr>
+                    <pic:cNvPr id="758142242" name="Picture 2" descr="A graph with orange bars&#10;&#10;AI-generated content may be incorrect."/>
+                    <pic:cNvPicPr>
+                      <a:picLocks noChangeAspect="1" noChangeArrowheads="1"/>
+                    </pic:cNvPicPr>
+                  </pic:nvPicPr>
+                  <pic:blipFill>
+                    <a:blip r:embed="rId12">
+                      <a:extLst>
+                        <a:ext uri="{28A0092B-C50C-407E-A947-70E740481C1C}">
+                          <a14:useLocalDpi xmlns:a14="http://schemas.microsoft.com/office/drawing/2010/main" val="0"/>
+                        </a:ext>
+                      </a:extLst>
+                    </a:blip>
+                    <a:srcRect/>
+                    <a:stretch>
+                      <a:fillRect/>
+                    </a:stretch>
+                  </pic:blipFill>
+                  <pic:spPr bwMode="auto">
+                    <a:xfrm>
+                      <a:off x="0" y="0"/>
+                      <a:ext cx="5731510" cy="4167505"/>
+                    </a:xfrm>
+                    <a:prstGeom prst="rect">
+                      <a:avLst/>
+                    </a:prstGeom>
+                    <a:noFill/>
+                    <a:ln>
+                      <a:noFill/>
+                    </a:ln>
+                  </pic:spPr>
+                </pic:pic>
+              </a:graphicData>
+            </a:graphic>
+          </wp:inline>
+        </w:drawing>
+      </w:r>
     </w:p>
     <w:p/>
     <w:p>
@@ -1824,7 +1989,7 @@
     </w:p>
     <w:p>
       <w:r>
-        <w:t>Chosen Technology: Power BI vs. Python (Pandas &amp; Matplotlib)</w:t>
+        <w:t>Chosen Technology: Python (Pandas &amp; Matplotlib)</w:t>
       </w:r>
     </w:p>
     <w:tbl>
@@ -1855,7 +2020,13 @@
           </w:tcPr>
           <w:p>
             <w:r>
-              <w:t xml:space="preserve"> Why Choose It?</w:t>
+              <w:t xml:space="preserve"> Why </w:t>
+            </w:r>
+            <w:r>
+              <w:t>did I c</w:t>
+            </w:r>
+            <w:r>
+              <w:t>hoose It?</w:t>
             </w:r>
           </w:p>
         </w:tc>
@@ -1865,73 +2036,10 @@
           </w:tcPr>
           <w:p>
             <w:r>
-              <w:t>Alternative &amp; Justification</w:t>
+              <w:t>Justification</w:t>
             </w:r>
           </w:p>
           <w:p/>
-        </w:tc>
-      </w:tr>
-      <w:tr>
-        <w:tc>
-          <w:tcPr>
-            <w:tcW w:w="3005" w:type="dxa"/>
-          </w:tcPr>
-          <w:p>
-            <w:r>
-              <w:t>Power BI</w:t>
-            </w:r>
-          </w:p>
-        </w:tc>
-        <w:tc>
-          <w:tcPr>
-            <w:tcW w:w="3005" w:type="dxa"/>
-          </w:tcPr>
-          <w:p>
-            <w:r>
-              <w:t xml:space="preserve">Best for visualizing sales &amp; </w:t>
-            </w:r>
-            <w:r>
-              <w:t xml:space="preserve">waste trends </w:t>
-            </w:r>
-            <w:r>
-              <w:t>-friendly way.</w:t>
-            </w:r>
-          </w:p>
-          <w:p>
-            <w:r>
-              <w:t xml:space="preserve">Easily </w:t>
-            </w:r>
-            <w:r>
-              <w:t>integrated</w:t>
-            </w:r>
-            <w:r>
-              <w:t xml:space="preserve"> with Excel </w:t>
-            </w:r>
-            <w:r>
-              <w:t>it</w:t>
-            </w:r>
-            <w:r>
-              <w:t xml:space="preserve"> is used for inventory </w:t>
-            </w:r>
-          </w:p>
-          <w:p>
-            <w:r>
-              <w:t xml:space="preserve">Drag and drop </w:t>
-            </w:r>
-            <w:r>
-              <w:t xml:space="preserve">reports, monitoring fast selling and wasted </w:t>
-            </w:r>
-          </w:p>
-        </w:tc>
-        <w:tc>
-          <w:tcPr>
-            <w:tcW w:w="3006" w:type="dxa"/>
-          </w:tcPr>
-          <w:p>
-            <w:r>
-              <w:t>Tableau (more expensive)</w:t>
-            </w:r>
-          </w:p>
         </w:tc>
       </w:tr>
       <w:tr>
@@ -1951,44 +2059,25 @@
           </w:tcPr>
           <w:p>
             <w:r>
-              <w:t>Better for automating demand forecasting</w:t>
+              <w:t xml:space="preserve">Better </w:t>
+            </w:r>
+            <w:r>
+              <w:t>h</w:t>
+            </w:r>
+            <w:r>
+              <w:t>elp</w:t>
+            </w:r>
+            <w:r>
+              <w:t>ing</w:t>
             </w:r>
             <w:r>
               <w:t xml:space="preserve"> </w:t>
             </w:r>
             <w:r>
-              <w:t>using</w:t>
-            </w:r>
-            <w:r>
-              <w:t xml:space="preserve"> </w:t>
-            </w:r>
-            <w:r>
-              <w:t xml:space="preserve">data sale </w:t>
-            </w:r>
-            <w:r>
-              <w:t>history</w:t>
-            </w:r>
-            <w:r>
-              <w:t>.</w:t>
-            </w:r>
-          </w:p>
-          <w:p>
-            <w:r>
-              <w:t xml:space="preserve">Help </w:t>
-            </w:r>
-            <w:r>
               <w:t>predict</w:t>
             </w:r>
             <w:r>
-              <w:t xml:space="preserve"> demand (lunch vs</w:t>
-            </w:r>
-            <w:r>
-              <w:t xml:space="preserve"> dinner)</w:t>
-            </w:r>
-          </w:p>
-          <w:p>
-            <w:r>
-              <w:t xml:space="preserve">Detect waste: which meals are constantly wasted </w:t>
+              <w:t xml:space="preserve"> demand, detect waste trends and optimize stock.</w:t>
             </w:r>
           </w:p>
         </w:tc>
@@ -2008,7 +2097,13 @@
               </w:pBdr>
             </w:pPr>
             <w:r>
-              <w:t>Excel (easier but limited for predictive analytics)</w:t>
+              <w:t>Excel (</w:t>
+            </w:r>
+            <w:r>
+              <w:t>simple</w:t>
+            </w:r>
+            <w:r>
+              <w:t xml:space="preserve"> but limited for predictive analytics)</w:t>
             </w:r>
           </w:p>
         </w:tc>
@@ -2035,115 +2130,19 @@
         </w:numPr>
       </w:pPr>
       <w:r>
-        <w:t xml:space="preserve">Power BI </w:t>
-      </w:r>
-      <w:r>
-        <w:t xml:space="preserve">is ideal for </w:t>
-      </w:r>
-      <w:r>
-        <w:t>daily</w:t>
-      </w:r>
-      <w:r>
-        <w:t xml:space="preserve"> and </w:t>
-      </w:r>
-      <w:r>
-        <w:t>weekly</w:t>
-      </w:r>
-      <w:r>
-        <w:t xml:space="preserve"> </w:t>
-      </w:r>
-      <w:r>
-        <w:t xml:space="preserve">monitoring of </w:t>
-      </w:r>
-      <w:r>
-        <w:t>meal stock</w:t>
-      </w:r>
-      <w:r>
-        <w:t>.</w:t>
-      </w:r>
-      <w:r>
-        <w:t xml:space="preserve"> </w:t>
-      </w:r>
-      <w:r>
-        <w:t>It’s</w:t>
-      </w:r>
-      <w:r>
-        <w:t xml:space="preserve"> </w:t>
-      </w:r>
-      <w:r>
-        <w:t>going to</w:t>
-      </w:r>
-      <w:r>
-        <w:t xml:space="preserve"> </w:t>
-      </w:r>
-      <w:r>
-        <w:t>help</w:t>
-      </w:r>
-      <w:r>
-        <w:t xml:space="preserve"> </w:t>
-      </w:r>
-      <w:r>
-        <w:t>visualise</w:t>
-      </w:r>
-      <w:r>
-        <w:t xml:space="preserve"> which meals are selling faster, wasted </w:t>
-      </w:r>
-      <w:r>
-        <w:t>or when demand fluctuates</w:t>
-      </w:r>
-      <w:r>
-        <w:t xml:space="preserve"> while Tablets will offer similar visualization but with more cost</w:t>
-      </w:r>
-      <w:r>
-        <w:t xml:space="preserve"> </w:t>
-      </w:r>
-      <w:sdt>
-        <w:sdtPr>
-          <w:id w:val="505567943"/>
-          <w:citation/>
-        </w:sdtPr>
-        <w:sdtContent>
-          <w:r>
-            <w:fldChar w:fldCharType="begin"/>
-          </w:r>
-          <w:r>
-            <w:instrText xml:space="preserve"> CITATION Avi25 \l 6153 </w:instrText>
-          </w:r>
-          <w:r>
-            <w:fldChar w:fldCharType="separate"/>
-          </w:r>
-          <w:r>
-            <w:rPr>
-              <w:noProof/>
-            </w:rPr>
-            <w:t>(Biswal, 2025)</w:t>
-          </w:r>
-          <w:r>
-            <w:fldChar w:fldCharType="end"/>
-          </w:r>
-        </w:sdtContent>
-      </w:sdt>
-      <w:r>
-        <w:t xml:space="preserve">. </w:t>
-      </w:r>
-    </w:p>
-    <w:p>
-      <w:pPr>
-        <w:pStyle w:val="ListParagraph"/>
-        <w:numPr>
-          <w:ilvl w:val="0"/>
-          <w:numId w:val="16"/>
-        </w:numPr>
-      </w:pPr>
-      <w:r>
-        <w:lastRenderedPageBreak/>
         <w:t xml:space="preserve">Python </w:t>
       </w:r>
       <w:r>
         <w:t>is better for predictive analyses, specific days reducing the ever-order and minimising food waste</w:t>
       </w:r>
       <w:r>
-        <w:t xml:space="preserve"> while excel will be easy to use more won’t give as many features</w:t>
+        <w:t xml:space="preserve"> while </w:t>
+      </w:r>
+      <w:r>
+        <w:t>Excel</w:t>
+      </w:r>
+      <w:r>
+        <w:t xml:space="preserve"> will be easy to use more won’t give as many features</w:t>
       </w:r>
       <w:r>
         <w:t xml:space="preserve"> </w:t>
@@ -2179,43 +2178,6 @@
       </w:r>
     </w:p>
     <w:p>
-      <w:r>
-        <w:t>6. Setting Automatic Reordering for Fast-Moving Wines</w:t>
-      </w:r>
-    </w:p>
-    <w:p/>
-    <w:p/>
-    <w:p/>
-    <w:p/>
-    <w:p>
-      <w:pPr>
-        <w:ind w:firstLine="360"/>
-      </w:pPr>
-      <w:r>
-        <w:t xml:space="preserve">TAKE DATA FOR THIS </w:t>
-      </w:r>
-    </w:p>
-    <w:p>
-      <w:pPr>
-        <w:ind w:firstLine="360"/>
-      </w:pPr>
-    </w:p>
-    <w:p>
-      <w:pPr>
-        <w:ind w:firstLine="360"/>
-      </w:pPr>
-    </w:p>
-    <w:p>
-      <w:pPr>
-        <w:ind w:firstLine="360"/>
-      </w:pPr>
-    </w:p>
-    <w:p>
-      <w:pPr>
-        <w:ind w:firstLine="360"/>
-      </w:pPr>
-    </w:p>
-    <w:p>
       <w:pPr>
         <w:ind w:firstLine="360"/>
       </w:pPr>
@@ -2301,6 +2263,7 @@
         </w:numPr>
       </w:pPr>
       <w:r>
+        <w:lastRenderedPageBreak/>
         <w:t>EU Food Information to Consumers Regulation No 1169/2011: The labelling of nutritional information, allergens, and expiry dates must be accurate</w:t>
       </w:r>
       <w:r>
@@ -2525,7 +2488,6 @@
     </w:p>
     <w:p>
       <w:r>
-        <w:lastRenderedPageBreak/>
         <w:t>Meal stock levels</w:t>
       </w:r>
     </w:p>
@@ -4686,7 +4648,7 @@
   <w:abstractNum w:abstractNumId="11" w15:restartNumberingAfterBreak="0">
     <w:nsid w:val="3B893057"/>
     <w:multiLevelType w:val="hybridMultilevel"/>
-    <w:tmpl w:val="7884CFF2"/>
+    <w:tmpl w:val="D15A1DFE"/>
     <w:lvl w:ilvl="0" w:tplc="18090001">
       <w:start w:val="1"/>
       <w:numFmt w:val="bullet"/>
@@ -6675,7 +6637,6 @@
     <w:next w:val="Normal"/>
     <w:link w:val="Heading2Char"/>
     <w:uiPriority w:val="9"/>
-    <w:semiHidden/>
     <w:unhideWhenUsed/>
     <w:qFormat/>
     <w:rsid w:val="008F327E"/>
@@ -6850,6 +6811,7 @@
   <w:style w:type="character" w:default="1" w:styleId="DefaultParagraphFont">
     <w:name w:val="Default Paragraph Font"/>
     <w:uiPriority w:val="1"/>
+    <w:semiHidden/>
     <w:unhideWhenUsed/>
   </w:style>
   <w:style w:type="table" w:default="1" w:styleId="TableNormal">
@@ -6891,7 +6853,6 @@
     <w:basedOn w:val="DefaultParagraphFont"/>
     <w:link w:val="Heading2"/>
     <w:uiPriority w:val="9"/>
-    <w:semiHidden/>
     <w:rsid w:val="008F327E"/>
     <w:rPr>
       <w:rFonts w:asciiTheme="majorHAnsi" w:eastAsiaTheme="majorEastAsia" w:hAnsiTheme="majorHAnsi" w:cstheme="majorBidi"/>

</xml_diff>